<commit_message>
chore: remove Google Docs comment markup from uspace templates
Deleted word/comments.xml, commentsExtended.xml, commentsIds.xml, people.xml
and cleaned up all corresponding Content_Types and .rels entries from both
template_rent_uspace.docx and template_profit_uspace.docx.

Google Docs exports embed comment files that carry w14:textId="77777777"
and add noise to the generated contracts; removing them at the template
level prevents the issue entirely rather than relying solely on the runtime fix.

Co-Authored-By: Claude Sonnet 4.6 <noreply@anthropic.com>
</commit_message>
<xml_diff>
--- a/自動產生合約範本/template_profit_uspace.docx
+++ b/自動產生合約範本/template_profit_uspace.docx
@@ -46,973 +46,6 @@
           <w:szCs w:val="20"/>
         </w:rPr>
       </w:pPr>
-      <w:r>
-        <w:rPr>
-          <w:rFonts w:ascii="Microsoft YaHei UI" w:eastAsia="Microsoft YaHei UI" w:hAnsi="Microsoft YaHei UI"/>
-          <w:noProof/>
-        </w:rPr>
-        <mc:AlternateContent>
-          <mc:Choice Requires="wps">
-            <w:drawing>
-              <wp:anchor distT="0" distB="0" distL="114300" distR="114300" simplePos="0" relativeHeight="251658240" behindDoc="0" locked="0" layoutInCell="1" hidden="0" allowOverlap="1" wp14:anchorId="70378120" wp14:editId="1C619E0A">
-                <wp:simplePos x="0" y="0"/>
-                <wp:positionH relativeFrom="column">
-                  <wp:posOffset>4575175</wp:posOffset>
-                </wp:positionH>
-                <wp:positionV relativeFrom="paragraph">
-                  <wp:posOffset>-85721</wp:posOffset>
-                </wp:positionV>
-                <wp:extent cx="2146088" cy="309034"/>
-                <wp:effectExtent l="0" t="0" r="0" b="0"/>
-                <wp:wrapNone/>
-                <wp:docPr id="1" name="矩形 1"/>
-                <wp:cNvGraphicFramePr/>
-                <a:graphic xmlns:a="http://schemas.openxmlformats.org/drawingml/2006/main">
-                  <a:graphicData uri="http://schemas.microsoft.com/office/word/2010/wordprocessingShape">
-                    <wps:wsp>
-                      <wps:cNvSpPr/>
-                      <wps:spPr>
-                        <a:xfrm>
-                          <a:off x="4287244" y="3639771"/>
-                          <a:ext cx="2117513" cy="280459"/>
-                        </a:xfrm>
-                        <a:prstGeom prst="rect">
-                          <a:avLst/>
-                        </a:prstGeom>
-                        <a:solidFill>
-                          <a:schemeClr val="lt1"/>
-                        </a:solidFill>
-                        <a:ln w="9525" cap="flat" cmpd="sng">
-                          <a:solidFill>
-                            <a:srgbClr val="000000"/>
-                          </a:solidFill>
-                          <a:prstDash val="solid"/>
-                          <a:round/>
-                          <a:headEnd type="none" w="sm" len="sm"/>
-                          <a:tailEnd type="none" w="sm" len="sm"/>
-                        </a:ln>
-                      </wps:spPr>
-                      <wps:txbx>
-                        <w:txbxContent>
-                          <w:p>
-                            <w:pPr>
-                              <w:textDirection w:val="btLr"/>
-                            </w:pPr>
-                            <w:r>
-                              <w:rPr>
-                                <w:rFonts w:ascii="標楷體" w:eastAsia="標楷體" w:hAnsi="標楷體" w:cs="標楷體"/>
-                                <w:color w:val="000000"/>
-                              </w:rPr>
-                              <w:t>合約編號：</w:t>
-                            </w:r>
-                          </w:p>
-                        </w:txbxContent>
-                      </wps:txbx>
-                      <wps:bodyPr spcFirstLastPara="1" wrap="square" lIns="91425" tIns="45700" rIns="91425" bIns="45700" anchor="t" anchorCtr="0">
-                        <a:noAutofit/>
-                      </wps:bodyPr>
-                    </wps:wsp>
-                  </a:graphicData>
-                </a:graphic>
-              </wp:anchor>
-            </w:drawing>
-          </mc:Choice>
-          <mc:Fallback>
-            <w:pict>
-              <v:rect w14:anchorId="70378120" id="矩形 1" o:spid="_x0000_s1026" style="position:absolute;left:0;text-align:left;margin-left:360.25pt;margin-top:-6.75pt;width:169pt;height:24.35pt;z-index:251658240;visibility:visible;mso-wrap-style:square;mso-wrap-distance-left:9pt;mso-wrap-distance-top:0;mso-wrap-distance-right:9pt;mso-wrap-distance-bottom:0;mso-position-horizontal:absolute;mso-position-horizontal-relative:text;mso-position-vertical:absolute;mso-position-vertical-relative:text;v-text-anchor:top" o:gfxdata="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" fillcolor="white [3201]">
-                <v:stroke startarrowwidth="narrow" startarrowlength="short" endarrowwidth="narrow" endarrowlength="short" joinstyle="round"/>
-                <v:textbox inset="2.53958mm,1.2694mm,2.53958mm,1.2694mm">
-                  <w:txbxContent>
-                    <w:p>
-                      <w:pPr>
-                        <w:textDirection w:val="btLr"/>
-                      </w:pPr>
-                      <w:r>
-                        <w:rPr>
-                          <w:rFonts w:ascii="標楷體" w:eastAsia="標楷體" w:hAnsi="標楷體" w:cs="標楷體"/>
-                          <w:color w:val="000000"/>
-                        </w:rPr>
-                        <w:t>合約編號：</w:t>
-                      </w:r>
-                    </w:p>
-                  </w:txbxContent>
-                </v:textbox>
-              </v:rect>
-            </w:pict>
-          </mc:Fallback>
-        </mc:AlternateContent>
-      </w:r>
-    </w:p>
-    <w:p>
-      <w:pPr>
-        <w:spacing w:line="420" w:lineRule="auto"/>
-        <w:jc w:val="center"/>
-        <w:rPr>
-          <w:rFonts w:ascii="Microsoft YaHei UI" w:eastAsia="Microsoft YaHei UI" w:hAnsi="Microsoft YaHei UI" w:cs="Times New Roman"/>
-          <w:color w:val="000000"/>
-          <w:sz w:val="44"/>
-          <w:szCs w:val="44"/>
-        </w:rPr>
-      </w:pPr>
-      <w:sdt>
-        <w:sdtPr>
-          <w:rPr>
-            <w:rFonts w:ascii="Microsoft YaHei UI" w:eastAsia="Microsoft YaHei UI" w:hAnsi="Microsoft YaHei UI"/>
-          </w:rPr>
-          <w:tag w:val="goog_rdk_0"/>
-          <w:id w:val="-1201435268"/>
-        </w:sdtPr>
-        <w:sdtContent>
-          <w:r>
-            <w:rPr>
-              <w:rFonts w:ascii="Microsoft YaHei UI" w:eastAsia="Microsoft YaHei UI" w:hAnsi="Microsoft YaHei UI" w:cs="Gungsuh"/>
-              <w:color w:val="000000"/>
-              <w:sz w:val="44"/>
-              <w:szCs w:val="44"/>
-            </w:rPr>
-            <w:t>USPACE停車位租賃契約書</w:t>
-          </w:r>
-        </w:sdtContent>
-      </w:sdt>
-    </w:p>
-    <w:p>
-      <w:pPr>
-        <w:pBdr>
-          <w:top w:val="nil"/>
-          <w:left w:val="nil"/>
-          <w:bottom w:val="nil"/>
-          <w:right w:val="nil"/>
-          <w:between w:val="nil"/>
-        </w:pBdr>
-        <w:spacing w:line="420" w:lineRule="auto"/>
-        <w:jc w:val="both"/>
-        <w:rPr>
-          <w:rFonts w:ascii="Microsoft YaHei UI" w:eastAsia="Microsoft YaHei UI" w:hAnsi="Microsoft YaHei UI" w:cs="Times New Roman"/>
-          <w:color w:val="000000"/>
-        </w:rPr>
-      </w:pPr>
-      <w:sdt>
-        <w:sdtPr>
-          <w:rPr>
-            <w:rFonts w:ascii="Microsoft YaHei UI" w:eastAsia="Microsoft YaHei UI" w:hAnsi="Microsoft YaHei UI"/>
-          </w:rPr>
-          <w:tag w:val="goog_rdk_1"/>
-          <w:id w:val="-1740094108"/>
-        </w:sdtPr>
-        <w:sdtContent>
-          <w:r>
-            <w:rPr>
-              <w:rFonts w:ascii="Microsoft YaHei UI" w:eastAsia="Microsoft YaHei UI" w:hAnsi="Microsoft YaHei UI" w:cs="Gungsuh"/>
-              <w:color w:val="000000"/>
-            </w:rPr>
-            <w:t>出租人：</w:t>
-          </w:r>
-        </w:sdtContent>
-      </w:sdt>
-      <w:sdt>
-        <w:sdtPr>
-          <w:rPr>
-            <w:rFonts w:ascii="Microsoft YaHei UI" w:eastAsia="Microsoft YaHei UI" w:hAnsi="Microsoft YaHei UI"/>
-          </w:rPr>
-          <w:tag w:val="goog_rdk_2"/>
-          <w:id w:val="512121334"/>
-        </w:sdtPr>
-        <w:sdtContent>
-          <w:sdt>
-            <w:sdtPr>
-              <w:rPr>
-                <w:rFonts w:asciiTheme="minorEastAsia" w:hAnsiTheme="minorEastAsia"/>
-              </w:rPr>
-              <w:tag w:val="goog_rdk_2"/>
-              <w:id w:val="340281747"/>
-            </w:sdtPr>
-            <w:sdtContent>
-              <w:r>
-                <w:rPr>
-                  <w:rFonts w:asciiTheme="minorEastAsia" w:hAnsiTheme="minorEastAsia" w:cs="Gungsuh"/>
-                  <w:u w:val="single"/>
-                </w:rPr>
-                <w:t>{{ party_a }}</w:t>
-              </w:r>
-            </w:sdtContent>
-          </w:sdt>
-        </w:sdtContent>
-      </w:sdt>
-      <w:sdt>
-        <w:sdtPr>
-          <w:rPr>
-            <w:rFonts w:ascii="Microsoft YaHei UI" w:eastAsia="Microsoft YaHei UI" w:hAnsi="Microsoft YaHei UI"/>
-          </w:rPr>
-          <w:tag w:val="goog_rdk_3"/>
-          <w:id w:val="1390816045"/>
-        </w:sdtPr>
-        <w:sdtContent>
-          <w:r>
-            <w:rPr>
-              <w:rFonts w:ascii="Microsoft YaHei UI" w:eastAsia="Microsoft YaHei UI" w:hAnsi="Microsoft YaHei UI" w:cs="Gungsuh"/>
-              <w:color w:val="000000"/>
-            </w:rPr>
-            <w:t>（下稱「甲方」）</w:t>
-          </w:r>
-        </w:sdtContent>
-      </w:sdt>
-    </w:p>
-    <w:p>
-      <w:pPr>
-        <w:pBdr>
-          <w:top w:val="nil"/>
-          <w:left w:val="nil"/>
-          <w:bottom w:val="nil"/>
-          <w:right w:val="nil"/>
-          <w:between w:val="nil"/>
-        </w:pBdr>
-        <w:spacing w:line="420" w:lineRule="auto"/>
-        <w:jc w:val="both"/>
-        <w:rPr>
-          <w:rFonts w:ascii="Microsoft YaHei UI" w:eastAsia="Microsoft YaHei UI" w:hAnsi="Microsoft YaHei UI" w:cs="Times New Roman"/>
-          <w:color w:val="000000"/>
-        </w:rPr>
-      </w:pPr>
-      <w:sdt>
-        <w:sdtPr>
-          <w:rPr>
-            <w:rFonts w:ascii="Microsoft YaHei UI" w:eastAsia="Microsoft YaHei UI" w:hAnsi="Microsoft YaHei UI"/>
-          </w:rPr>
-          <w:tag w:val="goog_rdk_4"/>
-          <w:id w:val="-556912444"/>
-        </w:sdtPr>
-        <w:sdtContent>
-          <w:r>
-            <w:rPr>
-              <w:rFonts w:ascii="Microsoft YaHei UI" w:eastAsia="Microsoft YaHei UI" w:hAnsi="Microsoft YaHei UI" w:cs="Gungsuh"/>
-              <w:color w:val="000000"/>
-            </w:rPr>
-            <w:t>承租人：悠勢科技股份有限公司 （下稱「乙方」）</w:t>
-          </w:r>
-        </w:sdtContent>
-      </w:sdt>
-    </w:p>
-    <w:p>
-      <w:pPr>
-        <w:pBdr>
-          <w:top w:val="nil"/>
-          <w:left w:val="nil"/>
-          <w:bottom w:val="nil"/>
-          <w:right w:val="nil"/>
-          <w:between w:val="nil"/>
-        </w:pBdr>
-        <w:spacing w:line="420" w:lineRule="auto"/>
-        <w:jc w:val="both"/>
-        <w:rPr>
-          <w:rFonts w:ascii="Microsoft YaHei UI" w:eastAsia="Microsoft YaHei UI" w:hAnsi="Microsoft YaHei UI" w:cs="Times New Roman"/>
-          <w:color w:val="000000"/>
-        </w:rPr>
-      </w:pPr>
-    </w:p>
-    <w:p>
-      <w:pPr>
-        <w:pBdr>
-          <w:top w:val="nil"/>
-          <w:left w:val="nil"/>
-          <w:bottom w:val="nil"/>
-          <w:right w:val="nil"/>
-          <w:between w:val="nil"/>
-        </w:pBdr>
-        <w:spacing w:line="420" w:lineRule="auto"/>
-        <w:jc w:val="both"/>
-        <w:rPr>
-          <w:rFonts w:ascii="Microsoft YaHei UI" w:eastAsia="Microsoft YaHei UI" w:hAnsi="Microsoft YaHei UI" w:cs="Times New Roman"/>
-          <w:color w:val="000000"/>
-        </w:rPr>
-      </w:pPr>
-      <w:sdt>
-        <w:sdtPr>
-          <w:rPr>
-            <w:rFonts w:ascii="Microsoft YaHei UI" w:eastAsia="Microsoft YaHei UI" w:hAnsi="Microsoft YaHei UI"/>
-          </w:rPr>
-          <w:tag w:val="goog_rdk_5"/>
-          <w:id w:val="-2074206022"/>
-        </w:sdtPr>
-        <w:sdtContent>
-          <w:r>
-            <w:rPr>
-              <w:rFonts w:ascii="Microsoft YaHei UI" w:eastAsia="Microsoft YaHei UI" w:hAnsi="Microsoft YaHei UI" w:cs="Gungsuh"/>
-              <w:color w:val="000000"/>
-            </w:rPr>
-            <w:t>茲因甲方擬將其所有之停車場出租並委由乙方進行設備整建、管理系統規劃以經營收費停車場，雙方爰訂定本USPACE停車位租賃契約書（以下簡稱「本契約」），並議定條款如後，以茲共同遵守：</w:t>
-          </w:r>
-        </w:sdtContent>
-      </w:sdt>
-    </w:p>
-    <w:p>
-      <w:pPr>
-        <w:pBdr>
-          <w:top w:val="nil"/>
-          <w:left w:val="nil"/>
-          <w:bottom w:val="nil"/>
-          <w:right w:val="nil"/>
-          <w:between w:val="nil"/>
-        </w:pBdr>
-        <w:spacing w:line="420" w:lineRule="auto"/>
-        <w:jc w:val="both"/>
-        <w:rPr>
-          <w:rFonts w:ascii="Microsoft YaHei UI" w:eastAsia="Microsoft YaHei UI" w:hAnsi="Microsoft YaHei UI" w:cs="Times New Roman"/>
-          <w:color w:val="000000"/>
-        </w:rPr>
-      </w:pPr>
-    </w:p>
-    <w:p>
-      <w:pPr>
-        <w:numPr>
-          <w:ilvl w:val="0"/>
-          <w:numId w:val="9"/>
-        </w:numPr>
-        <w:pBdr>
-          <w:top w:val="nil"/>
-          <w:left w:val="nil"/>
-          <w:bottom w:val="nil"/>
-          <w:right w:val="nil"/>
-          <w:between w:val="nil"/>
-        </w:pBdr>
-        <w:spacing w:line="420" w:lineRule="auto"/>
-        <w:ind w:left="992" w:hanging="992"/>
-        <w:jc w:val="both"/>
-        <w:rPr>
-          <w:rFonts w:ascii="Microsoft YaHei UI" w:eastAsia="Microsoft YaHei UI" w:hAnsi="Microsoft YaHei UI" w:cs="Times New Roman"/>
-          <w:color w:val="000000"/>
-        </w:rPr>
-      </w:pPr>
-      <w:sdt>
-        <w:sdtPr>
-          <w:rPr>
-            <w:rFonts w:ascii="Microsoft YaHei UI" w:eastAsia="Microsoft YaHei UI" w:hAnsi="Microsoft YaHei UI"/>
-          </w:rPr>
-          <w:tag w:val="goog_rdk_6"/>
-          <w:id w:val="44632955"/>
-        </w:sdtPr>
-        <w:sdtContent>
-          <w:r>
-            <w:rPr>
-              <w:rFonts w:ascii="Microsoft YaHei UI" w:eastAsia="Microsoft YaHei UI" w:hAnsi="Microsoft YaHei UI" w:cs="Gungsuh"/>
-              <w:color w:val="000000"/>
-            </w:rPr>
-            <w:t>租賃標的</w:t>
-          </w:r>
-        </w:sdtContent>
-      </w:sdt>
-    </w:p>
-    <w:p>
-      <w:pPr>
-        <w:numPr>
-          <w:ilvl w:val="0"/>
-          <w:numId w:val="1"/>
-        </w:numPr>
-        <w:pBdr>
-          <w:top w:val="nil"/>
-          <w:left w:val="nil"/>
-          <w:bottom w:val="nil"/>
-          <w:right w:val="nil"/>
-          <w:between w:val="nil"/>
-        </w:pBdr>
-        <w:spacing w:line="420" w:lineRule="auto"/>
-        <w:ind w:left="993"/>
-        <w:jc w:val="both"/>
-        <w:rPr>
-          <w:rFonts w:ascii="Microsoft YaHei UI" w:eastAsia="Microsoft YaHei UI" w:hAnsi="Microsoft YaHei UI" w:cs="Times New Roman"/>
-          <w:color w:val="000000"/>
-        </w:rPr>
-      </w:pPr>
-      <w:sdt>
-        <w:sdtPr>
-          <w:rPr>
-            <w:rFonts w:ascii="Microsoft YaHei UI" w:eastAsia="Microsoft YaHei UI" w:hAnsi="Microsoft YaHei UI"/>
-          </w:rPr>
-          <w:tag w:val="goog_rdk_7"/>
-          <w:id w:val="2135952011"/>
-        </w:sdtPr>
-        <w:sdtEndPr>
-          <w:rPr>
-            <w:rFonts w:cs="Gungsuh"/>
-            <w:color w:val="000000"/>
-          </w:rPr>
-        </w:sdtEndPr>
-        <w:sdtContent>
-          <w:r>
-            <w:rPr>
-              <w:rFonts w:ascii="Microsoft YaHei UI" w:eastAsia="Microsoft YaHei UI" w:hAnsi="Microsoft YaHei UI" w:cs="Gungsuh"/>
-              <w:color w:val="000000"/>
-            </w:rPr>
-            <w:t>甲方同意將其所有，坐落於</w:t>
-          </w:r>
-          <w:r>
-            <w:rPr>
-              <w:rFonts w:asciiTheme="minorEastAsia" w:hAnsiTheme="minorEastAsia" w:cs="Gungsuh"/>
-              <w:color w:val="000000"/>
-            </w:rPr>
-            <w:t>{{ address }}</w:t>
-          </w:r>
-        </w:sdtContent>
-      </w:sdt>
-      <w:sdt>
-        <w:sdtPr>
-          <w:rPr>
-            <w:rFonts w:ascii="Microsoft YaHei UI" w:eastAsia="Microsoft YaHei UI" w:hAnsi="Microsoft YaHei UI" w:cs="Gungsuh"/>
-            <w:color w:val="000000"/>
-          </w:rPr>
-          <w:tag w:val="goog_rdk_9"/>
-          <w:id w:val="878499625"/>
-        </w:sdtPr>
-        <w:sdtEndPr>
-          <w:rPr>
-            <w:rFonts w:cs="Cambria"/>
-            <w:color w:val="auto"/>
-          </w:rPr>
-        </w:sdtEndPr>
-        <w:sdtContent>
-          <w:r>
-            <w:rPr>
-              <w:rFonts w:ascii="Microsoft YaHei UI" w:eastAsia="Microsoft YaHei UI" w:hAnsi="Microsoft YaHei UI" w:cs="Gungsuh"/>
-              <w:color w:val="000000"/>
-            </w:rPr>
-            <w:t>之停車位/土地/建物，共</w:t>
-          </w:r>
-        </w:sdtContent>
-      </w:sdt>
-      <w:sdt>
-        <w:sdtPr>
-          <w:rPr>
-            <w:rFonts w:ascii="Microsoft YaHei UI" w:eastAsia="Microsoft YaHei UI" w:hAnsi="Microsoft YaHei UI"/>
-          </w:rPr>
-          <w:tag w:val="goog_rdk_10"/>
-          <w:id w:val="-774881446"/>
-        </w:sdtPr>
-        <w:sdtEndPr>
-          <w:rPr>
-            <w:rFonts w:cs="Gungsuh"/>
-            <w:color w:val="000000"/>
-          </w:rPr>
-        </w:sdtEndPr>
-        <w:sdtContent>
-          <w:r>
-            <w:rPr>
-              <w:rFonts w:asciiTheme="minorEastAsia" w:hAnsiTheme="minorEastAsia"/>
-              <w:u w:val="single"/>
-            </w:rPr>
-            <w:t>{{ spots }}</w:t>
-          </w:r>
-        </w:sdtContent>
-      </w:sdt>
-      <w:sdt>
-        <w:sdtPr>
-          <w:rPr>
-            <w:rFonts w:ascii="Microsoft YaHei UI" w:eastAsia="Microsoft YaHei UI" w:hAnsi="Microsoft YaHei UI" w:cs="Gungsuh"/>
-            <w:color w:val="000000"/>
-          </w:rPr>
-          <w:tag w:val="goog_rdk_11"/>
-          <w:id w:val="-492536171"/>
-        </w:sdtPr>
-        <w:sdtEndPr>
-          <w:rPr>
-            <w:rFonts w:cs="Cambria"/>
-            <w:color w:val="auto"/>
-          </w:rPr>
-        </w:sdtEndPr>
-        <w:sdtContent>
-          <w:r>
-            <w:rPr>
-              <w:rFonts w:ascii="Microsoft YaHei UI" w:eastAsia="Microsoft YaHei UI" w:hAnsi="Microsoft YaHei UI" w:cs="Gungsuh"/>
-              <w:color w:val="000000"/>
-            </w:rPr>
-            <w:t>格（車位與規劃平面圖如附件一，下稱「合作標的物」），出租並委由乙方進行設備整建、管理系統規劃以經營收費停車場（下稱「合作停車場」）。</w:t>
-          </w:r>
-        </w:sdtContent>
-      </w:sdt>
-    </w:p>
-    <w:p>
-      <w:pPr>
-        <w:numPr>
-          <w:ilvl w:val="0"/>
-          <w:numId w:val="1"/>
-        </w:numPr>
-        <w:pBdr>
-          <w:top w:val="nil"/>
-          <w:left w:val="nil"/>
-          <w:bottom w:val="nil"/>
-          <w:right w:val="nil"/>
-          <w:between w:val="nil"/>
-        </w:pBdr>
-        <w:spacing w:line="420" w:lineRule="auto"/>
-        <w:ind w:left="993"/>
-        <w:jc w:val="both"/>
-        <w:rPr>
-          <w:rFonts w:ascii="Microsoft YaHei UI" w:eastAsia="Microsoft YaHei UI" w:hAnsi="Microsoft YaHei UI" w:cs="Times New Roman"/>
-          <w:color w:val="000000"/>
-        </w:rPr>
-      </w:pPr>
-      <w:sdt>
-        <w:sdtPr>
-          <w:rPr>
-            <w:rFonts w:ascii="Microsoft YaHei UI" w:eastAsia="Microsoft YaHei UI" w:hAnsi="Microsoft YaHei UI"/>
-          </w:rPr>
-          <w:tag w:val="goog_rdk_12"/>
-          <w:id w:val="-1064232339"/>
-        </w:sdtPr>
-        <w:sdtContent>
-          <w:r>
-            <w:rPr>
-              <w:rFonts w:ascii="Microsoft YaHei UI" w:eastAsia="Microsoft YaHei UI" w:hAnsi="Microsoft YaHei UI" w:cs="Gungsuh"/>
-              <w:color w:val="000000"/>
-            </w:rPr>
-            <w:t>乙方在本契約期間內，得於合作標的物上建置停車管理系統與相關設備（含充電樁等，下稱「停管設備」），以供經營收費停車場之用。</w:t>
-          </w:r>
-        </w:sdtContent>
-      </w:sdt>
-    </w:p>
-    <w:p>
-      <w:pPr>
-        <w:numPr>
-          <w:ilvl w:val="0"/>
-          <w:numId w:val="1"/>
-        </w:numPr>
-        <w:pBdr>
-          <w:top w:val="nil"/>
-          <w:left w:val="nil"/>
-          <w:bottom w:val="nil"/>
-          <w:right w:val="nil"/>
-          <w:between w:val="nil"/>
-        </w:pBdr>
-        <w:spacing w:line="420" w:lineRule="auto"/>
-        <w:ind w:left="993"/>
-        <w:jc w:val="both"/>
-        <w:rPr>
-          <w:rFonts w:ascii="Microsoft YaHei UI" w:eastAsia="Microsoft YaHei UI" w:hAnsi="Microsoft YaHei UI" w:cs="Times New Roman"/>
-          <w:color w:val="000000"/>
-        </w:rPr>
-      </w:pPr>
-      <w:sdt>
-        <w:sdtPr>
-          <w:rPr>
-            <w:rFonts w:ascii="Microsoft YaHei UI" w:eastAsia="Microsoft YaHei UI" w:hAnsi="Microsoft YaHei UI"/>
-          </w:rPr>
-          <w:tag w:val="goog_rdk_13"/>
-          <w:id w:val="-796320582"/>
-        </w:sdtPr>
-        <w:sdtContent>
-          <w:r>
-            <w:rPr>
-              <w:rFonts w:ascii="Microsoft YaHei UI" w:eastAsia="Microsoft YaHei UI" w:hAnsi="Microsoft YaHei UI" w:cs="Gungsuh"/>
-              <w:color w:val="000000"/>
-            </w:rPr>
-            <w:t>汽車駕駛人於乙方管理之網站或手機應用程式（APP）上註冊成為乙方會員，或通過合作停車場入口之車輛辨識後，得於合作停車場停車消費並完成付款。</w:t>
-          </w:r>
-        </w:sdtContent>
-      </w:sdt>
-    </w:p>
-    <w:p>
-      <w:pPr>
-        <w:pBdr>
-          <w:top w:val="nil"/>
-          <w:left w:val="nil"/>
-          <w:bottom w:val="nil"/>
-          <w:right w:val="nil"/>
-          <w:between w:val="nil"/>
-        </w:pBdr>
-        <w:spacing w:line="420" w:lineRule="auto"/>
-        <w:jc w:val="both"/>
-        <w:rPr>
-          <w:rFonts w:ascii="Microsoft YaHei UI" w:hAnsi="Microsoft YaHei UI" w:cs="Times New Roman"/>
-          <w:color w:val="000000"/>
-        </w:rPr>
-      </w:pPr>
-    </w:p>
-    <w:p>
-      <w:pPr>
-        <w:pBdr>
-          <w:top w:val="nil"/>
-          <w:left w:val="nil"/>
-          <w:bottom w:val="nil"/>
-          <w:right w:val="nil"/>
-          <w:between w:val="nil"/>
-        </w:pBdr>
-        <w:spacing w:line="420" w:lineRule="auto"/>
-        <w:jc w:val="both"/>
-        <w:rPr>
-          <w:rFonts w:ascii="Microsoft YaHei UI" w:hAnsi="Microsoft YaHei UI" w:cs="Times New Roman" w:hint="eastAsia"/>
-          <w:color w:val="000000"/>
-        </w:rPr>
-      </w:pPr>
-    </w:p>
-    <w:p>
-      <w:pPr>
-        <w:numPr>
-          <w:ilvl w:val="0"/>
-          <w:numId w:val="9"/>
-        </w:numPr>
-        <w:pBdr>
-          <w:top w:val="nil"/>
-          <w:left w:val="nil"/>
-          <w:bottom w:val="nil"/>
-          <w:right w:val="nil"/>
-          <w:between w:val="nil"/>
-        </w:pBdr>
-        <w:spacing w:line="420" w:lineRule="auto"/>
-        <w:ind w:left="992" w:hanging="992"/>
-        <w:jc w:val="both"/>
-        <w:rPr>
-          <w:rFonts w:ascii="Microsoft YaHei UI" w:eastAsia="Microsoft YaHei UI" w:hAnsi="Microsoft YaHei UI" w:cs="Times New Roman"/>
-          <w:color w:val="000000"/>
-        </w:rPr>
-      </w:pPr>
-      <w:sdt>
-        <w:sdtPr>
-          <w:rPr>
-            <w:rFonts w:ascii="Microsoft YaHei UI" w:eastAsia="Microsoft YaHei UI" w:hAnsi="Microsoft YaHei UI"/>
-          </w:rPr>
-          <w:tag w:val="goog_rdk_14"/>
-          <w:id w:val="1468653322"/>
-        </w:sdtPr>
-        <w:sdtContent>
-          <w:r>
-            <w:rPr>
-              <w:rFonts w:ascii="Microsoft YaHei UI" w:eastAsia="Microsoft YaHei UI" w:hAnsi="Microsoft YaHei UI" w:cs="Gungsuh"/>
-              <w:color w:val="000000"/>
-            </w:rPr>
-            <w:t>收入與分潤</w:t>
-          </w:r>
-        </w:sdtContent>
-      </w:sdt>
-    </w:p>
-    <w:p>
-      <w:pPr>
-        <w:numPr>
-          <w:ilvl w:val="0"/>
-          <w:numId w:val="2"/>
-        </w:numPr>
-        <w:pBdr>
-          <w:top w:val="nil"/>
-          <w:left w:val="nil"/>
-          <w:bottom w:val="nil"/>
-          <w:right w:val="nil"/>
-          <w:between w:val="nil"/>
-        </w:pBdr>
-        <w:spacing w:line="420" w:lineRule="auto"/>
-        <w:jc w:val="both"/>
-        <w:rPr>
-          <w:rFonts w:ascii="Microsoft YaHei UI" w:eastAsia="Microsoft YaHei UI" w:hAnsi="Microsoft YaHei UI" w:cs="Times New Roman"/>
-          <w:color w:val="000000"/>
-        </w:rPr>
-      </w:pPr>
-      <w:sdt>
-        <w:sdtPr>
-          <w:rPr>
-            <w:rFonts w:ascii="Microsoft YaHei UI" w:eastAsia="Microsoft YaHei UI" w:hAnsi="Microsoft YaHei UI"/>
-          </w:rPr>
-          <w:tag w:val="goog_rdk_15"/>
-          <w:id w:val="-1695862651"/>
-        </w:sdtPr>
-        <w:sdtContent>
-          <w:r>
-            <w:rPr>
-              <w:rFonts w:ascii="Microsoft YaHei UI" w:eastAsia="Microsoft YaHei UI" w:hAnsi="Microsoft YaHei UI" w:cs="Gungsuh"/>
-              <w:color w:val="000000"/>
-            </w:rPr>
-            <w:t>於合作停車場使用停車服務者（下稱「消費者」），將透過乙方所開發之網頁、手機應用程式或繳費機，向乙方支付停車費及其他相關費用。乙方應以乙方之名義開立統一發票予消費者，不得有漏開或購買統一發票等違法情事，如有違反乙方應自負一切法令責任。</w:t>
-          </w:r>
-        </w:sdtContent>
-      </w:sdt>
-    </w:p>
-    <w:p>
-      <w:pPr>
-        <w:numPr>
-          <w:ilvl w:val="0"/>
-          <w:numId w:val="2"/>
-        </w:numPr>
-        <w:pBdr>
-          <w:top w:val="nil"/>
-          <w:left w:val="nil"/>
-          <w:bottom w:val="nil"/>
-          <w:right w:val="nil"/>
-          <w:between w:val="nil"/>
-        </w:pBdr>
-        <w:spacing w:line="420" w:lineRule="auto"/>
-        <w:jc w:val="both"/>
-        <w:rPr>
-          <w:rFonts w:ascii="Microsoft YaHei UI" w:eastAsia="Microsoft YaHei UI" w:hAnsi="Microsoft YaHei UI" w:cs="Times New Roman"/>
-          <w:color w:val="000000"/>
-        </w:rPr>
-      </w:pPr>
-      <w:sdt>
-        <w:sdtPr>
-          <w:rPr>
-            <w:rFonts w:ascii="Microsoft YaHei UI" w:eastAsia="Microsoft YaHei UI" w:hAnsi="Microsoft YaHei UI"/>
-          </w:rPr>
-          <w:tag w:val="goog_rdk_18"/>
-          <w:id w:val="1119532441"/>
-        </w:sdtPr>
-        <w:sdtContent>
-          <w:r>
-            <w:rPr>
-              <w:rFonts w:ascii="Microsoft YaHei UI" w:eastAsia="Microsoft YaHei UI" w:hAnsi="Microsoft YaHei UI" w:cs="Gungsuh"/>
-              <w:color w:val="000000"/>
-            </w:rPr>
-            <w:t>收益分派：自契約生效日起，乙方以合作標的物提供停車服務所得之營收（</w:t>
-          </w:r>
-          <w:r>
-            <w:rPr>
-              <w:rFonts w:asciiTheme="minorEastAsia" w:hAnsiTheme="minorEastAsia" w:cs="Gungsuh"/>
-              <w:color w:val="000000"/>
-            </w:rPr>
-            <w:t>{{ tax_type }}</w:t>
-          </w:r>
-        </w:sdtContent>
-      </w:sdt>
-      <w:r>
-        <w:rPr>
-          <w:rFonts w:ascii="Microsoft YaHei UI" w:eastAsia="Microsoft YaHei UI" w:hAnsi="Microsoft YaHei UI" w:cs="微軟正黑體"/>
-        </w:rPr>
-        <w:t>，</w:t>
-      </w:r>
-      <w:sdt>
-        <w:sdtPr>
-          <w:rPr>
-            <w:rFonts w:ascii="Microsoft YaHei UI" w:eastAsia="Microsoft YaHei UI" w:hAnsi="Microsoft YaHei UI"/>
-          </w:rPr>
-          <w:tag w:val="goog_rdk_19"/>
-          <w:id w:val="-450415413"/>
-        </w:sdtPr>
-        <w:sdtContent>
-          <w:r>
-            <w:rPr>
-              <w:rFonts w:ascii="Microsoft YaHei UI" w:eastAsia="Microsoft YaHei UI" w:hAnsi="Microsoft YaHei UI" w:cs="Gungsuh"/>
-              <w:color w:val="000000"/>
-            </w:rPr>
-            <w:t>下稱「停車場營收」），</w:t>
-          </w:r>
-        </w:sdtContent>
-      </w:sdt>
-      <w:sdt>
-        <w:sdtPr>
-          <w:rPr>
-            <w:rFonts w:ascii="Microsoft YaHei UI" w:eastAsia="Microsoft YaHei UI" w:hAnsi="Microsoft YaHei UI"/>
-          </w:rPr>
-          <w:tag w:val="goog_rdk_16"/>
-          <w:id w:val="-282989543"/>
-        </w:sdtPr>
-        <w:sdtContent>
-          <w:sdt>
-            <w:sdtPr>
-              <w:rPr>
-                <w:rFonts w:ascii="Microsoft YaHei UI" w:eastAsia="Microsoft YaHei UI" w:hAnsi="Microsoft YaHei UI"/>
-              </w:rPr>
-              <w:tag w:val="goog_rdk_17"/>
-              <w:id w:val="1338006753"/>
-            </w:sdtPr>
-            <w:sdtContent>
-              <w:ins w:id="0" w:author="陳漢融" w:date="2026-01-23T03:14:00Z">
-                <w:r>
-                  <w:rPr>
-                    <w:rFonts w:ascii="Microsoft YaHei UI" w:eastAsia="Microsoft YaHei UI" w:hAnsi="Microsoft YaHei UI" w:cs="Times New Roman" w:hint="eastAsia"/>
-                    <w:rPrChange w:id="1" w:author="陳漢融" w:date="2026-01-23T03:14:00Z">
-                      <w:rPr>
-                        <w:rFonts w:ascii="Times New Roman" w:eastAsia="Times New Roman" w:hAnsi="Times New Roman" w:cs="Times New Roman" w:hint="eastAsia"/>
-                        <w:color w:val="000000"/>
-                      </w:rPr>
-                    </w:rPrChange>
-                  </w:rPr>
-                  <w:t>乙方於停車場營收實際發生時，</w:t>
-                </w:r>
-              </w:ins>
-            </w:sdtContent>
-          </w:sdt>
-        </w:sdtContent>
-      </w:sdt>
-      <w:sdt>
-        <w:sdtPr>
-          <w:rPr>
-            <w:rFonts w:ascii="Microsoft YaHei UI" w:eastAsia="Microsoft YaHei UI" w:hAnsi="Microsoft YaHei UI"/>
-          </w:rPr>
-          <w:tag w:val="goog_rdk_20"/>
-          <w:id w:val="-177491615"/>
-        </w:sdtPr>
-        <w:sdtContent>
-          <w:r>
-            <w:rPr>
-              <w:rFonts w:ascii="Microsoft YaHei UI" w:eastAsia="Microsoft YaHei UI" w:hAnsi="Microsoft YaHei UI" w:cs="Gungsuh"/>
-              <w:color w:val="000000"/>
-            </w:rPr>
-            <w:t xml:space="preserve">由甲乙雙方依甲方分得 </w:t>
-          </w:r>
-          <w:r>
-            <w:rPr>
-              <w:rFonts w:asciiTheme="minorEastAsia" w:hAnsiTheme="minorEastAsia" w:cs="Gungsuh"/>
-              <w:color w:val="000000"/>
-              <w:u w:val="single"/>
-            </w:rPr>
-            <w:t>{{ party_a_percent }}</w:t>
-          </w:r>
-          <w:r>
-            <w:rPr>
-              <w:rFonts w:ascii="Microsoft YaHei UI" w:eastAsia="Microsoft YaHei UI" w:hAnsi="Microsoft YaHei UI" w:cs="Gungsuh"/>
-              <w:color w:val="000000"/>
-            </w:rPr>
-            <w:t xml:space="preserve"> %、乙方分得 </w:t>
-          </w:r>
-          <w:r>
-            <w:rPr>
-              <w:rFonts w:asciiTheme="minorEastAsia" w:hAnsiTheme="minorEastAsia" w:cs="Gungsuh"/>
-              <w:color w:val="000000"/>
-              <w:u w:val="single"/>
-            </w:rPr>
-            <w:t>{{ party_b_percent }}</w:t>
-          </w:r>
-          <w:r>
-            <w:rPr>
-              <w:rFonts w:ascii="Microsoft YaHei UI" w:eastAsia="Microsoft YaHei UI" w:hAnsi="Microsoft YaHei UI" w:cs="Gungsuh"/>
-              <w:color w:val="000000"/>
-            </w:rPr>
-            <w:t>%之比例分潤。</w:t>
-          </w:r>
-        </w:sdtContent>
-      </w:sdt>
-    </w:p>
-    <w:p>
-      <w:pPr>
-        <w:numPr>
-          <w:ilvl w:val="0"/>
-          <w:numId w:val="2"/>
-        </w:numPr>
-        <w:pBdr>
-          <w:top w:val="nil"/>
-          <w:left w:val="nil"/>
-          <w:bottom w:val="nil"/>
-          <w:right w:val="nil"/>
-          <w:between w:val="nil"/>
-        </w:pBdr>
-        <w:spacing w:line="420" w:lineRule="auto"/>
-        <w:jc w:val="both"/>
-        <w:rPr>
-          <w:rFonts w:ascii="Microsoft YaHei UI" w:eastAsia="Microsoft YaHei UI" w:hAnsi="Microsoft YaHei UI" w:cs="Times New Roman"/>
-          <w:color w:val="000000"/>
-        </w:rPr>
-      </w:pPr>
-      <w:sdt>
-        <w:sdtPr>
-          <w:rPr>
-            <w:rFonts w:ascii="Microsoft YaHei UI" w:eastAsia="Microsoft YaHei UI" w:hAnsi="Microsoft YaHei UI"/>
-          </w:rPr>
-          <w:tag w:val="goog_rdk_21"/>
-          <w:id w:val="-181406985"/>
-        </w:sdtPr>
-        <w:sdtContent>
-          <w:r>
-            <w:rPr>
-              <w:rFonts w:ascii="Microsoft YaHei UI" w:eastAsia="Microsoft YaHei UI" w:hAnsi="Microsoft YaHei UI" w:cs="Gungsuh"/>
-              <w:color w:val="000000"/>
-            </w:rPr>
-            <w:t>消費者如以折價券或停車金使用乙方服務時，其使用之折價券或停車金所扣抵之金額仍應納入營收，計算應給予甲方的分潤金額，不得予以扣除。</w:t>
-          </w:r>
-        </w:sdtContent>
-      </w:sdt>
-    </w:p>
-    <w:p>
-      <w:pPr>
-        <w:numPr>
-          <w:ilvl w:val="0"/>
-          <w:numId w:val="2"/>
-        </w:numPr>
-        <w:pBdr>
-          <w:top w:val="nil"/>
-          <w:left w:val="nil"/>
-          <w:bottom w:val="nil"/>
-          <w:right w:val="nil"/>
-          <w:between w:val="nil"/>
-        </w:pBdr>
-        <w:spacing w:line="420" w:lineRule="auto"/>
-        <w:jc w:val="both"/>
-        <w:rPr>
-          <w:rFonts w:ascii="Microsoft YaHei UI" w:eastAsia="Microsoft YaHei UI" w:hAnsi="Microsoft YaHei UI" w:cs="Times New Roman"/>
-          <w:color w:val="000000"/>
-        </w:rPr>
-      </w:pPr>
-      <w:sdt>
-        <w:sdtPr>
-          <w:rPr>
-            <w:rFonts w:ascii="Microsoft YaHei UI" w:eastAsia="Microsoft YaHei UI" w:hAnsi="Microsoft YaHei UI"/>
-          </w:rPr>
-          <w:tag w:val="goog_rdk_22"/>
-          <w:id w:val="1306839695"/>
-        </w:sdtPr>
-        <w:sdtContent>
-          <w:r>
-            <w:rPr>
-              <w:rFonts w:ascii="Microsoft YaHei UI" w:eastAsia="Microsoft YaHei UI" w:hAnsi="Microsoft YaHei UI" w:cs="Gungsuh"/>
-              <w:color w:val="000000"/>
-            </w:rPr>
-            <w:t>本條收益分派計算之基礎以乙方電子統計結算數額為準，分潤金額以單筆訂單金額乘上第二項所訂之分潤比例後，無條件捨去至整數位計算。</w:t>
-          </w:r>
-        </w:sdtContent>
-      </w:sdt>
-    </w:p>
-    <w:p>
-      <w:pPr>
-        <w:numPr>
-          <w:ilvl w:val="0"/>
-          <w:numId w:val="2"/>
-        </w:numPr>
-        <w:pBdr>
-          <w:top w:val="nil"/>
-          <w:left w:val="nil"/>
-          <w:bottom w:val="nil"/>
-          <w:right w:val="nil"/>
-          <w:between w:val="nil"/>
-        </w:pBdr>
-        <w:spacing w:line="420" w:lineRule="auto"/>
-        <w:jc w:val="both"/>
-        <w:rPr>
-          <w:rFonts w:ascii="Microsoft YaHei UI" w:eastAsia="Microsoft YaHei UI" w:hAnsi="Microsoft YaHei UI" w:cs="Times New Roman"/>
-          <w:color w:val="000000"/>
-        </w:rPr>
-      </w:pPr>
-      <w:sdt>
-        <w:sdtPr>
-          <w:rPr>
-            <w:rFonts w:ascii="Microsoft YaHei UI" w:eastAsia="Microsoft YaHei UI" w:hAnsi="Microsoft YaHei UI"/>
-          </w:rPr>
-          <w:tag w:val="goog_rdk_23"/>
-          <w:id w:val="1371219545"/>
-        </w:sdtPr>
-        <w:sdtContent>
-          <w:commentRangeStart w:id="2"/>
-        </w:sdtContent>
-      </w:sdt>
-      <w:sdt>
-        <w:sdtPr>
-          <w:rPr>
-            <w:rFonts w:ascii="Microsoft YaHei UI" w:eastAsia="Microsoft YaHei UI" w:hAnsi="Microsoft YaHei UI"/>
-          </w:rPr>
-          <w:tag w:val="goog_rdk_24"/>
-          <w:id w:val="-418345086"/>
-        </w:sdtPr>
-        <w:sdtContent>
-          <w:r>
-            <w:rPr>
-              <w:rFonts w:ascii="Microsoft YaHei UI" w:eastAsia="Microsoft YaHei UI" w:hAnsi="Microsoft YaHei UI" w:cs="Gungsuh"/>
-              <w:color w:val="000000"/>
-            </w:rPr>
-            <w:t>月營收報表以乙方於當月份實際收到帳款為計算依據</w:t>
-          </w:r>
-        </w:sdtContent>
-      </w:sdt>
-      <w:commentRangeEnd w:id="2"/>
-      <w:r>
-        <w:rPr>
-          <w:rStyle w:val="a8"/>
-          <w:rFonts w:ascii="Microsoft YaHei UI" w:eastAsia="Microsoft YaHei UI" w:hAnsi="Microsoft YaHei UI"/>
-          <w:sz w:val="24"/>
-          <w:szCs w:val="24"/>
-        </w:rPr>
-        <w:commentReference w:id="2"/>
-      </w:r>
       <w:sdt>
         <w:sdtPr>
           <w:rPr>
@@ -3829,116 +2862,6 @@
     </w:sectPr>
   </w:body>
 </w:document>
-</file>
-
-<file path=word/comments.xml><?xml version="1.0" encoding="utf-8"?>
-<w:comments xmlns:wpc="http://schemas.microsoft.com/office/word/2010/wordprocessingCanvas" xmlns:cx="http://schemas.microsoft.com/office/drawing/2014/chartex" xmlns:cx1="http://schemas.microsoft.com/office/drawing/2015/9/8/chartex" xmlns:cx2="http://schemas.microsoft.com/office/drawing/2015/10/21/chartex" xmlns:cx3="http://schemas.microsoft.com/office/drawing/2016/5/9/chartex" xmlns:cx4="http://schemas.microsoft.com/office/drawing/2016/5/10/chartex" xmlns:cx5="http://schemas.microsoft.com/office/drawing/2016/5/11/chartex" xmlns:cx6="http://schemas.microsoft.com/office/drawing/2016/5/12/chartex" xmlns:cx7="http://schemas.microsoft.com/office/drawing/2016/5/13/chartex" xmlns:cx8="http://schemas.microsoft.com/office/drawing/2016/5/14/chartex" xmlns:mc="http://schemas.openxmlformats.org/markup-compatibility/2006" xmlns:aink="http://schemas.microsoft.com/office/drawing/2016/ink" xmlns:am3d="http://schemas.microsoft.com/office/drawing/2017/model3d" xmlns:o="urn:schemas-microsoft-com:office:office" xmlns:oel="http://schemas.microsoft.com/office/2019/extlst" xmlns:r="http://schemas.openxmlformats.org/officeDocument/2006/relationships" xmlns:m="http://schemas.openxmlformats.org/officeDocument/2006/math" xmlns:v="urn:schemas-microsoft-com:vml" xmlns:wp14="http://schemas.microsoft.com/office/word/2010/wordprocessingDrawing" xmlns:wp="http://schemas.openxmlformats.org/drawingml/2006/wordprocessingDrawing" xmlns:w10="urn:schemas-microsoft-com:office:word" xmlns:w="http://schemas.openxmlformats.org/wordprocessingml/2006/main" xmlns:w14="http://schemas.microsoft.com/office/word/2010/wordml" xmlns:w15="http://schemas.microsoft.com/office/word/2012/wordml" xmlns:w16cex="http://schemas.microsoft.com/office/word/2018/wordml/cex" xmlns:w16cid="http://schemas.microsoft.com/office/word/2016/wordml/cid" xmlns:w16="http://schemas.microsoft.com/office/word/2018/wordml" xmlns:w16du="http://schemas.microsoft.com/office/word/2023/wordml/word16du" xmlns:w16sdtdh="http://schemas.microsoft.com/office/word/2020/wordml/sdtdatahash" xmlns:w16sdtfl="http://schemas.microsoft.com/office/word/2024/wordml/sdtformatlock" xmlns:w16se="http://schemas.microsoft.com/office/word/2015/wordml/symex" xmlns:wpg="http://schemas.microsoft.com/office/word/2010/wordprocessingGroup" xmlns:wpi="http://schemas.microsoft.com/office/word/2010/wordprocessingInk" xmlns:wne="http://schemas.microsoft.com/office/word/2006/wordml" xmlns:wps="http://schemas.microsoft.com/office/word/2010/wordprocessingShape" mc:Ignorable="w14 w15 w16se w16cid w16 w16cex w16sdtdh w16sdtfl w16du wp14">
-  <w:comment w:id="2" w:author="陳漢融" w:date="2026-01-23T03:23:00Z" w:initials="">
-    <w:p>
-      <w:pPr>
-        <w:pBdr>
-          <w:top w:val="nil"/>
-          <w:left w:val="nil"/>
-          <w:bottom w:val="nil"/>
-          <w:right w:val="nil"/>
-          <w:between w:val="nil"/>
-        </w:pBdr>
-        <w:rPr>
-          <w:rFonts w:ascii="Arial" w:eastAsia="Arial" w:hAnsi="Arial" w:cs="Arial"/>
-          <w:color w:val="000000"/>
-          <w:sz w:val="22"/>
-          <w:szCs w:val="22"/>
-        </w:rPr>
-      </w:pPr>
-      <w:r>
-        <w:rPr>
-          <w:rStyle w:val="a8"/>
-        </w:rPr>
-        <w:annotationRef/>
-      </w:r>
-      <w:sdt>
-        <w:sdtPr>
-          <w:tag w:val="goog_rdk_104"/>
-          <w:id w:val="-838553216"/>
-        </w:sdtPr>
-        <w:sdtContent>
-          <w:r>
-            <w:rPr>
-              <w:rFonts w:ascii="Arial Unicode MS" w:eastAsia="Arial Unicode MS" w:hAnsi="Arial Unicode MS" w:cs="Arial Unicode MS"/>
-              <w:color w:val="000000"/>
-              <w:sz w:val="22"/>
-              <w:szCs w:val="22"/>
-            </w:rPr>
-            <w:t>須注意，「預收款項」在租戶提前退租時須返還給租戶，停車場營收在租戶實際使用後或者屆期未退租時才實際發生。</w:t>
-          </w:r>
-        </w:sdtContent>
-      </w:sdt>
-    </w:p>
-    <w:p>
-      <w:pPr>
-        <w:pBdr>
-          <w:top w:val="nil"/>
-          <w:left w:val="nil"/>
-          <w:bottom w:val="nil"/>
-          <w:right w:val="nil"/>
-          <w:between w:val="nil"/>
-        </w:pBdr>
-        <w:rPr>
-          <w:rFonts w:ascii="Arial" w:eastAsia="Arial" w:hAnsi="Arial" w:cs="Arial"/>
-          <w:color w:val="000000"/>
-          <w:sz w:val="22"/>
-          <w:szCs w:val="22"/>
-        </w:rPr>
-      </w:pPr>
-    </w:p>
-    <w:p>
-      <w:pPr>
-        <w:pBdr>
-          <w:top w:val="nil"/>
-          <w:left w:val="nil"/>
-          <w:bottom w:val="nil"/>
-          <w:right w:val="nil"/>
-          <w:between w:val="nil"/>
-        </w:pBdr>
-        <w:rPr>
-          <w:rFonts w:ascii="Arial" w:eastAsia="Arial" w:hAnsi="Arial" w:cs="Arial"/>
-          <w:color w:val="000000"/>
-          <w:sz w:val="22"/>
-          <w:szCs w:val="22"/>
-        </w:rPr>
-      </w:pPr>
-      <w:sdt>
-        <w:sdtPr>
-          <w:tag w:val="goog_rdk_105"/>
-          <w:id w:val="901153345"/>
-        </w:sdtPr>
-        <w:sdtContent>
-          <w:r>
-            <w:rPr>
-              <w:rFonts w:ascii="Arial Unicode MS" w:eastAsia="Arial Unicode MS" w:hAnsi="Arial Unicode MS" w:cs="Arial Unicode MS"/>
-              <w:color w:val="000000"/>
-              <w:sz w:val="22"/>
-              <w:szCs w:val="22"/>
-            </w:rPr>
-            <w:t>月營收報表中「實際收到帳款」應不計入當月之「預收款項」。</w:t>
-          </w:r>
-        </w:sdtContent>
-      </w:sdt>
-    </w:p>
-  </w:comment>
-</w:comments>
-</file>
-
-<file path=word/commentsExtended.xml><?xml version="1.0" encoding="utf-8"?>
-<w15:commentsEx xmlns:wpc="http://schemas.microsoft.com/office/word/2010/wordprocessingCanvas" xmlns:cx="http://schemas.microsoft.com/office/drawing/2014/chartex" xmlns:cx1="http://schemas.microsoft.com/office/drawing/2015/9/8/chartex" xmlns:cx2="http://schemas.microsoft.com/office/drawing/2015/10/21/chartex" xmlns:cx3="http://schemas.microsoft.com/office/drawing/2016/5/9/chartex" xmlns:cx4="http://schemas.microsoft.com/office/drawing/2016/5/10/chartex" xmlns:cx5="http://schemas.microsoft.com/office/drawing/2016/5/11/chartex" xmlns:cx6="http://schemas.microsoft.com/office/drawing/2016/5/12/chartex" xmlns:cx7="http://schemas.microsoft.com/office/drawing/2016/5/13/chartex" xmlns:cx8="http://schemas.microsoft.com/office/drawing/2016/5/14/chartex" xmlns:mc="http://schemas.openxmlformats.org/markup-compatibility/2006" xmlns:aink="http://schemas.microsoft.com/office/drawing/2016/ink" xmlns:am3d="http://schemas.microsoft.com/office/drawing/2017/model3d" xmlns:o="urn:schemas-microsoft-com:office:office" xmlns:oel="http://schemas.microsoft.com/office/2019/extlst" xmlns:r="http://schemas.openxmlformats.org/officeDocument/2006/relationships" xmlns:m="http://schemas.openxmlformats.org/officeDocument/2006/math" xmlns:v="urn:schemas-microsoft-com:vml" xmlns:wp14="http://schemas.microsoft.com/office/word/2010/wordprocessingDrawing" xmlns:wp="http://schemas.openxmlformats.org/drawingml/2006/wordprocessingDrawing" xmlns:w10="urn:schemas-microsoft-com:office:word" xmlns:w="http://schemas.openxmlformats.org/wordprocessingml/2006/main" xmlns:w14="http://schemas.microsoft.com/office/word/2010/wordml" xmlns:w15="http://schemas.microsoft.com/office/word/2012/wordml" xmlns:w16cex="http://schemas.microsoft.com/office/word/2018/wordml/cex" xmlns:w16cid="http://schemas.microsoft.com/office/word/2016/wordml/cid" xmlns:w16="http://schemas.microsoft.com/office/word/2018/wordml" xmlns:w16du="http://schemas.microsoft.com/office/word/2023/wordml/word16du" xmlns:w16sdtdh="http://schemas.microsoft.com/office/word/2020/wordml/sdtdatahash" xmlns:w16sdtfl="http://schemas.microsoft.com/office/word/2024/wordml/sdtformatlock" xmlns:w16se="http://schemas.microsoft.com/office/word/2015/wordml/symex" xmlns:wpg="http://schemas.microsoft.com/office/word/2010/wordprocessingGroup" xmlns:wpi="http://schemas.microsoft.com/office/word/2010/wordprocessingInk" xmlns:wne="http://schemas.microsoft.com/office/word/2006/wordml" xmlns:wps="http://schemas.microsoft.com/office/word/2010/wordprocessingShape" mc:Ignorable="w14 w15 w16se w16cid w16 w16cex w16sdtdh w16sdtfl w16du wp14">
-  <w15:commentEx w15:paraId="0000007A" w15:done="0"/>
-</w15:commentsEx>
-</file>
-
-<file path=word/commentsIds.xml><?xml version="1.0" encoding="utf-8"?>
-<w16cid:commentsIds xmlns:wpc="http://schemas.microsoft.com/office/word/2010/wordprocessingCanvas" xmlns:cx="http://schemas.microsoft.com/office/drawing/2014/chartex" xmlns:cx1="http://schemas.microsoft.com/office/drawing/2015/9/8/chartex" xmlns:cx2="http://schemas.microsoft.com/office/drawing/2015/10/21/chartex" xmlns:cx3="http://schemas.microsoft.com/office/drawing/2016/5/9/chartex" xmlns:cx4="http://schemas.microsoft.com/office/drawing/2016/5/10/chartex" xmlns:cx5="http://schemas.microsoft.com/office/drawing/2016/5/11/chartex" xmlns:cx6="http://schemas.microsoft.com/office/drawing/2016/5/12/chartex" xmlns:cx7="http://schemas.microsoft.com/office/drawing/2016/5/13/chartex" xmlns:cx8="http://schemas.microsoft.com/office/drawing/2016/5/14/chartex" xmlns:mc="http://schemas.openxmlformats.org/markup-compatibility/2006" xmlns:aink="http://schemas.microsoft.com/office/drawing/2016/ink" xmlns:am3d="http://schemas.microsoft.com/office/drawing/2017/model3d" xmlns:o="urn:schemas-microsoft-com:office:office" xmlns:oel="http://schemas.microsoft.com/office/2019/extlst" xmlns:r="http://schemas.openxmlformats.org/officeDocument/2006/relationships" xmlns:m="http://schemas.openxmlformats.org/officeDocument/2006/math" xmlns:v="urn:schemas-microsoft-com:vml" xmlns:wp14="http://schemas.microsoft.com/office/word/2010/wordprocessingDrawing" xmlns:wp="http://schemas.openxmlformats.org/drawingml/2006/wordprocessingDrawing" xmlns:w10="urn:schemas-microsoft-com:office:word" xmlns:w="http://schemas.openxmlformats.org/wordprocessingml/2006/main" xmlns:w14="http://schemas.microsoft.com/office/word/2010/wordml" xmlns:w15="http://schemas.microsoft.com/office/word/2012/wordml" xmlns:w16cex="http://schemas.microsoft.com/office/word/2018/wordml/cex" xmlns:w16cid="http://schemas.microsoft.com/office/word/2016/wordml/cid" xmlns:w16="http://schemas.microsoft.com/office/word/2018/wordml" xmlns:w16du="http://schemas.microsoft.com/office/word/2023/wordml/word16du" xmlns:w16sdtdh="http://schemas.microsoft.com/office/word/2020/wordml/sdtdatahash" xmlns:w16sdtfl="http://schemas.microsoft.com/office/word/2024/wordml/sdtformatlock" xmlns:w16se="http://schemas.microsoft.com/office/word/2015/wordml/symex" xmlns:wpg="http://schemas.microsoft.com/office/word/2010/wordprocessingGroup" xmlns:wpi="http://schemas.microsoft.com/office/word/2010/wordprocessingInk" xmlns:wne="http://schemas.microsoft.com/office/word/2006/wordml" xmlns:wps="http://schemas.microsoft.com/office/word/2010/wordprocessingShape" mc:Ignorable="w14 w15 w16se w16cid w16 w16cex w16sdtdh w16sdtfl w16du wp14">
-  <w16cid:commentId w16cid:paraId="0000007A" w16cid:durableId="0000007A"/>
-</w16cid:commentsIds>
 </file>
 
 <file path=word/endnotes.xml><?xml version="1.0" encoding="utf-8"?>

</xml_diff>

<commit_message>
fix: restore uspace templates with content intact
Previous commit (7ca39f3) accidentally deleted 20 paragraphs from
template_profit_uspace.docx and 17 from template_rent_uspace.docx
via an overly broad commentReference regex in document.xml.

This commit restores both templates from the pre-cleanup state and
re-applies only the safe removal: delete comment/people XML files and
their Content_Types/relationship entries, WITHOUT touching document.xml.
The orphaned commentRange markers left in document.xml are harmless
when the comment files are absent.

Co-Authored-By: Claude Sonnet 4.6 <noreply@anthropic.com>
</commit_message>
<xml_diff>
--- a/自動產生合約範本/template_profit_uspace.docx
+++ b/自動產生合約範本/template_profit_uspace.docx
@@ -46,6 +46,973 @@
           <w:szCs w:val="20"/>
         </w:rPr>
       </w:pPr>
+      <w:r>
+        <w:rPr>
+          <w:rFonts w:ascii="Microsoft YaHei UI" w:eastAsia="Microsoft YaHei UI" w:hAnsi="Microsoft YaHei UI"/>
+          <w:noProof/>
+        </w:rPr>
+        <mc:AlternateContent>
+          <mc:Choice Requires="wps">
+            <w:drawing>
+              <wp:anchor distT="0" distB="0" distL="114300" distR="114300" simplePos="0" relativeHeight="251658240" behindDoc="0" locked="0" layoutInCell="1" hidden="0" allowOverlap="1" wp14:anchorId="70378120" wp14:editId="1C619E0A">
+                <wp:simplePos x="0" y="0"/>
+                <wp:positionH relativeFrom="column">
+                  <wp:posOffset>4575175</wp:posOffset>
+                </wp:positionH>
+                <wp:positionV relativeFrom="paragraph">
+                  <wp:posOffset>-85721</wp:posOffset>
+                </wp:positionV>
+                <wp:extent cx="2146088" cy="309034"/>
+                <wp:effectExtent l="0" t="0" r="0" b="0"/>
+                <wp:wrapNone/>
+                <wp:docPr id="1" name="矩形 1"/>
+                <wp:cNvGraphicFramePr/>
+                <a:graphic xmlns:a="http://schemas.openxmlformats.org/drawingml/2006/main">
+                  <a:graphicData uri="http://schemas.microsoft.com/office/word/2010/wordprocessingShape">
+                    <wps:wsp>
+                      <wps:cNvSpPr/>
+                      <wps:spPr>
+                        <a:xfrm>
+                          <a:off x="4287244" y="3639771"/>
+                          <a:ext cx="2117513" cy="280459"/>
+                        </a:xfrm>
+                        <a:prstGeom prst="rect">
+                          <a:avLst/>
+                        </a:prstGeom>
+                        <a:solidFill>
+                          <a:schemeClr val="lt1"/>
+                        </a:solidFill>
+                        <a:ln w="9525" cap="flat" cmpd="sng">
+                          <a:solidFill>
+                            <a:srgbClr val="000000"/>
+                          </a:solidFill>
+                          <a:prstDash val="solid"/>
+                          <a:round/>
+                          <a:headEnd type="none" w="sm" len="sm"/>
+                          <a:tailEnd type="none" w="sm" len="sm"/>
+                        </a:ln>
+                      </wps:spPr>
+                      <wps:txbx>
+                        <w:txbxContent>
+                          <w:p>
+                            <w:pPr>
+                              <w:textDirection w:val="btLr"/>
+                            </w:pPr>
+                            <w:r>
+                              <w:rPr>
+                                <w:rFonts w:ascii="標楷體" w:eastAsia="標楷體" w:hAnsi="標楷體" w:cs="標楷體"/>
+                                <w:color w:val="000000"/>
+                              </w:rPr>
+                              <w:t>合約編號：</w:t>
+                            </w:r>
+                          </w:p>
+                        </w:txbxContent>
+                      </wps:txbx>
+                      <wps:bodyPr spcFirstLastPara="1" wrap="square" lIns="91425" tIns="45700" rIns="91425" bIns="45700" anchor="t" anchorCtr="0">
+                        <a:noAutofit/>
+                      </wps:bodyPr>
+                    </wps:wsp>
+                  </a:graphicData>
+                </a:graphic>
+              </wp:anchor>
+            </w:drawing>
+          </mc:Choice>
+          <mc:Fallback>
+            <w:pict>
+              <v:rect w14:anchorId="70378120" id="矩形 1" o:spid="_x0000_s1026" style="position:absolute;left:0;text-align:left;margin-left:360.25pt;margin-top:-6.75pt;width:169pt;height:24.35pt;z-index:251658240;visibility:visible;mso-wrap-style:square;mso-wrap-distance-left:9pt;mso-wrap-distance-top:0;mso-wrap-distance-right:9pt;mso-wrap-distance-bottom:0;mso-position-horizontal:absolute;mso-position-horizontal-relative:text;mso-position-vertical:absolute;mso-position-vertical-relative:text;v-text-anchor:top" o:gfxdata="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" fillcolor="white [3201]">
+                <v:stroke startarrowwidth="narrow" startarrowlength="short" endarrowwidth="narrow" endarrowlength="short" joinstyle="round"/>
+                <v:textbox inset="2.53958mm,1.2694mm,2.53958mm,1.2694mm">
+                  <w:txbxContent>
+                    <w:p>
+                      <w:pPr>
+                        <w:textDirection w:val="btLr"/>
+                      </w:pPr>
+                      <w:r>
+                        <w:rPr>
+                          <w:rFonts w:ascii="標楷體" w:eastAsia="標楷體" w:hAnsi="標楷體" w:cs="標楷體"/>
+                          <w:color w:val="000000"/>
+                        </w:rPr>
+                        <w:t>合約編號：</w:t>
+                      </w:r>
+                    </w:p>
+                  </w:txbxContent>
+                </v:textbox>
+              </v:rect>
+            </w:pict>
+          </mc:Fallback>
+        </mc:AlternateContent>
+      </w:r>
+    </w:p>
+    <w:p>
+      <w:pPr>
+        <w:spacing w:line="420" w:lineRule="auto"/>
+        <w:jc w:val="center"/>
+        <w:rPr>
+          <w:rFonts w:ascii="Microsoft YaHei UI" w:eastAsia="Microsoft YaHei UI" w:hAnsi="Microsoft YaHei UI" w:cs="Times New Roman"/>
+          <w:color w:val="000000"/>
+          <w:sz w:val="44"/>
+          <w:szCs w:val="44"/>
+        </w:rPr>
+      </w:pPr>
+      <w:sdt>
+        <w:sdtPr>
+          <w:rPr>
+            <w:rFonts w:ascii="Microsoft YaHei UI" w:eastAsia="Microsoft YaHei UI" w:hAnsi="Microsoft YaHei UI"/>
+          </w:rPr>
+          <w:tag w:val="goog_rdk_0"/>
+          <w:id w:val="-1201435268"/>
+        </w:sdtPr>
+        <w:sdtContent>
+          <w:r>
+            <w:rPr>
+              <w:rFonts w:ascii="Microsoft YaHei UI" w:eastAsia="Microsoft YaHei UI" w:hAnsi="Microsoft YaHei UI" w:cs="Gungsuh"/>
+              <w:color w:val="000000"/>
+              <w:sz w:val="44"/>
+              <w:szCs w:val="44"/>
+            </w:rPr>
+            <w:t>USPACE停車位租賃契約書</w:t>
+          </w:r>
+        </w:sdtContent>
+      </w:sdt>
+    </w:p>
+    <w:p>
+      <w:pPr>
+        <w:pBdr>
+          <w:top w:val="nil"/>
+          <w:left w:val="nil"/>
+          <w:bottom w:val="nil"/>
+          <w:right w:val="nil"/>
+          <w:between w:val="nil"/>
+        </w:pBdr>
+        <w:spacing w:line="420" w:lineRule="auto"/>
+        <w:jc w:val="both"/>
+        <w:rPr>
+          <w:rFonts w:ascii="Microsoft YaHei UI" w:eastAsia="Microsoft YaHei UI" w:hAnsi="Microsoft YaHei UI" w:cs="Times New Roman"/>
+          <w:color w:val="000000"/>
+        </w:rPr>
+      </w:pPr>
+      <w:sdt>
+        <w:sdtPr>
+          <w:rPr>
+            <w:rFonts w:ascii="Microsoft YaHei UI" w:eastAsia="Microsoft YaHei UI" w:hAnsi="Microsoft YaHei UI"/>
+          </w:rPr>
+          <w:tag w:val="goog_rdk_1"/>
+          <w:id w:val="-1740094108"/>
+        </w:sdtPr>
+        <w:sdtContent>
+          <w:r>
+            <w:rPr>
+              <w:rFonts w:ascii="Microsoft YaHei UI" w:eastAsia="Microsoft YaHei UI" w:hAnsi="Microsoft YaHei UI" w:cs="Gungsuh"/>
+              <w:color w:val="000000"/>
+            </w:rPr>
+            <w:t>出租人：</w:t>
+          </w:r>
+        </w:sdtContent>
+      </w:sdt>
+      <w:sdt>
+        <w:sdtPr>
+          <w:rPr>
+            <w:rFonts w:ascii="Microsoft YaHei UI" w:eastAsia="Microsoft YaHei UI" w:hAnsi="Microsoft YaHei UI"/>
+          </w:rPr>
+          <w:tag w:val="goog_rdk_2"/>
+          <w:id w:val="512121334"/>
+        </w:sdtPr>
+        <w:sdtContent>
+          <w:sdt>
+            <w:sdtPr>
+              <w:rPr>
+                <w:rFonts w:asciiTheme="minorEastAsia" w:hAnsiTheme="minorEastAsia"/>
+              </w:rPr>
+              <w:tag w:val="goog_rdk_2"/>
+              <w:id w:val="340281747"/>
+            </w:sdtPr>
+            <w:sdtContent>
+              <w:r>
+                <w:rPr>
+                  <w:rFonts w:asciiTheme="minorEastAsia" w:hAnsiTheme="minorEastAsia" w:cs="Gungsuh"/>
+                  <w:u w:val="single"/>
+                </w:rPr>
+                <w:t>{{ party_a }}</w:t>
+              </w:r>
+            </w:sdtContent>
+          </w:sdt>
+        </w:sdtContent>
+      </w:sdt>
+      <w:sdt>
+        <w:sdtPr>
+          <w:rPr>
+            <w:rFonts w:ascii="Microsoft YaHei UI" w:eastAsia="Microsoft YaHei UI" w:hAnsi="Microsoft YaHei UI"/>
+          </w:rPr>
+          <w:tag w:val="goog_rdk_3"/>
+          <w:id w:val="1390816045"/>
+        </w:sdtPr>
+        <w:sdtContent>
+          <w:r>
+            <w:rPr>
+              <w:rFonts w:ascii="Microsoft YaHei UI" w:eastAsia="Microsoft YaHei UI" w:hAnsi="Microsoft YaHei UI" w:cs="Gungsuh"/>
+              <w:color w:val="000000"/>
+            </w:rPr>
+            <w:t>（下稱「甲方」）</w:t>
+          </w:r>
+        </w:sdtContent>
+      </w:sdt>
+    </w:p>
+    <w:p>
+      <w:pPr>
+        <w:pBdr>
+          <w:top w:val="nil"/>
+          <w:left w:val="nil"/>
+          <w:bottom w:val="nil"/>
+          <w:right w:val="nil"/>
+          <w:between w:val="nil"/>
+        </w:pBdr>
+        <w:spacing w:line="420" w:lineRule="auto"/>
+        <w:jc w:val="both"/>
+        <w:rPr>
+          <w:rFonts w:ascii="Microsoft YaHei UI" w:eastAsia="Microsoft YaHei UI" w:hAnsi="Microsoft YaHei UI" w:cs="Times New Roman"/>
+          <w:color w:val="000000"/>
+        </w:rPr>
+      </w:pPr>
+      <w:sdt>
+        <w:sdtPr>
+          <w:rPr>
+            <w:rFonts w:ascii="Microsoft YaHei UI" w:eastAsia="Microsoft YaHei UI" w:hAnsi="Microsoft YaHei UI"/>
+          </w:rPr>
+          <w:tag w:val="goog_rdk_4"/>
+          <w:id w:val="-556912444"/>
+        </w:sdtPr>
+        <w:sdtContent>
+          <w:r>
+            <w:rPr>
+              <w:rFonts w:ascii="Microsoft YaHei UI" w:eastAsia="Microsoft YaHei UI" w:hAnsi="Microsoft YaHei UI" w:cs="Gungsuh"/>
+              <w:color w:val="000000"/>
+            </w:rPr>
+            <w:t>承租人：悠勢科技股份有限公司 （下稱「乙方」）</w:t>
+          </w:r>
+        </w:sdtContent>
+      </w:sdt>
+    </w:p>
+    <w:p>
+      <w:pPr>
+        <w:pBdr>
+          <w:top w:val="nil"/>
+          <w:left w:val="nil"/>
+          <w:bottom w:val="nil"/>
+          <w:right w:val="nil"/>
+          <w:between w:val="nil"/>
+        </w:pBdr>
+        <w:spacing w:line="420" w:lineRule="auto"/>
+        <w:jc w:val="both"/>
+        <w:rPr>
+          <w:rFonts w:ascii="Microsoft YaHei UI" w:eastAsia="Microsoft YaHei UI" w:hAnsi="Microsoft YaHei UI" w:cs="Times New Roman"/>
+          <w:color w:val="000000"/>
+        </w:rPr>
+      </w:pPr>
+    </w:p>
+    <w:p>
+      <w:pPr>
+        <w:pBdr>
+          <w:top w:val="nil"/>
+          <w:left w:val="nil"/>
+          <w:bottom w:val="nil"/>
+          <w:right w:val="nil"/>
+          <w:between w:val="nil"/>
+        </w:pBdr>
+        <w:spacing w:line="420" w:lineRule="auto"/>
+        <w:jc w:val="both"/>
+        <w:rPr>
+          <w:rFonts w:ascii="Microsoft YaHei UI" w:eastAsia="Microsoft YaHei UI" w:hAnsi="Microsoft YaHei UI" w:cs="Times New Roman"/>
+          <w:color w:val="000000"/>
+        </w:rPr>
+      </w:pPr>
+      <w:sdt>
+        <w:sdtPr>
+          <w:rPr>
+            <w:rFonts w:ascii="Microsoft YaHei UI" w:eastAsia="Microsoft YaHei UI" w:hAnsi="Microsoft YaHei UI"/>
+          </w:rPr>
+          <w:tag w:val="goog_rdk_5"/>
+          <w:id w:val="-2074206022"/>
+        </w:sdtPr>
+        <w:sdtContent>
+          <w:r>
+            <w:rPr>
+              <w:rFonts w:ascii="Microsoft YaHei UI" w:eastAsia="Microsoft YaHei UI" w:hAnsi="Microsoft YaHei UI" w:cs="Gungsuh"/>
+              <w:color w:val="000000"/>
+            </w:rPr>
+            <w:t>茲因甲方擬將其所有之停車場出租並委由乙方進行設備整建、管理系統規劃以經營收費停車場，雙方爰訂定本USPACE停車位租賃契約書（以下簡稱「本契約」），並議定條款如後，以茲共同遵守：</w:t>
+          </w:r>
+        </w:sdtContent>
+      </w:sdt>
+    </w:p>
+    <w:p>
+      <w:pPr>
+        <w:pBdr>
+          <w:top w:val="nil"/>
+          <w:left w:val="nil"/>
+          <w:bottom w:val="nil"/>
+          <w:right w:val="nil"/>
+          <w:between w:val="nil"/>
+        </w:pBdr>
+        <w:spacing w:line="420" w:lineRule="auto"/>
+        <w:jc w:val="both"/>
+        <w:rPr>
+          <w:rFonts w:ascii="Microsoft YaHei UI" w:eastAsia="Microsoft YaHei UI" w:hAnsi="Microsoft YaHei UI" w:cs="Times New Roman"/>
+          <w:color w:val="000000"/>
+        </w:rPr>
+      </w:pPr>
+    </w:p>
+    <w:p>
+      <w:pPr>
+        <w:numPr>
+          <w:ilvl w:val="0"/>
+          <w:numId w:val="9"/>
+        </w:numPr>
+        <w:pBdr>
+          <w:top w:val="nil"/>
+          <w:left w:val="nil"/>
+          <w:bottom w:val="nil"/>
+          <w:right w:val="nil"/>
+          <w:between w:val="nil"/>
+        </w:pBdr>
+        <w:spacing w:line="420" w:lineRule="auto"/>
+        <w:ind w:left="992" w:hanging="992"/>
+        <w:jc w:val="both"/>
+        <w:rPr>
+          <w:rFonts w:ascii="Microsoft YaHei UI" w:eastAsia="Microsoft YaHei UI" w:hAnsi="Microsoft YaHei UI" w:cs="Times New Roman"/>
+          <w:color w:val="000000"/>
+        </w:rPr>
+      </w:pPr>
+      <w:sdt>
+        <w:sdtPr>
+          <w:rPr>
+            <w:rFonts w:ascii="Microsoft YaHei UI" w:eastAsia="Microsoft YaHei UI" w:hAnsi="Microsoft YaHei UI"/>
+          </w:rPr>
+          <w:tag w:val="goog_rdk_6"/>
+          <w:id w:val="44632955"/>
+        </w:sdtPr>
+        <w:sdtContent>
+          <w:r>
+            <w:rPr>
+              <w:rFonts w:ascii="Microsoft YaHei UI" w:eastAsia="Microsoft YaHei UI" w:hAnsi="Microsoft YaHei UI" w:cs="Gungsuh"/>
+              <w:color w:val="000000"/>
+            </w:rPr>
+            <w:t>租賃標的</w:t>
+          </w:r>
+        </w:sdtContent>
+      </w:sdt>
+    </w:p>
+    <w:p>
+      <w:pPr>
+        <w:numPr>
+          <w:ilvl w:val="0"/>
+          <w:numId w:val="1"/>
+        </w:numPr>
+        <w:pBdr>
+          <w:top w:val="nil"/>
+          <w:left w:val="nil"/>
+          <w:bottom w:val="nil"/>
+          <w:right w:val="nil"/>
+          <w:between w:val="nil"/>
+        </w:pBdr>
+        <w:spacing w:line="420" w:lineRule="auto"/>
+        <w:ind w:left="993"/>
+        <w:jc w:val="both"/>
+        <w:rPr>
+          <w:rFonts w:ascii="Microsoft YaHei UI" w:eastAsia="Microsoft YaHei UI" w:hAnsi="Microsoft YaHei UI" w:cs="Times New Roman"/>
+          <w:color w:val="000000"/>
+        </w:rPr>
+      </w:pPr>
+      <w:sdt>
+        <w:sdtPr>
+          <w:rPr>
+            <w:rFonts w:ascii="Microsoft YaHei UI" w:eastAsia="Microsoft YaHei UI" w:hAnsi="Microsoft YaHei UI"/>
+          </w:rPr>
+          <w:tag w:val="goog_rdk_7"/>
+          <w:id w:val="2135952011"/>
+        </w:sdtPr>
+        <w:sdtEndPr>
+          <w:rPr>
+            <w:rFonts w:cs="Gungsuh"/>
+            <w:color w:val="000000"/>
+          </w:rPr>
+        </w:sdtEndPr>
+        <w:sdtContent>
+          <w:r>
+            <w:rPr>
+              <w:rFonts w:ascii="Microsoft YaHei UI" w:eastAsia="Microsoft YaHei UI" w:hAnsi="Microsoft YaHei UI" w:cs="Gungsuh"/>
+              <w:color w:val="000000"/>
+            </w:rPr>
+            <w:t>甲方同意將其所有，坐落於</w:t>
+          </w:r>
+          <w:r>
+            <w:rPr>
+              <w:rFonts w:asciiTheme="minorEastAsia" w:hAnsiTheme="minorEastAsia" w:cs="Gungsuh"/>
+              <w:color w:val="000000"/>
+            </w:rPr>
+            <w:t>{{ address }}</w:t>
+          </w:r>
+        </w:sdtContent>
+      </w:sdt>
+      <w:sdt>
+        <w:sdtPr>
+          <w:rPr>
+            <w:rFonts w:ascii="Microsoft YaHei UI" w:eastAsia="Microsoft YaHei UI" w:hAnsi="Microsoft YaHei UI" w:cs="Gungsuh"/>
+            <w:color w:val="000000"/>
+          </w:rPr>
+          <w:tag w:val="goog_rdk_9"/>
+          <w:id w:val="878499625"/>
+        </w:sdtPr>
+        <w:sdtEndPr>
+          <w:rPr>
+            <w:rFonts w:cs="Cambria"/>
+            <w:color w:val="auto"/>
+          </w:rPr>
+        </w:sdtEndPr>
+        <w:sdtContent>
+          <w:r>
+            <w:rPr>
+              <w:rFonts w:ascii="Microsoft YaHei UI" w:eastAsia="Microsoft YaHei UI" w:hAnsi="Microsoft YaHei UI" w:cs="Gungsuh"/>
+              <w:color w:val="000000"/>
+            </w:rPr>
+            <w:t>之停車位/土地/建物，共</w:t>
+          </w:r>
+        </w:sdtContent>
+      </w:sdt>
+      <w:sdt>
+        <w:sdtPr>
+          <w:rPr>
+            <w:rFonts w:ascii="Microsoft YaHei UI" w:eastAsia="Microsoft YaHei UI" w:hAnsi="Microsoft YaHei UI"/>
+          </w:rPr>
+          <w:tag w:val="goog_rdk_10"/>
+          <w:id w:val="-774881446"/>
+        </w:sdtPr>
+        <w:sdtEndPr>
+          <w:rPr>
+            <w:rFonts w:cs="Gungsuh"/>
+            <w:color w:val="000000"/>
+          </w:rPr>
+        </w:sdtEndPr>
+        <w:sdtContent>
+          <w:r>
+            <w:rPr>
+              <w:rFonts w:asciiTheme="minorEastAsia" w:hAnsiTheme="minorEastAsia"/>
+              <w:u w:val="single"/>
+            </w:rPr>
+            <w:t>{{ spots }}</w:t>
+          </w:r>
+        </w:sdtContent>
+      </w:sdt>
+      <w:sdt>
+        <w:sdtPr>
+          <w:rPr>
+            <w:rFonts w:ascii="Microsoft YaHei UI" w:eastAsia="Microsoft YaHei UI" w:hAnsi="Microsoft YaHei UI" w:cs="Gungsuh"/>
+            <w:color w:val="000000"/>
+          </w:rPr>
+          <w:tag w:val="goog_rdk_11"/>
+          <w:id w:val="-492536171"/>
+        </w:sdtPr>
+        <w:sdtEndPr>
+          <w:rPr>
+            <w:rFonts w:cs="Cambria"/>
+            <w:color w:val="auto"/>
+          </w:rPr>
+        </w:sdtEndPr>
+        <w:sdtContent>
+          <w:r>
+            <w:rPr>
+              <w:rFonts w:ascii="Microsoft YaHei UI" w:eastAsia="Microsoft YaHei UI" w:hAnsi="Microsoft YaHei UI" w:cs="Gungsuh"/>
+              <w:color w:val="000000"/>
+            </w:rPr>
+            <w:t>格（車位與規劃平面圖如附件一，下稱「合作標的物」），出租並委由乙方進行設備整建、管理系統規劃以經營收費停車場（下稱「合作停車場」）。</w:t>
+          </w:r>
+        </w:sdtContent>
+      </w:sdt>
+    </w:p>
+    <w:p>
+      <w:pPr>
+        <w:numPr>
+          <w:ilvl w:val="0"/>
+          <w:numId w:val="1"/>
+        </w:numPr>
+        <w:pBdr>
+          <w:top w:val="nil"/>
+          <w:left w:val="nil"/>
+          <w:bottom w:val="nil"/>
+          <w:right w:val="nil"/>
+          <w:between w:val="nil"/>
+        </w:pBdr>
+        <w:spacing w:line="420" w:lineRule="auto"/>
+        <w:ind w:left="993"/>
+        <w:jc w:val="both"/>
+        <w:rPr>
+          <w:rFonts w:ascii="Microsoft YaHei UI" w:eastAsia="Microsoft YaHei UI" w:hAnsi="Microsoft YaHei UI" w:cs="Times New Roman"/>
+          <w:color w:val="000000"/>
+        </w:rPr>
+      </w:pPr>
+      <w:sdt>
+        <w:sdtPr>
+          <w:rPr>
+            <w:rFonts w:ascii="Microsoft YaHei UI" w:eastAsia="Microsoft YaHei UI" w:hAnsi="Microsoft YaHei UI"/>
+          </w:rPr>
+          <w:tag w:val="goog_rdk_12"/>
+          <w:id w:val="-1064232339"/>
+        </w:sdtPr>
+        <w:sdtContent>
+          <w:r>
+            <w:rPr>
+              <w:rFonts w:ascii="Microsoft YaHei UI" w:eastAsia="Microsoft YaHei UI" w:hAnsi="Microsoft YaHei UI" w:cs="Gungsuh"/>
+              <w:color w:val="000000"/>
+            </w:rPr>
+            <w:t>乙方在本契約期間內，得於合作標的物上建置停車管理系統與相關設備（含充電樁等，下稱「停管設備」），以供經營收費停車場之用。</w:t>
+          </w:r>
+        </w:sdtContent>
+      </w:sdt>
+    </w:p>
+    <w:p>
+      <w:pPr>
+        <w:numPr>
+          <w:ilvl w:val="0"/>
+          <w:numId w:val="1"/>
+        </w:numPr>
+        <w:pBdr>
+          <w:top w:val="nil"/>
+          <w:left w:val="nil"/>
+          <w:bottom w:val="nil"/>
+          <w:right w:val="nil"/>
+          <w:between w:val="nil"/>
+        </w:pBdr>
+        <w:spacing w:line="420" w:lineRule="auto"/>
+        <w:ind w:left="993"/>
+        <w:jc w:val="both"/>
+        <w:rPr>
+          <w:rFonts w:ascii="Microsoft YaHei UI" w:eastAsia="Microsoft YaHei UI" w:hAnsi="Microsoft YaHei UI" w:cs="Times New Roman"/>
+          <w:color w:val="000000"/>
+        </w:rPr>
+      </w:pPr>
+      <w:sdt>
+        <w:sdtPr>
+          <w:rPr>
+            <w:rFonts w:ascii="Microsoft YaHei UI" w:eastAsia="Microsoft YaHei UI" w:hAnsi="Microsoft YaHei UI"/>
+          </w:rPr>
+          <w:tag w:val="goog_rdk_13"/>
+          <w:id w:val="-796320582"/>
+        </w:sdtPr>
+        <w:sdtContent>
+          <w:r>
+            <w:rPr>
+              <w:rFonts w:ascii="Microsoft YaHei UI" w:eastAsia="Microsoft YaHei UI" w:hAnsi="Microsoft YaHei UI" w:cs="Gungsuh"/>
+              <w:color w:val="000000"/>
+            </w:rPr>
+            <w:t>汽車駕駛人於乙方管理之網站或手機應用程式（APP）上註冊成為乙方會員，或通過合作停車場入口之車輛辨識後，得於合作停車場停車消費並完成付款。</w:t>
+          </w:r>
+        </w:sdtContent>
+      </w:sdt>
+    </w:p>
+    <w:p>
+      <w:pPr>
+        <w:pBdr>
+          <w:top w:val="nil"/>
+          <w:left w:val="nil"/>
+          <w:bottom w:val="nil"/>
+          <w:right w:val="nil"/>
+          <w:between w:val="nil"/>
+        </w:pBdr>
+        <w:spacing w:line="420" w:lineRule="auto"/>
+        <w:jc w:val="both"/>
+        <w:rPr>
+          <w:rFonts w:ascii="Microsoft YaHei UI" w:hAnsi="Microsoft YaHei UI" w:cs="Times New Roman"/>
+          <w:color w:val="000000"/>
+        </w:rPr>
+      </w:pPr>
+    </w:p>
+    <w:p>
+      <w:pPr>
+        <w:pBdr>
+          <w:top w:val="nil"/>
+          <w:left w:val="nil"/>
+          <w:bottom w:val="nil"/>
+          <w:right w:val="nil"/>
+          <w:between w:val="nil"/>
+        </w:pBdr>
+        <w:spacing w:line="420" w:lineRule="auto"/>
+        <w:jc w:val="both"/>
+        <w:rPr>
+          <w:rFonts w:ascii="Microsoft YaHei UI" w:hAnsi="Microsoft YaHei UI" w:cs="Times New Roman" w:hint="eastAsia"/>
+          <w:color w:val="000000"/>
+        </w:rPr>
+      </w:pPr>
+    </w:p>
+    <w:p>
+      <w:pPr>
+        <w:numPr>
+          <w:ilvl w:val="0"/>
+          <w:numId w:val="9"/>
+        </w:numPr>
+        <w:pBdr>
+          <w:top w:val="nil"/>
+          <w:left w:val="nil"/>
+          <w:bottom w:val="nil"/>
+          <w:right w:val="nil"/>
+          <w:between w:val="nil"/>
+        </w:pBdr>
+        <w:spacing w:line="420" w:lineRule="auto"/>
+        <w:ind w:left="992" w:hanging="992"/>
+        <w:jc w:val="both"/>
+        <w:rPr>
+          <w:rFonts w:ascii="Microsoft YaHei UI" w:eastAsia="Microsoft YaHei UI" w:hAnsi="Microsoft YaHei UI" w:cs="Times New Roman"/>
+          <w:color w:val="000000"/>
+        </w:rPr>
+      </w:pPr>
+      <w:sdt>
+        <w:sdtPr>
+          <w:rPr>
+            <w:rFonts w:ascii="Microsoft YaHei UI" w:eastAsia="Microsoft YaHei UI" w:hAnsi="Microsoft YaHei UI"/>
+          </w:rPr>
+          <w:tag w:val="goog_rdk_14"/>
+          <w:id w:val="1468653322"/>
+        </w:sdtPr>
+        <w:sdtContent>
+          <w:r>
+            <w:rPr>
+              <w:rFonts w:ascii="Microsoft YaHei UI" w:eastAsia="Microsoft YaHei UI" w:hAnsi="Microsoft YaHei UI" w:cs="Gungsuh"/>
+              <w:color w:val="000000"/>
+            </w:rPr>
+            <w:t>收入與分潤</w:t>
+          </w:r>
+        </w:sdtContent>
+      </w:sdt>
+    </w:p>
+    <w:p>
+      <w:pPr>
+        <w:numPr>
+          <w:ilvl w:val="0"/>
+          <w:numId w:val="2"/>
+        </w:numPr>
+        <w:pBdr>
+          <w:top w:val="nil"/>
+          <w:left w:val="nil"/>
+          <w:bottom w:val="nil"/>
+          <w:right w:val="nil"/>
+          <w:between w:val="nil"/>
+        </w:pBdr>
+        <w:spacing w:line="420" w:lineRule="auto"/>
+        <w:jc w:val="both"/>
+        <w:rPr>
+          <w:rFonts w:ascii="Microsoft YaHei UI" w:eastAsia="Microsoft YaHei UI" w:hAnsi="Microsoft YaHei UI" w:cs="Times New Roman"/>
+          <w:color w:val="000000"/>
+        </w:rPr>
+      </w:pPr>
+      <w:sdt>
+        <w:sdtPr>
+          <w:rPr>
+            <w:rFonts w:ascii="Microsoft YaHei UI" w:eastAsia="Microsoft YaHei UI" w:hAnsi="Microsoft YaHei UI"/>
+          </w:rPr>
+          <w:tag w:val="goog_rdk_15"/>
+          <w:id w:val="-1695862651"/>
+        </w:sdtPr>
+        <w:sdtContent>
+          <w:r>
+            <w:rPr>
+              <w:rFonts w:ascii="Microsoft YaHei UI" w:eastAsia="Microsoft YaHei UI" w:hAnsi="Microsoft YaHei UI" w:cs="Gungsuh"/>
+              <w:color w:val="000000"/>
+            </w:rPr>
+            <w:t>於合作停車場使用停車服務者（下稱「消費者」），將透過乙方所開發之網頁、手機應用程式或繳費機，向乙方支付停車費及其他相關費用。乙方應以乙方之名義開立統一發票予消費者，不得有漏開或購買統一發票等違法情事，如有違反乙方應自負一切法令責任。</w:t>
+          </w:r>
+        </w:sdtContent>
+      </w:sdt>
+    </w:p>
+    <w:p>
+      <w:pPr>
+        <w:numPr>
+          <w:ilvl w:val="0"/>
+          <w:numId w:val="2"/>
+        </w:numPr>
+        <w:pBdr>
+          <w:top w:val="nil"/>
+          <w:left w:val="nil"/>
+          <w:bottom w:val="nil"/>
+          <w:right w:val="nil"/>
+          <w:between w:val="nil"/>
+        </w:pBdr>
+        <w:spacing w:line="420" w:lineRule="auto"/>
+        <w:jc w:val="both"/>
+        <w:rPr>
+          <w:rFonts w:ascii="Microsoft YaHei UI" w:eastAsia="Microsoft YaHei UI" w:hAnsi="Microsoft YaHei UI" w:cs="Times New Roman"/>
+          <w:color w:val="000000"/>
+        </w:rPr>
+      </w:pPr>
+      <w:sdt>
+        <w:sdtPr>
+          <w:rPr>
+            <w:rFonts w:ascii="Microsoft YaHei UI" w:eastAsia="Microsoft YaHei UI" w:hAnsi="Microsoft YaHei UI"/>
+          </w:rPr>
+          <w:tag w:val="goog_rdk_18"/>
+          <w:id w:val="1119532441"/>
+        </w:sdtPr>
+        <w:sdtContent>
+          <w:r>
+            <w:rPr>
+              <w:rFonts w:ascii="Microsoft YaHei UI" w:eastAsia="Microsoft YaHei UI" w:hAnsi="Microsoft YaHei UI" w:cs="Gungsuh"/>
+              <w:color w:val="000000"/>
+            </w:rPr>
+            <w:t>收益分派：自契約生效日起，乙方以合作標的物提供停車服務所得之營收（</w:t>
+          </w:r>
+          <w:r>
+            <w:rPr>
+              <w:rFonts w:asciiTheme="minorEastAsia" w:hAnsiTheme="minorEastAsia" w:cs="Gungsuh"/>
+              <w:color w:val="000000"/>
+            </w:rPr>
+            <w:t>{{ tax_type }}</w:t>
+          </w:r>
+        </w:sdtContent>
+      </w:sdt>
+      <w:r>
+        <w:rPr>
+          <w:rFonts w:ascii="Microsoft YaHei UI" w:eastAsia="Microsoft YaHei UI" w:hAnsi="Microsoft YaHei UI" w:cs="微軟正黑體"/>
+        </w:rPr>
+        <w:t>，</w:t>
+      </w:r>
+      <w:sdt>
+        <w:sdtPr>
+          <w:rPr>
+            <w:rFonts w:ascii="Microsoft YaHei UI" w:eastAsia="Microsoft YaHei UI" w:hAnsi="Microsoft YaHei UI"/>
+          </w:rPr>
+          <w:tag w:val="goog_rdk_19"/>
+          <w:id w:val="-450415413"/>
+        </w:sdtPr>
+        <w:sdtContent>
+          <w:r>
+            <w:rPr>
+              <w:rFonts w:ascii="Microsoft YaHei UI" w:eastAsia="Microsoft YaHei UI" w:hAnsi="Microsoft YaHei UI" w:cs="Gungsuh"/>
+              <w:color w:val="000000"/>
+            </w:rPr>
+            <w:t>下稱「停車場營收」），</w:t>
+          </w:r>
+        </w:sdtContent>
+      </w:sdt>
+      <w:sdt>
+        <w:sdtPr>
+          <w:rPr>
+            <w:rFonts w:ascii="Microsoft YaHei UI" w:eastAsia="Microsoft YaHei UI" w:hAnsi="Microsoft YaHei UI"/>
+          </w:rPr>
+          <w:tag w:val="goog_rdk_16"/>
+          <w:id w:val="-282989543"/>
+        </w:sdtPr>
+        <w:sdtContent>
+          <w:sdt>
+            <w:sdtPr>
+              <w:rPr>
+                <w:rFonts w:ascii="Microsoft YaHei UI" w:eastAsia="Microsoft YaHei UI" w:hAnsi="Microsoft YaHei UI"/>
+              </w:rPr>
+              <w:tag w:val="goog_rdk_17"/>
+              <w:id w:val="1338006753"/>
+            </w:sdtPr>
+            <w:sdtContent>
+              <w:ins w:id="0" w:author="陳漢融" w:date="2026-01-23T03:14:00Z">
+                <w:r>
+                  <w:rPr>
+                    <w:rFonts w:ascii="Microsoft YaHei UI" w:eastAsia="Microsoft YaHei UI" w:hAnsi="Microsoft YaHei UI" w:cs="Times New Roman" w:hint="eastAsia"/>
+                    <w:rPrChange w:id="1" w:author="陳漢融" w:date="2026-01-23T03:14:00Z">
+                      <w:rPr>
+                        <w:rFonts w:ascii="Times New Roman" w:eastAsia="Times New Roman" w:hAnsi="Times New Roman" w:cs="Times New Roman" w:hint="eastAsia"/>
+                        <w:color w:val="000000"/>
+                      </w:rPr>
+                    </w:rPrChange>
+                  </w:rPr>
+                  <w:t>乙方於停車場營收實際發生時，</w:t>
+                </w:r>
+              </w:ins>
+            </w:sdtContent>
+          </w:sdt>
+        </w:sdtContent>
+      </w:sdt>
+      <w:sdt>
+        <w:sdtPr>
+          <w:rPr>
+            <w:rFonts w:ascii="Microsoft YaHei UI" w:eastAsia="Microsoft YaHei UI" w:hAnsi="Microsoft YaHei UI"/>
+          </w:rPr>
+          <w:tag w:val="goog_rdk_20"/>
+          <w:id w:val="-177491615"/>
+        </w:sdtPr>
+        <w:sdtContent>
+          <w:r>
+            <w:rPr>
+              <w:rFonts w:ascii="Microsoft YaHei UI" w:eastAsia="Microsoft YaHei UI" w:hAnsi="Microsoft YaHei UI" w:cs="Gungsuh"/>
+              <w:color w:val="000000"/>
+            </w:rPr>
+            <w:t xml:space="preserve">由甲乙雙方依甲方分得 </w:t>
+          </w:r>
+          <w:r>
+            <w:rPr>
+              <w:rFonts w:asciiTheme="minorEastAsia" w:hAnsiTheme="minorEastAsia" w:cs="Gungsuh"/>
+              <w:color w:val="000000"/>
+              <w:u w:val="single"/>
+            </w:rPr>
+            <w:t>{{ party_a_percent }}</w:t>
+          </w:r>
+          <w:r>
+            <w:rPr>
+              <w:rFonts w:ascii="Microsoft YaHei UI" w:eastAsia="Microsoft YaHei UI" w:hAnsi="Microsoft YaHei UI" w:cs="Gungsuh"/>
+              <w:color w:val="000000"/>
+            </w:rPr>
+            <w:t xml:space="preserve"> %、乙方分得 </w:t>
+          </w:r>
+          <w:r>
+            <w:rPr>
+              <w:rFonts w:asciiTheme="minorEastAsia" w:hAnsiTheme="minorEastAsia" w:cs="Gungsuh"/>
+              <w:color w:val="000000"/>
+              <w:u w:val="single"/>
+            </w:rPr>
+            <w:t>{{ party_b_percent }}</w:t>
+          </w:r>
+          <w:r>
+            <w:rPr>
+              <w:rFonts w:ascii="Microsoft YaHei UI" w:eastAsia="Microsoft YaHei UI" w:hAnsi="Microsoft YaHei UI" w:cs="Gungsuh"/>
+              <w:color w:val="000000"/>
+            </w:rPr>
+            <w:t>%之比例分潤。</w:t>
+          </w:r>
+        </w:sdtContent>
+      </w:sdt>
+    </w:p>
+    <w:p>
+      <w:pPr>
+        <w:numPr>
+          <w:ilvl w:val="0"/>
+          <w:numId w:val="2"/>
+        </w:numPr>
+        <w:pBdr>
+          <w:top w:val="nil"/>
+          <w:left w:val="nil"/>
+          <w:bottom w:val="nil"/>
+          <w:right w:val="nil"/>
+          <w:between w:val="nil"/>
+        </w:pBdr>
+        <w:spacing w:line="420" w:lineRule="auto"/>
+        <w:jc w:val="both"/>
+        <w:rPr>
+          <w:rFonts w:ascii="Microsoft YaHei UI" w:eastAsia="Microsoft YaHei UI" w:hAnsi="Microsoft YaHei UI" w:cs="Times New Roman"/>
+          <w:color w:val="000000"/>
+        </w:rPr>
+      </w:pPr>
+      <w:sdt>
+        <w:sdtPr>
+          <w:rPr>
+            <w:rFonts w:ascii="Microsoft YaHei UI" w:eastAsia="Microsoft YaHei UI" w:hAnsi="Microsoft YaHei UI"/>
+          </w:rPr>
+          <w:tag w:val="goog_rdk_21"/>
+          <w:id w:val="-181406985"/>
+        </w:sdtPr>
+        <w:sdtContent>
+          <w:r>
+            <w:rPr>
+              <w:rFonts w:ascii="Microsoft YaHei UI" w:eastAsia="Microsoft YaHei UI" w:hAnsi="Microsoft YaHei UI" w:cs="Gungsuh"/>
+              <w:color w:val="000000"/>
+            </w:rPr>
+            <w:t>消費者如以折價券或停車金使用乙方服務時，其使用之折價券或停車金所扣抵之金額仍應納入營收，計算應給予甲方的分潤金額，不得予以扣除。</w:t>
+          </w:r>
+        </w:sdtContent>
+      </w:sdt>
+    </w:p>
+    <w:p>
+      <w:pPr>
+        <w:numPr>
+          <w:ilvl w:val="0"/>
+          <w:numId w:val="2"/>
+        </w:numPr>
+        <w:pBdr>
+          <w:top w:val="nil"/>
+          <w:left w:val="nil"/>
+          <w:bottom w:val="nil"/>
+          <w:right w:val="nil"/>
+          <w:between w:val="nil"/>
+        </w:pBdr>
+        <w:spacing w:line="420" w:lineRule="auto"/>
+        <w:jc w:val="both"/>
+        <w:rPr>
+          <w:rFonts w:ascii="Microsoft YaHei UI" w:eastAsia="Microsoft YaHei UI" w:hAnsi="Microsoft YaHei UI" w:cs="Times New Roman"/>
+          <w:color w:val="000000"/>
+        </w:rPr>
+      </w:pPr>
+      <w:sdt>
+        <w:sdtPr>
+          <w:rPr>
+            <w:rFonts w:ascii="Microsoft YaHei UI" w:eastAsia="Microsoft YaHei UI" w:hAnsi="Microsoft YaHei UI"/>
+          </w:rPr>
+          <w:tag w:val="goog_rdk_22"/>
+          <w:id w:val="1306839695"/>
+        </w:sdtPr>
+        <w:sdtContent>
+          <w:r>
+            <w:rPr>
+              <w:rFonts w:ascii="Microsoft YaHei UI" w:eastAsia="Microsoft YaHei UI" w:hAnsi="Microsoft YaHei UI" w:cs="Gungsuh"/>
+              <w:color w:val="000000"/>
+            </w:rPr>
+            <w:t>本條收益分派計算之基礎以乙方電子統計結算數額為準，分潤金額以單筆訂單金額乘上第二項所訂之分潤比例後，無條件捨去至整數位計算。</w:t>
+          </w:r>
+        </w:sdtContent>
+      </w:sdt>
+    </w:p>
+    <w:p>
+      <w:pPr>
+        <w:numPr>
+          <w:ilvl w:val="0"/>
+          <w:numId w:val="2"/>
+        </w:numPr>
+        <w:pBdr>
+          <w:top w:val="nil"/>
+          <w:left w:val="nil"/>
+          <w:bottom w:val="nil"/>
+          <w:right w:val="nil"/>
+          <w:between w:val="nil"/>
+        </w:pBdr>
+        <w:spacing w:line="420" w:lineRule="auto"/>
+        <w:jc w:val="both"/>
+        <w:rPr>
+          <w:rFonts w:ascii="Microsoft YaHei UI" w:eastAsia="Microsoft YaHei UI" w:hAnsi="Microsoft YaHei UI" w:cs="Times New Roman"/>
+          <w:color w:val="000000"/>
+        </w:rPr>
+      </w:pPr>
+      <w:sdt>
+        <w:sdtPr>
+          <w:rPr>
+            <w:rFonts w:ascii="Microsoft YaHei UI" w:eastAsia="Microsoft YaHei UI" w:hAnsi="Microsoft YaHei UI"/>
+          </w:rPr>
+          <w:tag w:val="goog_rdk_23"/>
+          <w:id w:val="1371219545"/>
+        </w:sdtPr>
+        <w:sdtContent>
+          <w:commentRangeStart w:id="2"/>
+        </w:sdtContent>
+      </w:sdt>
+      <w:sdt>
+        <w:sdtPr>
+          <w:rPr>
+            <w:rFonts w:ascii="Microsoft YaHei UI" w:eastAsia="Microsoft YaHei UI" w:hAnsi="Microsoft YaHei UI"/>
+          </w:rPr>
+          <w:tag w:val="goog_rdk_24"/>
+          <w:id w:val="-418345086"/>
+        </w:sdtPr>
+        <w:sdtContent>
+          <w:r>
+            <w:rPr>
+              <w:rFonts w:ascii="Microsoft YaHei UI" w:eastAsia="Microsoft YaHei UI" w:hAnsi="Microsoft YaHei UI" w:cs="Gungsuh"/>
+              <w:color w:val="000000"/>
+            </w:rPr>
+            <w:t>月營收報表以乙方於當月份實際收到帳款為計算依據</w:t>
+          </w:r>
+        </w:sdtContent>
+      </w:sdt>
+      <w:commentRangeEnd w:id="2"/>
+      <w:r>
+        <w:rPr>
+          <w:rStyle w:val="a8"/>
+          <w:rFonts w:ascii="Microsoft YaHei UI" w:eastAsia="Microsoft YaHei UI" w:hAnsi="Microsoft YaHei UI"/>
+          <w:sz w:val="24"/>
+          <w:szCs w:val="24"/>
+        </w:rPr>
+        <w:commentReference w:id="2"/>
+      </w:r>
       <w:sdt>
         <w:sdtPr>
           <w:rPr>

</xml_diff>

<commit_message>
chore: update uspace templates with manual revisions
User manually revised template_rent_uspace.docx and template_profit_uspace.docx.
Comment-related files remain absent; paragraph counts intact (rent: 93, profit: 99).

Co-Authored-By: Claude Sonnet 4.6 <noreply@anthropic.com>
</commit_message>
<xml_diff>
--- a/自動產生合約範本/template_profit_uspace.docx
+++ b/自動產生合約範本/template_profit_uspace.docx
@@ -232,7 +232,23 @@
                   <w:rFonts w:asciiTheme="minorEastAsia" w:hAnsiTheme="minorEastAsia" w:cs="Gungsuh"/>
                   <w:u w:val="single"/>
                 </w:rPr>
-                <w:t>{{ party_a }}</w:t>
+                <w:t xml:space="preserve">{{ </w:t>
+              </w:r>
+              <w:proofErr w:type="spellStart"/>
+              <w:r>
+                <w:rPr>
+                  <w:rFonts w:asciiTheme="minorEastAsia" w:hAnsiTheme="minorEastAsia" w:cs="Gungsuh"/>
+                  <w:u w:val="single"/>
+                </w:rPr>
+                <w:t>party_a</w:t>
+              </w:r>
+              <w:proofErr w:type="spellEnd"/>
+              <w:r>
+                <w:rPr>
+                  <w:rFonts w:asciiTheme="minorEastAsia" w:hAnsiTheme="minorEastAsia" w:cs="Gungsuh"/>
+                  <w:u w:val="single"/>
+                </w:rPr>
+                <w:t xml:space="preserve"> }}</w:t>
               </w:r>
             </w:sdtContent>
           </w:sdt>
@@ -287,7 +303,23 @@
               <w:rFonts w:ascii="Microsoft YaHei UI" w:eastAsia="Microsoft YaHei UI" w:hAnsi="Microsoft YaHei UI" w:cs="Gungsuh"/>
               <w:color w:val="000000"/>
             </w:rPr>
-            <w:t>承租人：悠勢科技股份有限公司 （下稱「乙方」）</w:t>
+            <w:t>承租人：</w:t>
+          </w:r>
+          <w:proofErr w:type="gramStart"/>
+          <w:r>
+            <w:rPr>
+              <w:rFonts w:ascii="Microsoft YaHei UI" w:eastAsia="Microsoft YaHei UI" w:hAnsi="Microsoft YaHei UI" w:cs="Gungsuh"/>
+              <w:color w:val="000000"/>
+            </w:rPr>
+            <w:t>悠勢科技</w:t>
+          </w:r>
+          <w:proofErr w:type="gramEnd"/>
+          <w:r>
+            <w:rPr>
+              <w:rFonts w:ascii="Microsoft YaHei UI" w:eastAsia="Microsoft YaHei UI" w:hAnsi="Microsoft YaHei UI" w:cs="Gungsuh"/>
+              <w:color w:val="000000"/>
+            </w:rPr>
+            <w:t>股份有限公司 （下稱「乙方」）</w:t>
           </w:r>
         </w:sdtContent>
       </w:sdt>
@@ -339,7 +371,23 @@
               <w:rFonts w:ascii="Microsoft YaHei UI" w:eastAsia="Microsoft YaHei UI" w:hAnsi="Microsoft YaHei UI" w:cs="Gungsuh"/>
               <w:color w:val="000000"/>
             </w:rPr>
-            <w:t>茲因甲方擬將其所有之停車場出租並委由乙方進行設備整建、管理系統規劃以經營收費停車場，雙方爰訂定本USPACE停車位租賃契約書（以下簡稱「本契約」），並議定條款如後，以茲共同遵守：</w:t>
+            <w:t>茲因甲方擬將其所有之停車場出租並委由乙方進行設備整建、管理系統規劃以經營收費停車場，雙方</w:t>
+          </w:r>
+          <w:proofErr w:type="gramStart"/>
+          <w:r>
+            <w:rPr>
+              <w:rFonts w:ascii="Microsoft YaHei UI" w:eastAsia="Microsoft YaHei UI" w:hAnsi="Microsoft YaHei UI" w:cs="Gungsuh"/>
+              <w:color w:val="000000"/>
+            </w:rPr>
+            <w:t>爰</w:t>
+          </w:r>
+          <w:proofErr w:type="gramEnd"/>
+          <w:r>
+            <w:rPr>
+              <w:rFonts w:ascii="Microsoft YaHei UI" w:eastAsia="Microsoft YaHei UI" w:hAnsi="Microsoft YaHei UI" w:cs="Gungsuh"/>
+              <w:color w:val="000000"/>
+            </w:rPr>
+            <w:t>訂定本USPACE停車位租賃契約書（以下簡稱「本契約」），並議定條款如後，以茲共同遵守：</w:t>
           </w:r>
         </w:sdtContent>
       </w:sdt>
@@ -637,7 +685,7 @@
         <w:spacing w:line="420" w:lineRule="auto"/>
         <w:jc w:val="both"/>
         <w:rPr>
-          <w:rFonts w:ascii="Microsoft YaHei UI" w:hAnsi="Microsoft YaHei UI" w:cs="Times New Roman" w:hint="eastAsia"/>
+          <w:rFonts w:ascii="Microsoft YaHei UI" w:hAnsi="Microsoft YaHei UI" w:cs="Times New Roman"/>
           <w:color w:val="000000"/>
         </w:rPr>
       </w:pPr>
@@ -762,7 +810,23 @@
               <w:rFonts w:asciiTheme="minorEastAsia" w:hAnsiTheme="minorEastAsia" w:cs="Gungsuh"/>
               <w:color w:val="000000"/>
             </w:rPr>
-            <w:t>{{ tax_type }}</w:t>
+            <w:t xml:space="preserve">{{ </w:t>
+          </w:r>
+          <w:proofErr w:type="spellStart"/>
+          <w:r>
+            <w:rPr>
+              <w:rFonts w:asciiTheme="minorEastAsia" w:hAnsiTheme="minorEastAsia" w:cs="Gungsuh"/>
+              <w:color w:val="000000"/>
+            </w:rPr>
+            <w:t>tax_type</w:t>
+          </w:r>
+          <w:proofErr w:type="spellEnd"/>
+          <w:r>
+            <w:rPr>
+              <w:rFonts w:asciiTheme="minorEastAsia" w:hAnsiTheme="minorEastAsia" w:cs="Gungsuh"/>
+              <w:color w:val="000000"/>
+            </w:rPr>
+            <w:t xml:space="preserve"> }}</w:t>
           </w:r>
         </w:sdtContent>
       </w:sdt>
@@ -808,20 +872,12 @@
               <w:id w:val="1338006753"/>
             </w:sdtPr>
             <w:sdtContent>
-              <w:ins w:id="0" w:author="陳漢融" w:date="2026-01-23T03:14:00Z">
-                <w:r>
-                  <w:rPr>
-                    <w:rFonts w:ascii="Microsoft YaHei UI" w:eastAsia="Microsoft YaHei UI" w:hAnsi="Microsoft YaHei UI" w:cs="Times New Roman" w:hint="eastAsia"/>
-                    <w:rPrChange w:id="1" w:author="陳漢融" w:date="2026-01-23T03:14:00Z">
-                      <w:rPr>
-                        <w:rFonts w:ascii="Times New Roman" w:eastAsia="Times New Roman" w:hAnsi="Times New Roman" w:cs="Times New Roman" w:hint="eastAsia"/>
-                        <w:color w:val="000000"/>
-                      </w:rPr>
-                    </w:rPrChange>
-                  </w:rPr>
-                  <w:t>乙方於停車場營收實際發生時，</w:t>
-                </w:r>
-              </w:ins>
+              <w:r>
+                <w:rPr>
+                  <w:rFonts w:ascii="Microsoft YaHei UI" w:eastAsia="Microsoft YaHei UI" w:hAnsi="Microsoft YaHei UI" w:cs="Times New Roman" w:hint="eastAsia"/>
+                </w:rPr>
+                <w:t>乙方於停車場營收實際發生時，</w:t>
+              </w:r>
             </w:sdtContent>
           </w:sdt>
         </w:sdtContent>
@@ -848,7 +904,25 @@
               <w:color w:val="000000"/>
               <w:u w:val="single"/>
             </w:rPr>
-            <w:t>{{ party_a_percent }}</w:t>
+            <w:t xml:space="preserve">{{ </w:t>
+          </w:r>
+          <w:proofErr w:type="spellStart"/>
+          <w:r>
+            <w:rPr>
+              <w:rFonts w:asciiTheme="minorEastAsia" w:hAnsiTheme="minorEastAsia" w:cs="Gungsuh"/>
+              <w:color w:val="000000"/>
+              <w:u w:val="single"/>
+            </w:rPr>
+            <w:t>party_a_percent</w:t>
+          </w:r>
+          <w:proofErr w:type="spellEnd"/>
+          <w:r>
+            <w:rPr>
+              <w:rFonts w:asciiTheme="minorEastAsia" w:hAnsiTheme="minorEastAsia" w:cs="Gungsuh"/>
+              <w:color w:val="000000"/>
+              <w:u w:val="single"/>
+            </w:rPr>
+            <w:t xml:space="preserve"> }}</w:t>
           </w:r>
           <w:r>
             <w:rPr>
@@ -863,7 +937,25 @@
               <w:color w:val="000000"/>
               <w:u w:val="single"/>
             </w:rPr>
-            <w:t>{{ party_b_percent }}</w:t>
+            <w:t xml:space="preserve">{{ </w:t>
+          </w:r>
+          <w:proofErr w:type="spellStart"/>
+          <w:r>
+            <w:rPr>
+              <w:rFonts w:asciiTheme="minorEastAsia" w:hAnsiTheme="minorEastAsia" w:cs="Gungsuh"/>
+              <w:color w:val="000000"/>
+              <w:u w:val="single"/>
+            </w:rPr>
+            <w:t>party_b_percent</w:t>
+          </w:r>
+          <w:proofErr w:type="spellEnd"/>
+          <w:r>
+            <w:rPr>
+              <w:rFonts w:asciiTheme="minorEastAsia" w:hAnsiTheme="minorEastAsia" w:cs="Gungsuh"/>
+              <w:color w:val="000000"/>
+              <w:u w:val="single"/>
+            </w:rPr>
+            <w:t xml:space="preserve"> }}</w:t>
           </w:r>
           <w:r>
             <w:rPr>
@@ -909,7 +1001,39 @@
               <w:rFonts w:ascii="Microsoft YaHei UI" w:eastAsia="Microsoft YaHei UI" w:hAnsi="Microsoft YaHei UI" w:cs="Gungsuh"/>
               <w:color w:val="000000"/>
             </w:rPr>
-            <w:t>消費者如以折價券或停車金使用乙方服務時，其使用之折價券或停車金所扣抵之金額仍應納入營收，計算應給予甲方的分潤金額，不得予以扣除。</w:t>
+            <w:t>消費者如以折價</w:t>
+          </w:r>
+          <w:proofErr w:type="gramStart"/>
+          <w:r>
+            <w:rPr>
+              <w:rFonts w:ascii="Microsoft YaHei UI" w:eastAsia="Microsoft YaHei UI" w:hAnsi="Microsoft YaHei UI" w:cs="Gungsuh"/>
+              <w:color w:val="000000"/>
+            </w:rPr>
+            <w:t>券</w:t>
+          </w:r>
+          <w:proofErr w:type="gramEnd"/>
+          <w:r>
+            <w:rPr>
+              <w:rFonts w:ascii="Microsoft YaHei UI" w:eastAsia="Microsoft YaHei UI" w:hAnsi="Microsoft YaHei UI" w:cs="Gungsuh"/>
+              <w:color w:val="000000"/>
+            </w:rPr>
+            <w:t>或停車金使用乙方服務時，其使用之折價</w:t>
+          </w:r>
+          <w:proofErr w:type="gramStart"/>
+          <w:r>
+            <w:rPr>
+              <w:rFonts w:ascii="Microsoft YaHei UI" w:eastAsia="Microsoft YaHei UI" w:hAnsi="Microsoft YaHei UI" w:cs="Gungsuh"/>
+              <w:color w:val="000000"/>
+            </w:rPr>
+            <w:t>券</w:t>
+          </w:r>
+          <w:proofErr w:type="gramEnd"/>
+          <w:r>
+            <w:rPr>
+              <w:rFonts w:ascii="Microsoft YaHei UI" w:eastAsia="Microsoft YaHei UI" w:hAnsi="Microsoft YaHei UI" w:cs="Gungsuh"/>
+              <w:color w:val="000000"/>
+            </w:rPr>
+            <w:t>或停車金所扣抵之金額仍應納入營收，計算應給予甲方的分潤金額，不得予以扣除。</w:t>
           </w:r>
         </w:sdtContent>
       </w:sdt>
@@ -948,7 +1072,23 @@
               <w:rFonts w:ascii="Microsoft YaHei UI" w:eastAsia="Microsoft YaHei UI" w:hAnsi="Microsoft YaHei UI" w:cs="Gungsuh"/>
               <w:color w:val="000000"/>
             </w:rPr>
-            <w:t>本條收益分派計算之基礎以乙方電子統計結算數額為準，分潤金額以單筆訂單金額乘上第二項所訂之分潤比例後，無條件捨去至整數位計算。</w:t>
+            <w:t>本條收益分派計算之基礎以乙方電子統計結算數額為</w:t>
+          </w:r>
+          <w:proofErr w:type="gramStart"/>
+          <w:r>
+            <w:rPr>
+              <w:rFonts w:ascii="Microsoft YaHei UI" w:eastAsia="Microsoft YaHei UI" w:hAnsi="Microsoft YaHei UI" w:cs="Gungsuh"/>
+              <w:color w:val="000000"/>
+            </w:rPr>
+            <w:t>準</w:t>
+          </w:r>
+          <w:proofErr w:type="gramEnd"/>
+          <w:r>
+            <w:rPr>
+              <w:rFonts w:ascii="Microsoft YaHei UI" w:eastAsia="Microsoft YaHei UI" w:hAnsi="Microsoft YaHei UI" w:cs="Gungsuh"/>
+              <w:color w:val="000000"/>
+            </w:rPr>
+            <w:t>，分潤金額以單筆訂單金額乘上第二項所訂之分潤比例後，無條件捨去至整數位計算。</w:t>
           </w:r>
         </w:sdtContent>
       </w:sdt>
@@ -981,9 +1121,7 @@
           <w:tag w:val="goog_rdk_23"/>
           <w:id w:val="1371219545"/>
         </w:sdtPr>
-        <w:sdtContent>
-          <w:commentRangeStart w:id="2"/>
-        </w:sdtContent>
+        <w:sdtContent/>
       </w:sdt>
       <w:sdt>
         <w:sdtPr>
@@ -1003,16 +1141,6 @@
           </w:r>
         </w:sdtContent>
       </w:sdt>
-      <w:commentRangeEnd w:id="2"/>
-      <w:r>
-        <w:rPr>
-          <w:rStyle w:val="a8"/>
-          <w:rFonts w:ascii="Microsoft YaHei UI" w:eastAsia="Microsoft YaHei UI" w:hAnsi="Microsoft YaHei UI"/>
-          <w:sz w:val="24"/>
-          <w:szCs w:val="24"/>
-        </w:rPr>
-        <w:commentReference w:id="2"/>
-      </w:r>
       <w:sdt>
         <w:sdtPr>
           <w:rPr>
@@ -1027,7 +1155,71 @@
               <w:rFonts w:ascii="Microsoft YaHei UI" w:eastAsia="Microsoft YaHei UI" w:hAnsi="Microsoft YaHei UI" w:cs="Gungsuh"/>
               <w:color w:val="000000"/>
             </w:rPr>
-            <w:t>；倘因消費者刷卡支付失敗或其他等因素未收到之款項，乙方應對該消費者盡催收帳款之責，並於收達對應款項後依據約定比例分潤，將甲方應得金額於列於次月份營收報表中支付予甲方，惟若該帳款逾期六個月仍未收訖，視同甲方免除乙方追收帳款之責。</w:t>
+            <w:t>；倘因消費者刷卡支付失敗或其他等因素未收到之款項，乙方應對該</w:t>
+          </w:r>
+          <w:proofErr w:type="gramStart"/>
+          <w:r>
+            <w:rPr>
+              <w:rFonts w:ascii="Microsoft YaHei UI" w:eastAsia="Microsoft YaHei UI" w:hAnsi="Microsoft YaHei UI" w:cs="Gungsuh"/>
+              <w:color w:val="000000"/>
+            </w:rPr>
+            <w:t>消費者盡催收</w:t>
+          </w:r>
+          <w:proofErr w:type="gramEnd"/>
+          <w:r>
+            <w:rPr>
+              <w:rFonts w:ascii="Microsoft YaHei UI" w:eastAsia="Microsoft YaHei UI" w:hAnsi="Microsoft YaHei UI" w:cs="Gungsuh"/>
+              <w:color w:val="000000"/>
+            </w:rPr>
+            <w:t>帳款之責，並於收達對應款項後依據約定比例分潤，將甲方應得</w:t>
+          </w:r>
+          <w:proofErr w:type="gramStart"/>
+          <w:r>
+            <w:rPr>
+              <w:rFonts w:ascii="Microsoft YaHei UI" w:eastAsia="Microsoft YaHei UI" w:hAnsi="Microsoft YaHei UI" w:cs="Gungsuh"/>
+              <w:color w:val="000000"/>
+            </w:rPr>
+            <w:t>金額於列於</w:t>
+          </w:r>
+          <w:proofErr w:type="gramEnd"/>
+          <w:r>
+            <w:rPr>
+              <w:rFonts w:ascii="Microsoft YaHei UI" w:eastAsia="Microsoft YaHei UI" w:hAnsi="Microsoft YaHei UI" w:cs="Gungsuh"/>
+              <w:color w:val="000000"/>
+            </w:rPr>
+            <w:t>次月份營收報表中</w:t>
+          </w:r>
+          <w:proofErr w:type="gramStart"/>
+          <w:r>
+            <w:rPr>
+              <w:rFonts w:ascii="Microsoft YaHei UI" w:eastAsia="Microsoft YaHei UI" w:hAnsi="Microsoft YaHei UI" w:cs="Gungsuh"/>
+              <w:color w:val="000000"/>
+            </w:rPr>
+            <w:t>支付予甲方</w:t>
+          </w:r>
+          <w:proofErr w:type="gramEnd"/>
+          <w:r>
+            <w:rPr>
+              <w:rFonts w:ascii="Microsoft YaHei UI" w:eastAsia="Microsoft YaHei UI" w:hAnsi="Microsoft YaHei UI" w:cs="Gungsuh"/>
+              <w:color w:val="000000"/>
+            </w:rPr>
+            <w:t>，惟若該帳款逾期六個月仍未收訖，視同甲方免除</w:t>
+          </w:r>
+          <w:proofErr w:type="gramStart"/>
+          <w:r>
+            <w:rPr>
+              <w:rFonts w:ascii="Microsoft YaHei UI" w:eastAsia="Microsoft YaHei UI" w:hAnsi="Microsoft YaHei UI" w:cs="Gungsuh"/>
+              <w:color w:val="000000"/>
+            </w:rPr>
+            <w:t>乙方追收</w:t>
+          </w:r>
+          <w:proofErr w:type="gramEnd"/>
+          <w:r>
+            <w:rPr>
+              <w:rFonts w:ascii="Microsoft YaHei UI" w:eastAsia="Microsoft YaHei UI" w:hAnsi="Microsoft YaHei UI" w:cs="Gungsuh"/>
+              <w:color w:val="000000"/>
+            </w:rPr>
+            <w:t>帳款之責。</w:t>
           </w:r>
         </w:sdtContent>
       </w:sdt>
@@ -1066,7 +1258,47 @@
               <w:rFonts w:ascii="Microsoft YaHei UI" w:eastAsia="Microsoft YaHei UI" w:hAnsi="Microsoft YaHei UI" w:cs="Gungsuh"/>
               <w:color w:val="000000"/>
             </w:rPr>
-            <w:t>乙方應於每月十五（15）日（如遇假日則順延至下個工作日）前，將前月之停車場營收報表，以電子郵件方式提供予甲方。甲方如對該營收報表之金額有疑義時，應於收到營收報表後二（2）個工作天內，以書面向乙方提出詢問，乙方收到詢問後則應盡詳實說明義務。甲方若未於前述期間內提出詢問，則視為甲方承認乙方所提出之營收報表，而不得再就該報表之金額對乙方為任何主張。</w:t>
+            <w:t>乙方應於每月十五（15）日（如遇假日則順延至下個工作日）前，將前月之停車場營收報表，以電子郵件方式</w:t>
+          </w:r>
+          <w:proofErr w:type="gramStart"/>
+          <w:r>
+            <w:rPr>
+              <w:rFonts w:ascii="Microsoft YaHei UI" w:eastAsia="Microsoft YaHei UI" w:hAnsi="Microsoft YaHei UI" w:cs="Gungsuh"/>
+              <w:color w:val="000000"/>
+            </w:rPr>
+            <w:t>提供予甲方</w:t>
+          </w:r>
+          <w:proofErr w:type="gramEnd"/>
+          <w:r>
+            <w:rPr>
+              <w:rFonts w:ascii="Microsoft YaHei UI" w:eastAsia="Microsoft YaHei UI" w:hAnsi="Microsoft YaHei UI" w:cs="Gungsuh"/>
+              <w:color w:val="000000"/>
+            </w:rPr>
+            <w:t>。甲方如對該營收報表之金額有疑義時，應於收到營收報表後二（2）</w:t>
+          </w:r>
+          <w:proofErr w:type="gramStart"/>
+          <w:r>
+            <w:rPr>
+              <w:rFonts w:ascii="Microsoft YaHei UI" w:eastAsia="Microsoft YaHei UI" w:hAnsi="Microsoft YaHei UI" w:cs="Gungsuh"/>
+              <w:color w:val="000000"/>
+            </w:rPr>
+            <w:t>個</w:t>
+          </w:r>
+          <w:proofErr w:type="gramEnd"/>
+          <w:r>
+            <w:rPr>
+              <w:rFonts w:ascii="Microsoft YaHei UI" w:eastAsia="Microsoft YaHei UI" w:hAnsi="Microsoft YaHei UI" w:cs="Gungsuh"/>
+              <w:color w:val="000000"/>
+            </w:rPr>
+            <w:t>工作天內，以書面向乙方提出詢問，乙方收到詢問後則應盡詳實說明義務。甲方若未於前述期間內提出詢問，則視為甲方承認乙方所提出之營收報表，而不得再</w:t>
+          </w:r>
+          <w:r>
+            <w:rPr>
+              <w:rFonts w:ascii="Microsoft YaHei UI" w:eastAsia="Microsoft YaHei UI" w:hAnsi="Microsoft YaHei UI" w:cs="Gungsuh"/>
+              <w:color w:val="000000"/>
+            </w:rPr>
+            <w:lastRenderedPageBreak/>
+            <w:t>就該報表之金額對乙方為任何主張。</w:t>
           </w:r>
         </w:sdtContent>
       </w:sdt>
@@ -1105,15 +1337,23 @@
               <w:rFonts w:ascii="Microsoft YaHei UI" w:eastAsia="Microsoft YaHei UI" w:hAnsi="Microsoft YaHei UI" w:cs="Gungsuh"/>
               <w:color w:val="000000"/>
             </w:rPr>
-            <w:t>甲方若承認乙方所提出之營收報表，應以書面通知乙方，乙方收到甲方書面通知者，應於</w:t>
-          </w:r>
-          <w:r>
-            <w:rPr>
-              <w:rFonts w:ascii="Microsoft YaHei UI" w:eastAsia="Microsoft YaHei UI" w:hAnsi="Microsoft YaHei UI" w:cs="Gungsuh"/>
-              <w:color w:val="000000"/>
-            </w:rPr>
-            <w:lastRenderedPageBreak/>
-            <w:t>當月二十（20）日前（如遇假日則順延至下個工作日，下稱「付款日」）以匯款方式支付分潤款項至甲方指定之銀行帳戶，匯兌所需一切手續費用由乙方負擔。</w:t>
+            <w:t>甲方若承認乙方所提出之營收報表，應以書面通知乙方，乙方收到甲方書面通知者，應於當月二十（20）日前（如遇假日則順延至下個工作日，下稱「付款日」）以匯款方式支付分潤</w:t>
+          </w:r>
+          <w:proofErr w:type="gramStart"/>
+          <w:r>
+            <w:rPr>
+              <w:rFonts w:ascii="Microsoft YaHei UI" w:eastAsia="Microsoft YaHei UI" w:hAnsi="Microsoft YaHei UI" w:cs="Gungsuh"/>
+              <w:color w:val="000000"/>
+            </w:rPr>
+            <w:t>款項至甲方</w:t>
+          </w:r>
+          <w:proofErr w:type="gramEnd"/>
+          <w:r>
+            <w:rPr>
+              <w:rFonts w:ascii="Microsoft YaHei UI" w:eastAsia="Microsoft YaHei UI" w:hAnsi="Microsoft YaHei UI" w:cs="Gungsuh"/>
+              <w:color w:val="000000"/>
+            </w:rPr>
+            <w:t>指定之銀行帳戶，匯兌所需一切手續費用由乙方負擔。</w:t>
           </w:r>
         </w:sdtContent>
       </w:sdt>
@@ -1152,7 +1392,55 @@
               <w:rFonts w:ascii="Microsoft YaHei UI" w:eastAsia="Microsoft YaHei UI" w:hAnsi="Microsoft YaHei UI" w:cs="Gungsuh"/>
               <w:color w:val="000000"/>
             </w:rPr>
-            <w:t>甲方為法人者，若承認乙方所提出之營收報表，應即開立並寄送統一發票予乙方(乙方投遞地址：臺北市中山區八德路二段232號9樓)，若乙方於付款日前，仍未接獲甲方就前月分潤款項所開立之發票，乙方得不付當月及其後之分潤款項，至甲方補齊所有應開而未之發票為止。</w:t>
+            <w:t>甲方為法人者，若承認乙方所提出之營收報表，應即開立並寄送</w:t>
+          </w:r>
+          <w:proofErr w:type="gramStart"/>
+          <w:r>
+            <w:rPr>
+              <w:rFonts w:ascii="Microsoft YaHei UI" w:eastAsia="Microsoft YaHei UI" w:hAnsi="Microsoft YaHei UI" w:cs="Gungsuh"/>
+              <w:color w:val="000000"/>
+            </w:rPr>
+            <w:t>統一發票予乙方</w:t>
+          </w:r>
+          <w:proofErr w:type="gramEnd"/>
+          <w:r>
+            <w:rPr>
+              <w:rFonts w:ascii="Microsoft YaHei UI" w:eastAsia="Microsoft YaHei UI" w:hAnsi="Microsoft YaHei UI" w:cs="Gungsuh"/>
+              <w:color w:val="000000"/>
+            </w:rPr>
+            <w:t>(乙方投遞地址：臺北市中山區八德路二段232號9樓)，</w:t>
+          </w:r>
+          <w:proofErr w:type="gramStart"/>
+          <w:r>
+            <w:rPr>
+              <w:rFonts w:ascii="Microsoft YaHei UI" w:eastAsia="Microsoft YaHei UI" w:hAnsi="Microsoft YaHei UI" w:cs="Gungsuh"/>
+              <w:color w:val="000000"/>
+            </w:rPr>
+            <w:t>若乙方</w:t>
+          </w:r>
+          <w:proofErr w:type="gramEnd"/>
+          <w:r>
+            <w:rPr>
+              <w:rFonts w:ascii="Microsoft YaHei UI" w:eastAsia="Microsoft YaHei UI" w:hAnsi="Microsoft YaHei UI" w:cs="Gungsuh"/>
+              <w:color w:val="000000"/>
+            </w:rPr>
+            <w:t>於付款日前，仍未接獲甲方就前月分潤款項所開立之發票，乙方得不付當月及其後之分潤款項，</w:t>
+          </w:r>
+          <w:proofErr w:type="gramStart"/>
+          <w:r>
+            <w:rPr>
+              <w:rFonts w:ascii="Microsoft YaHei UI" w:eastAsia="Microsoft YaHei UI" w:hAnsi="Microsoft YaHei UI" w:cs="Gungsuh"/>
+              <w:color w:val="000000"/>
+            </w:rPr>
+            <w:t>至甲方</w:t>
+          </w:r>
+          <w:proofErr w:type="gramEnd"/>
+          <w:r>
+            <w:rPr>
+              <w:rFonts w:ascii="Microsoft YaHei UI" w:eastAsia="Microsoft YaHei UI" w:hAnsi="Microsoft YaHei UI" w:cs="Gungsuh"/>
+              <w:color w:val="000000"/>
+            </w:rPr>
+            <w:t>補齊所有應開而未之發票為止。</w:t>
           </w:r>
         </w:sdtContent>
       </w:sdt>
@@ -1191,7 +1479,39 @@
               <w:rFonts w:ascii="Microsoft YaHei UI" w:eastAsia="Microsoft YaHei UI" w:hAnsi="Microsoft YaHei UI" w:cs="Gungsuh"/>
               <w:color w:val="000000"/>
             </w:rPr>
-            <w:t>甲方就其因本契約所得之租金，同意乙方依所得稅法及各類所得扣繳率標準就所得列單申報主管稽徵機關。依甲方之身分，申報所得代號/類別如下（請勾選）：</w:t>
+            <w:t>甲方就其因本契約所得之租金，同意乙方依所得稅法及各類所得扣繳率標準就</w:t>
+          </w:r>
+          <w:proofErr w:type="gramStart"/>
+          <w:r>
+            <w:rPr>
+              <w:rFonts w:ascii="Microsoft YaHei UI" w:eastAsia="Microsoft YaHei UI" w:hAnsi="Microsoft YaHei UI" w:cs="Gungsuh"/>
+              <w:color w:val="000000"/>
+            </w:rPr>
+            <w:t>所得列單申報</w:t>
+          </w:r>
+          <w:proofErr w:type="gramEnd"/>
+          <w:r>
+            <w:rPr>
+              <w:rFonts w:ascii="Microsoft YaHei UI" w:eastAsia="Microsoft YaHei UI" w:hAnsi="Microsoft YaHei UI" w:cs="Gungsuh"/>
+              <w:color w:val="000000"/>
+            </w:rPr>
+            <w:t>主管</w:t>
+          </w:r>
+          <w:proofErr w:type="gramStart"/>
+          <w:r>
+            <w:rPr>
+              <w:rFonts w:ascii="Microsoft YaHei UI" w:eastAsia="Microsoft YaHei UI" w:hAnsi="Microsoft YaHei UI" w:cs="Gungsuh"/>
+              <w:color w:val="000000"/>
+            </w:rPr>
+            <w:t>稽</w:t>
+          </w:r>
+          <w:proofErr w:type="gramEnd"/>
+          <w:r>
+            <w:rPr>
+              <w:rFonts w:ascii="Microsoft YaHei UI" w:eastAsia="Microsoft YaHei UI" w:hAnsi="Microsoft YaHei UI" w:cs="Gungsuh"/>
+              <w:color w:val="000000"/>
+            </w:rPr>
+            <w:t>徵機關。依甲方之身分，申報所得代號/類別如下（請勾選）：</w:t>
           </w:r>
         </w:sdtContent>
       </w:sdt>
@@ -1642,12 +1962,37 @@
             </w:rPr>
             <w:t>銀行名稱（含分行）：</w:t>
           </w:r>
+          <w:proofErr w:type="gramStart"/>
           <w:r>
             <w:rPr>
               <w:rFonts w:asciiTheme="minorEastAsia" w:hAnsiTheme="minorEastAsia" w:cs="Gungsuh"/>
               <w:color w:val="000000"/>
             </w:rPr>
-            <w:t>{{ bank_name }}</w:t>
+            <w:t xml:space="preserve">{{ </w:t>
+          </w:r>
+          <w:proofErr w:type="spellStart"/>
+          <w:r>
+            <w:rPr>
+              <w:rFonts w:asciiTheme="minorEastAsia" w:hAnsiTheme="minorEastAsia" w:cs="Gungsuh"/>
+              <w:color w:val="000000"/>
+            </w:rPr>
+            <w:t>bank</w:t>
+          </w:r>
+          <w:proofErr w:type="gramEnd"/>
+          <w:r>
+            <w:rPr>
+              <w:rFonts w:asciiTheme="minorEastAsia" w:hAnsiTheme="minorEastAsia" w:cs="Gungsuh"/>
+              <w:color w:val="000000"/>
+            </w:rPr>
+            <w:t>_name</w:t>
+          </w:r>
+          <w:proofErr w:type="spellEnd"/>
+          <w:r>
+            <w:rPr>
+              <w:rFonts w:asciiTheme="minorEastAsia" w:hAnsiTheme="minorEastAsia" w:cs="Gungsuh"/>
+              <w:color w:val="000000"/>
+            </w:rPr>
+            <w:t xml:space="preserve"> }}</w:t>
           </w:r>
         </w:sdtContent>
       </w:sdt>
@@ -1685,12 +2030,37 @@
             </w:rPr>
             <w:t>帳戶名稱：</w:t>
           </w:r>
+          <w:proofErr w:type="gramStart"/>
           <w:r>
             <w:rPr>
               <w:rFonts w:asciiTheme="minorEastAsia" w:hAnsiTheme="minorEastAsia" w:cs="Gungsuh"/>
               <w:color w:val="000000"/>
             </w:rPr>
-            <w:t>{{ account_name }}</w:t>
+            <w:t xml:space="preserve">{{ </w:t>
+          </w:r>
+          <w:proofErr w:type="spellStart"/>
+          <w:r>
+            <w:rPr>
+              <w:rFonts w:asciiTheme="minorEastAsia" w:hAnsiTheme="minorEastAsia" w:cs="Gungsuh"/>
+              <w:color w:val="000000"/>
+            </w:rPr>
+            <w:t>account</w:t>
+          </w:r>
+          <w:proofErr w:type="gramEnd"/>
+          <w:r>
+            <w:rPr>
+              <w:rFonts w:asciiTheme="minorEastAsia" w:hAnsiTheme="minorEastAsia" w:cs="Gungsuh"/>
+              <w:color w:val="000000"/>
+            </w:rPr>
+            <w:t>_name</w:t>
+          </w:r>
+          <w:proofErr w:type="spellEnd"/>
+          <w:r>
+            <w:rPr>
+              <w:rFonts w:asciiTheme="minorEastAsia" w:hAnsiTheme="minorEastAsia" w:cs="Gungsuh"/>
+              <w:color w:val="000000"/>
+            </w:rPr>
+            <w:t xml:space="preserve"> }}</w:t>
           </w:r>
         </w:sdtContent>
       </w:sdt>
@@ -1728,12 +2098,37 @@
             </w:rPr>
             <w:t>帳戶號碼：</w:t>
           </w:r>
+          <w:proofErr w:type="gramStart"/>
           <w:r>
             <w:rPr>
               <w:rFonts w:asciiTheme="minorEastAsia" w:hAnsiTheme="minorEastAsia" w:cs="Gungsuh"/>
               <w:color w:val="000000"/>
             </w:rPr>
-            <w:t>{{ account_number }}</w:t>
+            <w:t xml:space="preserve">{{ </w:t>
+          </w:r>
+          <w:proofErr w:type="spellStart"/>
+          <w:r>
+            <w:rPr>
+              <w:rFonts w:asciiTheme="minorEastAsia" w:hAnsiTheme="minorEastAsia" w:cs="Gungsuh"/>
+              <w:color w:val="000000"/>
+            </w:rPr>
+            <w:t>account</w:t>
+          </w:r>
+          <w:proofErr w:type="gramEnd"/>
+          <w:r>
+            <w:rPr>
+              <w:rFonts w:asciiTheme="minorEastAsia" w:hAnsiTheme="minorEastAsia" w:cs="Gungsuh"/>
+              <w:color w:val="000000"/>
+            </w:rPr>
+            <w:t>_number</w:t>
+          </w:r>
+          <w:proofErr w:type="spellEnd"/>
+          <w:r>
+            <w:rPr>
+              <w:rFonts w:asciiTheme="minorEastAsia" w:hAnsiTheme="minorEastAsia" w:cs="Gungsuh"/>
+              <w:color w:val="000000"/>
+            </w:rPr>
+            <w:t xml:space="preserve"> }}</w:t>
           </w:r>
         </w:sdtContent>
       </w:sdt>
@@ -1772,14 +2167,46 @@
               <w:rFonts w:ascii="Microsoft YaHei UI" w:eastAsia="Microsoft YaHei UI" w:hAnsi="Microsoft YaHei UI" w:cs="Gungsuh"/>
               <w:color w:val="000000"/>
             </w:rPr>
-            <w:t>本契約期間內，依據實際營收狀況，若連續兩（2）個月，合作停車場每月每格營業額（營收總額除以總車位數）低於新台幣</w:t>
+            <w:t>本契約期間內，依據實際營收狀況，若連續兩（2）</w:t>
+          </w:r>
+          <w:proofErr w:type="gramStart"/>
+          <w:r>
+            <w:rPr>
+              <w:rFonts w:ascii="Microsoft YaHei UI" w:eastAsia="Microsoft YaHei UI" w:hAnsi="Microsoft YaHei UI" w:cs="Gungsuh"/>
+              <w:color w:val="000000"/>
+            </w:rPr>
+            <w:t>個</w:t>
+          </w:r>
+          <w:proofErr w:type="gramEnd"/>
+          <w:r>
+            <w:rPr>
+              <w:rFonts w:ascii="Microsoft YaHei UI" w:eastAsia="Microsoft YaHei UI" w:hAnsi="Microsoft YaHei UI" w:cs="Gungsuh"/>
+              <w:color w:val="000000"/>
+            </w:rPr>
+            <w:t>月，合作停車場每月每格營業額（營收總額除以總車位數）低於新台幣</w:t>
           </w:r>
           <w:r>
             <w:rPr>
               <w:rFonts w:asciiTheme="minorEastAsia" w:hAnsiTheme="minorEastAsia" w:cs="Gungsuh"/>
               <w:color w:val="000000"/>
             </w:rPr>
-            <w:t>{{ low_rev }}</w:t>
+            <w:t xml:space="preserve">{{ </w:t>
+          </w:r>
+          <w:proofErr w:type="spellStart"/>
+          <w:r>
+            <w:rPr>
+              <w:rFonts w:asciiTheme="minorEastAsia" w:hAnsiTheme="minorEastAsia" w:cs="Gungsuh"/>
+              <w:color w:val="000000"/>
+            </w:rPr>
+            <w:t>low_rev</w:t>
+          </w:r>
+          <w:proofErr w:type="spellEnd"/>
+          <w:r>
+            <w:rPr>
+              <w:rFonts w:asciiTheme="minorEastAsia" w:hAnsiTheme="minorEastAsia" w:cs="Gungsuh"/>
+              <w:color w:val="000000"/>
+            </w:rPr>
+            <w:t xml:space="preserve"> }}</w:t>
           </w:r>
           <w:r>
             <w:rPr>
@@ -1825,15 +2252,55 @@
               <w:rFonts w:ascii="Microsoft YaHei UI" w:eastAsia="Microsoft YaHei UI" w:hAnsi="Microsoft YaHei UI" w:cs="Gungsuh"/>
               <w:color w:val="000000"/>
             </w:rPr>
-            <w:t>押金（如有）：乙方應自本契約簽訂之日起五（5）日內，以匯款方式支付押金</w:t>
-          </w:r>
-          <w:r>
-            <w:rPr>
-              <w:rFonts w:ascii="Microsoft YaHei UI" w:eastAsia="Microsoft YaHei UI" w:hAnsi="Microsoft YaHei UI" w:cs="Gungsuh"/>
-              <w:color w:val="000000"/>
-            </w:rPr>
-            <w:lastRenderedPageBreak/>
-            <w:t>__________元至甲方指定之銀行帳戶，甲方得以此押金抵扣乙方因本契約所負而未履行之債務。除依本契約而得扣除之費用外，本契約期滿或終止時，甲方應於本契約到期日或終止日前將押金無息退還予乙方，不得藉故拖延或任意扣除。</w:t>
+            <w:t>押金（如有）：乙方應自本契約簽訂之日起五（5）日內，以匯款方式支付押金__________</w:t>
+          </w:r>
+          <w:proofErr w:type="gramStart"/>
+          <w:r>
+            <w:rPr>
+              <w:rFonts w:ascii="Microsoft YaHei UI" w:eastAsia="Microsoft YaHei UI" w:hAnsi="Microsoft YaHei UI" w:cs="Gungsuh"/>
+              <w:color w:val="000000"/>
+            </w:rPr>
+            <w:t>元至甲方</w:t>
+          </w:r>
+          <w:proofErr w:type="gramEnd"/>
+          <w:r>
+            <w:rPr>
+              <w:rFonts w:ascii="Microsoft YaHei UI" w:eastAsia="Microsoft YaHei UI" w:hAnsi="Microsoft YaHei UI" w:cs="Gungsuh"/>
+              <w:color w:val="000000"/>
+            </w:rPr>
+            <w:t>指定之銀行帳戶，甲方得以此押金</w:t>
+          </w:r>
+          <w:proofErr w:type="gramStart"/>
+          <w:r>
+            <w:rPr>
+              <w:rFonts w:ascii="Microsoft YaHei UI" w:eastAsia="Microsoft YaHei UI" w:hAnsi="Microsoft YaHei UI" w:cs="Gungsuh"/>
+              <w:color w:val="000000"/>
+            </w:rPr>
+            <w:t>抵扣乙方</w:t>
+          </w:r>
+          <w:proofErr w:type="gramEnd"/>
+          <w:r>
+            <w:rPr>
+              <w:rFonts w:ascii="Microsoft YaHei UI" w:eastAsia="Microsoft YaHei UI" w:hAnsi="Microsoft YaHei UI" w:cs="Gungsuh"/>
+              <w:color w:val="000000"/>
+            </w:rPr>
+            <w:t>因本契約所負而未履行之債務。除依本契約而得扣除之費用外，本契約期滿或終止時，甲方應於本契約到期日或終止日前將押金無息</w:t>
+          </w:r>
+          <w:proofErr w:type="gramStart"/>
+          <w:r>
+            <w:rPr>
+              <w:rFonts w:ascii="Microsoft YaHei UI" w:eastAsia="Microsoft YaHei UI" w:hAnsi="Microsoft YaHei UI" w:cs="Gungsuh"/>
+              <w:color w:val="000000"/>
+            </w:rPr>
+            <w:t>退還予乙方</w:t>
+          </w:r>
+          <w:proofErr w:type="gramEnd"/>
+          <w:r>
+            <w:rPr>
+              <w:rFonts w:ascii="Microsoft YaHei UI" w:eastAsia="Microsoft YaHei UI" w:hAnsi="Microsoft YaHei UI" w:cs="Gungsuh"/>
+              <w:color w:val="000000"/>
+            </w:rPr>
+            <w:t>，不得藉故拖延或任意扣除。</w:t>
           </w:r>
         </w:sdtContent>
       </w:sdt>
@@ -1872,7 +2339,23 @@
               <w:rFonts w:ascii="Microsoft YaHei UI" w:eastAsia="Microsoft YaHei UI" w:hAnsi="Microsoft YaHei UI" w:cs="Gungsuh"/>
               <w:color w:val="000000"/>
             </w:rPr>
-            <w:t>免租期（如有）：甲方同意，自____年___月___日至____年___月___日間（下稱「免租期」），乙方得派員進入合作標的物以設置、安裝停管設備及建置合作停車場，免租期內，乙方得免支付任何分潤款項予甲方。</w:t>
+            <w:t>免租期（如有）：甲方同意，自____年___月___日至____年___月___日間（下稱「免租期」），乙方得派員進入合作標的物以設置、安裝停管設備及建置合作停車場，免租期內，乙方得免支付任何分潤</w:t>
+          </w:r>
+          <w:proofErr w:type="gramStart"/>
+          <w:r>
+            <w:rPr>
+              <w:rFonts w:ascii="Microsoft YaHei UI" w:eastAsia="Microsoft YaHei UI" w:hAnsi="Microsoft YaHei UI" w:cs="Gungsuh"/>
+              <w:color w:val="000000"/>
+            </w:rPr>
+            <w:t>款項予甲方</w:t>
+          </w:r>
+          <w:proofErr w:type="gramEnd"/>
+          <w:r>
+            <w:rPr>
+              <w:rFonts w:ascii="Microsoft YaHei UI" w:eastAsia="Microsoft YaHei UI" w:hAnsi="Microsoft YaHei UI" w:cs="Gungsuh"/>
+              <w:color w:val="000000"/>
+            </w:rPr>
+            <w:t>。</w:t>
           </w:r>
         </w:sdtContent>
       </w:sdt>
@@ -1911,7 +2394,23 @@
               <w:rFonts w:ascii="Microsoft YaHei UI" w:eastAsia="Microsoft YaHei UI" w:hAnsi="Microsoft YaHei UI" w:cs="Gungsuh"/>
               <w:color w:val="000000"/>
             </w:rPr>
-            <w:t>除前項規定情形外，乙方如有延遲給付分潤款項達兩（2）個月以上，並經甲方以書面限期繳納後逾期仍未繳付時，甲方得終止本契約。</w:t>
+            <w:t>除前項規定情形外，乙方如有延遲給付分潤款項達兩（2）</w:t>
+          </w:r>
+          <w:proofErr w:type="gramStart"/>
+          <w:r>
+            <w:rPr>
+              <w:rFonts w:ascii="Microsoft YaHei UI" w:eastAsia="Microsoft YaHei UI" w:hAnsi="Microsoft YaHei UI" w:cs="Gungsuh"/>
+              <w:color w:val="000000"/>
+            </w:rPr>
+            <w:t>個</w:t>
+          </w:r>
+          <w:proofErr w:type="gramEnd"/>
+          <w:r>
+            <w:rPr>
+              <w:rFonts w:ascii="Microsoft YaHei UI" w:eastAsia="Microsoft YaHei UI" w:hAnsi="Microsoft YaHei UI" w:cs="Gungsuh"/>
+              <w:color w:val="000000"/>
+            </w:rPr>
+            <w:t>月以上，並經甲方以書面限期繳納後逾期仍未繳付時，甲方得終止本契約。</w:t>
           </w:r>
         </w:sdtContent>
       </w:sdt>
@@ -2008,7 +2507,23 @@
               <w:rFonts w:ascii="Microsoft YaHei UI" w:eastAsia="Microsoft YaHei UI" w:hAnsi="Microsoft YaHei UI" w:cs="Gungsuh"/>
               <w:color w:val="000000"/>
             </w:rPr>
-            <w:t>合作標的物之地價稅、房屋稅、公共安全及消防申報費用應由甲方負擔、其公共安全、消防設備申報頻率均需遵照中華民國停車場相關法規辦理。</w:t>
+            <w:t>合作標的物之地價稅、房屋稅、公共安全及消防申報費用應由甲方負擔、其公共安全、消防設備申報</w:t>
+          </w:r>
+          <w:proofErr w:type="gramStart"/>
+          <w:r>
+            <w:rPr>
+              <w:rFonts w:ascii="Microsoft YaHei UI" w:eastAsia="Microsoft YaHei UI" w:hAnsi="Microsoft YaHei UI" w:cs="Gungsuh"/>
+              <w:color w:val="000000"/>
+            </w:rPr>
+            <w:t>頻率均需遵照</w:t>
+          </w:r>
+          <w:proofErr w:type="gramEnd"/>
+          <w:r>
+            <w:rPr>
+              <w:rFonts w:ascii="Microsoft YaHei UI" w:eastAsia="Microsoft YaHei UI" w:hAnsi="Microsoft YaHei UI" w:cs="Gungsuh"/>
+              <w:color w:val="000000"/>
+            </w:rPr>
+            <w:t>中華民國停車場相關法規辦理。</w:t>
           </w:r>
         </w:sdtContent>
       </w:sdt>
@@ -2047,7 +2562,23 @@
               <w:rFonts w:ascii="Microsoft YaHei UI" w:eastAsia="Microsoft YaHei UI" w:hAnsi="Microsoft YaHei UI" w:cs="Gungsuh"/>
               <w:color w:val="000000"/>
             </w:rPr>
-            <w:t>合作標的物之管理費應由甲方/乙方負擔，管理費金額以每格車位______元計算，每月共計______ 元（如不收取管理費，請填零）。</w:t>
+            <w:t>合作標的物之管理費應由甲方/乙方負擔，管理費金額以</w:t>
+          </w:r>
+          <w:proofErr w:type="gramStart"/>
+          <w:r>
+            <w:rPr>
+              <w:rFonts w:ascii="Microsoft YaHei UI" w:eastAsia="Microsoft YaHei UI" w:hAnsi="Microsoft YaHei UI" w:cs="Gungsuh"/>
+              <w:color w:val="000000"/>
+            </w:rPr>
+            <w:t>每格車位</w:t>
+          </w:r>
+          <w:proofErr w:type="gramEnd"/>
+          <w:r>
+            <w:rPr>
+              <w:rFonts w:ascii="Microsoft YaHei UI" w:eastAsia="Microsoft YaHei UI" w:hAnsi="Microsoft YaHei UI" w:cs="Gungsuh"/>
+              <w:color w:val="000000"/>
+            </w:rPr>
+            <w:t>______元計算，每月共計______ 元（如不收取管理費，請填零）。</w:t>
           </w:r>
         </w:sdtContent>
       </w:sdt>
@@ -2086,17 +2617,73 @@
               <w:rFonts w:ascii="Microsoft YaHei UI" w:eastAsia="Microsoft YaHei UI" w:hAnsi="Microsoft YaHei UI" w:cs="Gungsuh"/>
               <w:color w:val="000000"/>
             </w:rPr>
-            <w:t>因經營合作停車場而生之人事費、電話費、停車場保險費、停車場登記證申請費、設備定期安檢費、停管系統保養維修費、電費（包含但不限於停管設備用電、監視器用電、夜間LED照明用電）及因乙方營運所生一切必要費用，概由乙方負擔。若甲方遲繳電費且經乙方通知於一定期間內繳納，逾期仍不繳納時，乙方得代甲方繳納電費並自次期應給付甲方之分潤款項中逕行扣除該電費。</w:t>
-          </w:r>
-        </w:sdtContent>
-      </w:sdt>
-    </w:p>
-    <w:p>
-      <w:pPr>
-        <w:spacing w:line="420" w:lineRule="auto"/>
-        <w:jc w:val="both"/>
-        <w:rPr>
-          <w:rFonts w:ascii="Microsoft YaHei UI" w:hAnsi="Microsoft YaHei UI" w:cs="Times New Roman" w:hint="eastAsia"/>
+            <w:t>因經營合作停車場而生之人事費、電話費、停車場保險費、停車場登記證申請費、設備定期安檢費、停管系統保養維修費、電費（包含但不限於停管設備用電、監視器用電、夜間LED照明用電）及因乙方營運所生一切必要費用，概由乙方負擔。</w:t>
+          </w:r>
+          <w:proofErr w:type="gramStart"/>
+          <w:r>
+            <w:rPr>
+              <w:rFonts w:ascii="Microsoft YaHei UI" w:eastAsia="Microsoft YaHei UI" w:hAnsi="Microsoft YaHei UI" w:cs="Gungsuh"/>
+              <w:color w:val="000000"/>
+            </w:rPr>
+            <w:t>若甲方遲</w:t>
+          </w:r>
+          <w:proofErr w:type="gramEnd"/>
+          <w:r>
+            <w:rPr>
+              <w:rFonts w:ascii="Microsoft YaHei UI" w:eastAsia="Microsoft YaHei UI" w:hAnsi="Microsoft YaHei UI" w:cs="Gungsuh"/>
+              <w:color w:val="000000"/>
+            </w:rPr>
+            <w:t>繳電費</w:t>
+          </w:r>
+          <w:proofErr w:type="gramStart"/>
+          <w:r>
+            <w:rPr>
+              <w:rFonts w:ascii="Microsoft YaHei UI" w:eastAsia="Microsoft YaHei UI" w:hAnsi="Microsoft YaHei UI" w:cs="Gungsuh"/>
+              <w:color w:val="000000"/>
+            </w:rPr>
+            <w:t>且經乙</w:t>
+          </w:r>
+          <w:r>
+            <w:rPr>
+              <w:rFonts w:ascii="Microsoft YaHei UI" w:eastAsia="Microsoft YaHei UI" w:hAnsi="Microsoft YaHei UI" w:cs="Gungsuh"/>
+              <w:color w:val="000000"/>
+            </w:rPr>
+            <w:lastRenderedPageBreak/>
+            <w:t>方</w:t>
+          </w:r>
+          <w:proofErr w:type="gramEnd"/>
+          <w:r>
+            <w:rPr>
+              <w:rFonts w:ascii="Microsoft YaHei UI" w:eastAsia="Microsoft YaHei UI" w:hAnsi="Microsoft YaHei UI" w:cs="Gungsuh"/>
+              <w:color w:val="000000"/>
+            </w:rPr>
+            <w:t>通知於一定期間內繳納，逾期仍不繳納時，乙方</w:t>
+          </w:r>
+          <w:proofErr w:type="gramStart"/>
+          <w:r>
+            <w:rPr>
+              <w:rFonts w:ascii="Microsoft YaHei UI" w:eastAsia="Microsoft YaHei UI" w:hAnsi="Microsoft YaHei UI" w:cs="Gungsuh"/>
+              <w:color w:val="000000"/>
+            </w:rPr>
+            <w:t>得代甲方</w:t>
+          </w:r>
+          <w:proofErr w:type="gramEnd"/>
+          <w:r>
+            <w:rPr>
+              <w:rFonts w:ascii="Microsoft YaHei UI" w:eastAsia="Microsoft YaHei UI" w:hAnsi="Microsoft YaHei UI" w:cs="Gungsuh"/>
+              <w:color w:val="000000"/>
+            </w:rPr>
+            <w:t>繳納電費並自次期應給付甲方之分潤款項中逕行扣除該電費。</w:t>
+          </w:r>
+        </w:sdtContent>
+      </w:sdt>
+    </w:p>
+    <w:p>
+      <w:pPr>
+        <w:spacing w:line="420" w:lineRule="auto"/>
+        <w:jc w:val="both"/>
+        <w:rPr>
+          <w:rFonts w:ascii="Microsoft YaHei UI" w:hAnsi="Microsoft YaHei UI" w:cs="Times New Roman"/>
           <w:color w:val="000000"/>
         </w:rPr>
       </w:pPr>
@@ -2511,15 +3098,23 @@
               <w:rFonts w:ascii="Microsoft YaHei UI" w:eastAsia="Microsoft YaHei UI" w:hAnsi="Microsoft YaHei UI" w:cs="Gungsuh"/>
               <w:color w:val="000000"/>
             </w:rPr>
-            <w:t>甲方若提前終止契約，應於終止日至少三十（30）日前以書面通知乙方，並支付懲罰性違</w:t>
-          </w:r>
-          <w:r>
-            <w:rPr>
-              <w:rFonts w:ascii="Microsoft YaHei UI" w:eastAsia="Microsoft YaHei UI" w:hAnsi="Microsoft YaHei UI" w:cs="Gungsuh"/>
-              <w:color w:val="000000"/>
-            </w:rPr>
-            <w:lastRenderedPageBreak/>
-            <w:t>約金予乙方。違約金金額依契約剩餘月份數乘以                   元計算（如有），以補償乙方建置合作停車場所支出的成本。</w:t>
+            <w:t>甲方若提前終止契約，應於終止日至少三十（30）日前以書面通知乙方，並支付懲罰性</w:t>
+          </w:r>
+          <w:proofErr w:type="gramStart"/>
+          <w:r>
+            <w:rPr>
+              <w:rFonts w:ascii="Microsoft YaHei UI" w:eastAsia="Microsoft YaHei UI" w:hAnsi="Microsoft YaHei UI" w:cs="Gungsuh"/>
+              <w:color w:val="000000"/>
+            </w:rPr>
+            <w:t>違約金予乙方</w:t>
+          </w:r>
+          <w:proofErr w:type="gramEnd"/>
+          <w:r>
+            <w:rPr>
+              <w:rFonts w:ascii="Microsoft YaHei UI" w:eastAsia="Microsoft YaHei UI" w:hAnsi="Microsoft YaHei UI" w:cs="Gungsuh"/>
+              <w:color w:val="000000"/>
+            </w:rPr>
+            <w:t>。違約金金額依契約剩餘月份數乘以                   元計算（如有），以補償乙方建置合作停車場所支出的成本。</w:t>
           </w:r>
         </w:sdtContent>
       </w:sdt>
@@ -2616,7 +3211,23 @@
               <w:rFonts w:asciiTheme="minorEastAsia" w:hAnsiTheme="minorEastAsia" w:cs="Gungsuh"/>
               <w:color w:val="000000"/>
             </w:rPr>
-            <w:t>{{ start_date }}</w:t>
+            <w:t xml:space="preserve">{{ </w:t>
+          </w:r>
+          <w:proofErr w:type="spellStart"/>
+          <w:r>
+            <w:rPr>
+              <w:rFonts w:asciiTheme="minorEastAsia" w:hAnsiTheme="minorEastAsia" w:cs="Gungsuh"/>
+              <w:color w:val="000000"/>
+            </w:rPr>
+            <w:t>start_date</w:t>
+          </w:r>
+          <w:proofErr w:type="spellEnd"/>
+          <w:r>
+            <w:rPr>
+              <w:rFonts w:asciiTheme="minorEastAsia" w:hAnsiTheme="minorEastAsia" w:cs="Gungsuh"/>
+              <w:color w:val="000000"/>
+            </w:rPr>
+            <w:t xml:space="preserve"> }}</w:t>
           </w:r>
           <w:r>
             <w:rPr>
@@ -2630,14 +3241,62 @@
               <w:rFonts w:asciiTheme="minorEastAsia" w:hAnsiTheme="minorEastAsia" w:cs="Gungsuh"/>
               <w:color w:val="000000"/>
             </w:rPr>
-            <w:t>{{ end_date }}（</w:t>
-          </w:r>
-          <w:r>
-            <w:rPr>
-              <w:rFonts w:ascii="Microsoft YaHei UI" w:eastAsia="Microsoft YaHei UI" w:hAnsi="Microsoft YaHei UI" w:cs="Gungsuh"/>
-              <w:color w:val="000000"/>
-            </w:rPr>
-            <w:t>（下稱「到期日」）止。</w:t>
+            <w:t xml:space="preserve">{{ </w:t>
+          </w:r>
+          <w:proofErr w:type="spellStart"/>
+          <w:r>
+            <w:rPr>
+              <w:rFonts w:asciiTheme="minorEastAsia" w:hAnsiTheme="minorEastAsia" w:cs="Gungsuh"/>
+              <w:color w:val="000000"/>
+            </w:rPr>
+            <w:t>end_date</w:t>
+          </w:r>
+          <w:proofErr w:type="spellEnd"/>
+          <w:r>
+            <w:rPr>
+              <w:rFonts w:asciiTheme="minorEastAsia" w:hAnsiTheme="minorEastAsia" w:cs="Gungsuh"/>
+              <w:color w:val="000000"/>
+            </w:rPr>
+            <w:t xml:space="preserve"> }}</w:t>
+          </w:r>
+          <w:proofErr w:type="gramStart"/>
+          <w:r>
+            <w:rPr>
+              <w:rFonts w:asciiTheme="minorEastAsia" w:hAnsiTheme="minorEastAsia" w:cs="Gungsuh"/>
+              <w:color w:val="000000"/>
+            </w:rPr>
+            <w:t>（</w:t>
+          </w:r>
+          <w:r>
+            <w:rPr>
+              <w:rFonts w:ascii="Microsoft YaHei UI" w:eastAsia="Microsoft YaHei UI" w:hAnsi="Microsoft YaHei UI" w:cs="Gungsuh"/>
+              <w:color w:val="000000"/>
+            </w:rPr>
+            <w:t>（</w:t>
+          </w:r>
+          <w:proofErr w:type="gramEnd"/>
+          <w:r>
+            <w:rPr>
+              <w:rFonts w:ascii="Microsoft YaHei UI" w:eastAsia="Microsoft YaHei UI" w:hAnsi="Microsoft YaHei UI" w:cs="Gungsuh"/>
+              <w:color w:val="000000"/>
+            </w:rPr>
+            <w:t>下稱「到期日」</w:t>
+          </w:r>
+          <w:proofErr w:type="gramStart"/>
+          <w:r>
+            <w:rPr>
+              <w:rFonts w:ascii="Microsoft YaHei UI" w:eastAsia="Microsoft YaHei UI" w:hAnsi="Microsoft YaHei UI" w:cs="Gungsuh"/>
+              <w:color w:val="000000"/>
+            </w:rPr>
+            <w:t>）</w:t>
+          </w:r>
+          <w:proofErr w:type="gramEnd"/>
+          <w:r>
+            <w:rPr>
+              <w:rFonts w:ascii="Microsoft YaHei UI" w:eastAsia="Microsoft YaHei UI" w:hAnsi="Microsoft YaHei UI" w:cs="Gungsuh"/>
+              <w:color w:val="000000"/>
+            </w:rPr>
+            <w:t>止。</w:t>
           </w:r>
         </w:sdtContent>
       </w:sdt>
@@ -2666,7 +3325,77 @@
         <w:rPr>
           <w:rFonts w:ascii="Microsoft YaHei UI" w:eastAsia="Microsoft YaHei UI" w:hAnsi="Microsoft YaHei UI" w:cs="微軟正黑體"/>
         </w:rPr>
-        <w:t>本契約期限屆滿時，除任一方於屆滿日前至少一（1）個月前以書面向他方為不續約之通知外，本契約自動展延一（1）年；其後每次展延期限屆滿時，均依相同條件自動順延一年，不限次數。</w:t>
+        <w:t>本契約期限屆滿時，除任一方於屆滿日前至少</w:t>
+      </w:r>
+      <w:proofErr w:type="gramStart"/>
+      <w:r>
+        <w:rPr>
+          <w:rFonts w:ascii="Microsoft YaHei UI" w:eastAsia="Microsoft YaHei UI" w:hAnsi="Microsoft YaHei UI" w:cs="微軟正黑體"/>
+        </w:rPr>
+        <w:t>一</w:t>
+      </w:r>
+      <w:proofErr w:type="gramEnd"/>
+      <w:r>
+        <w:rPr>
+          <w:rFonts w:ascii="Microsoft YaHei UI" w:eastAsia="Microsoft YaHei UI" w:hAnsi="Microsoft YaHei UI" w:cs="微軟正黑體"/>
+        </w:rPr>
+        <w:t>（1）</w:t>
+      </w:r>
+      <w:proofErr w:type="gramStart"/>
+      <w:r>
+        <w:rPr>
+          <w:rFonts w:ascii="Microsoft YaHei UI" w:eastAsia="Microsoft YaHei UI" w:hAnsi="Microsoft YaHei UI" w:cs="微軟正黑體"/>
+        </w:rPr>
+        <w:t>個</w:t>
+      </w:r>
+      <w:proofErr w:type="gramEnd"/>
+      <w:r>
+        <w:rPr>
+          <w:rFonts w:ascii="Microsoft YaHei UI" w:eastAsia="Microsoft YaHei UI" w:hAnsi="Microsoft YaHei UI" w:cs="微軟正黑體"/>
+        </w:rPr>
+        <w:t>月前以書面向他方為</w:t>
+      </w:r>
+      <w:proofErr w:type="gramStart"/>
+      <w:r>
+        <w:rPr>
+          <w:rFonts w:ascii="Microsoft YaHei UI" w:eastAsia="Microsoft YaHei UI" w:hAnsi="Microsoft YaHei UI" w:cs="微軟正黑體"/>
+        </w:rPr>
+        <w:t>不</w:t>
+      </w:r>
+      <w:proofErr w:type="gramEnd"/>
+      <w:r>
+        <w:rPr>
+          <w:rFonts w:ascii="Microsoft YaHei UI" w:eastAsia="Microsoft YaHei UI" w:hAnsi="Microsoft YaHei UI" w:cs="微軟正黑體"/>
+        </w:rPr>
+        <w:t>續約之通知外，本契約自動展延</w:t>
+      </w:r>
+      <w:proofErr w:type="gramStart"/>
+      <w:r>
+        <w:rPr>
+          <w:rFonts w:ascii="Microsoft YaHei UI" w:eastAsia="Microsoft YaHei UI" w:hAnsi="Microsoft YaHei UI" w:cs="微軟正黑體"/>
+        </w:rPr>
+        <w:t>一</w:t>
+      </w:r>
+      <w:proofErr w:type="gramEnd"/>
+      <w:r>
+        <w:rPr>
+          <w:rFonts w:ascii="Microsoft YaHei UI" w:eastAsia="Microsoft YaHei UI" w:hAnsi="Microsoft YaHei UI" w:cs="微軟正黑體"/>
+        </w:rPr>
+        <w:t>（1）年；其後每次展延期限屆滿時，</w:t>
+      </w:r>
+      <w:proofErr w:type="gramStart"/>
+      <w:r>
+        <w:rPr>
+          <w:rFonts w:ascii="Microsoft YaHei UI" w:eastAsia="Microsoft YaHei UI" w:hAnsi="Microsoft YaHei UI" w:cs="微軟正黑體"/>
+        </w:rPr>
+        <w:t>均依相同</w:t>
+      </w:r>
+      <w:proofErr w:type="gramEnd"/>
+      <w:r>
+        <w:rPr>
+          <w:rFonts w:ascii="Microsoft YaHei UI" w:eastAsia="Microsoft YaHei UI" w:hAnsi="Microsoft YaHei UI" w:cs="微軟正黑體"/>
+        </w:rPr>
+        <w:t>條件自動順延一年，不限次數。</w:t>
       </w:r>
     </w:p>
     <w:p>
@@ -2753,7 +3482,23 @@
               <w:rFonts w:ascii="Microsoft YaHei UI" w:eastAsia="Microsoft YaHei UI" w:hAnsi="Microsoft YaHei UI" w:cs="Gungsuh"/>
               <w:color w:val="000000"/>
             </w:rPr>
-            <w:t>本契約期間屆滿或終止時，乙方應於到期日或終止日後十五（15）日內，拆除並撤離合作標的物上所有停管設備，並將合作標的物以完整且可使用之狀況交還予甲方。</w:t>
+            <w:t>本契約期間屆滿或終止時，乙方應於到期日或終止日後十五（15）日內，拆除並撤離合作標的物上所有停管設備，並將合作標的物以完整且可使用之狀況</w:t>
+          </w:r>
+          <w:proofErr w:type="gramStart"/>
+          <w:r>
+            <w:rPr>
+              <w:rFonts w:ascii="Microsoft YaHei UI" w:eastAsia="Microsoft YaHei UI" w:hAnsi="Microsoft YaHei UI" w:cs="Gungsuh"/>
+              <w:color w:val="000000"/>
+            </w:rPr>
+            <w:t>交還予甲方</w:t>
+          </w:r>
+          <w:proofErr w:type="gramEnd"/>
+          <w:r>
+            <w:rPr>
+              <w:rFonts w:ascii="Microsoft YaHei UI" w:eastAsia="Microsoft YaHei UI" w:hAnsi="Microsoft YaHei UI" w:cs="Gungsuh"/>
+              <w:color w:val="000000"/>
+            </w:rPr>
+            <w:t>。</w:t>
           </w:r>
         </w:sdtContent>
       </w:sdt>
@@ -2871,7 +3616,47 @@
               <w:rFonts w:ascii="Microsoft YaHei UI" w:eastAsia="Microsoft YaHei UI" w:hAnsi="Microsoft YaHei UI" w:cs="Gungsuh"/>
               <w:color w:val="000000"/>
             </w:rPr>
-            <w:t>本契約之解釋、效力、履行及其他未盡事宜，悉以中華民國法律為準。如因本契約涉訟，雙方合意以臺灣臺北地方法院為第一審專屬管轄法院。</w:t>
+            <w:t>本契約之解釋、效力、履行及其他未盡事宜，悉以中華民國法律為</w:t>
+          </w:r>
+          <w:proofErr w:type="gramStart"/>
+          <w:r>
+            <w:rPr>
+              <w:rFonts w:ascii="Microsoft YaHei UI" w:eastAsia="Microsoft YaHei UI" w:hAnsi="Microsoft YaHei UI" w:cs="Gungsuh"/>
+              <w:color w:val="000000"/>
+            </w:rPr>
+            <w:t>準</w:t>
+          </w:r>
+          <w:proofErr w:type="gramEnd"/>
+          <w:r>
+            <w:rPr>
+              <w:rFonts w:ascii="Microsoft YaHei UI" w:eastAsia="Microsoft YaHei UI" w:hAnsi="Microsoft YaHei UI" w:cs="Gungsuh"/>
+              <w:color w:val="000000"/>
+            </w:rPr>
+            <w:t>。如因本契約涉訟，</w:t>
+          </w:r>
+          <w:r>
+            <w:rPr>
+              <w:rFonts w:ascii="Microsoft YaHei UI" w:eastAsia="Microsoft YaHei UI" w:hAnsi="Microsoft YaHei UI" w:cs="Gungsuh"/>
+              <w:color w:val="000000"/>
+            </w:rPr>
+            <w:lastRenderedPageBreak/>
+            <w:t>雙方合意以臺灣</w:t>
+          </w:r>
+          <w:proofErr w:type="gramStart"/>
+          <w:r>
+            <w:rPr>
+              <w:rFonts w:ascii="Microsoft YaHei UI" w:eastAsia="Microsoft YaHei UI" w:hAnsi="Microsoft YaHei UI" w:cs="Gungsuh"/>
+              <w:color w:val="000000"/>
+            </w:rPr>
+            <w:t>臺</w:t>
+          </w:r>
+          <w:proofErr w:type="gramEnd"/>
+          <w:r>
+            <w:rPr>
+              <w:rFonts w:ascii="Microsoft YaHei UI" w:eastAsia="Microsoft YaHei UI" w:hAnsi="Microsoft YaHei UI" w:cs="Gungsuh"/>
+              <w:color w:val="000000"/>
+            </w:rPr>
+            <w:t>北地方法院為第一審專屬管轄法院。</w:t>
           </w:r>
         </w:sdtContent>
       </w:sdt>
@@ -2950,15 +3735,23 @@
               <w:rFonts w:ascii="Microsoft YaHei UI" w:eastAsia="Microsoft YaHei UI" w:hAnsi="Microsoft YaHei UI" w:cs="Gungsuh"/>
               <w:color w:val="000000"/>
             </w:rPr>
-            <w:t>甲方同意，如乙方與乙方關係企業（按台灣公司法定義）辦理分割或合併時，乙方於本契</w:t>
-          </w:r>
-          <w:r>
-            <w:rPr>
-              <w:rFonts w:ascii="Microsoft YaHei UI" w:eastAsia="Microsoft YaHei UI" w:hAnsi="Microsoft YaHei UI" w:cs="Gungsuh"/>
-              <w:color w:val="000000"/>
-            </w:rPr>
-            <w:lastRenderedPageBreak/>
-            <w:t>約之一切權利義務於分割基準日或合併基準日起，轉讓予乙方分割後受讓營業之既存或新設公司，或合併後之存續公司或新設公司。</w:t>
+            <w:t>甲方同意，如乙方與乙方關係企業（按台灣公司法定義）辦理分割或合併時，乙方於本契約之一切權利義務於分割基準日或合併基準日起，</w:t>
+          </w:r>
+          <w:proofErr w:type="gramStart"/>
+          <w:r>
+            <w:rPr>
+              <w:rFonts w:ascii="Microsoft YaHei UI" w:eastAsia="Microsoft YaHei UI" w:hAnsi="Microsoft YaHei UI" w:cs="Gungsuh"/>
+              <w:color w:val="000000"/>
+            </w:rPr>
+            <w:t>轉讓予乙方</w:t>
+          </w:r>
+          <w:proofErr w:type="gramEnd"/>
+          <w:r>
+            <w:rPr>
+              <w:rFonts w:ascii="Microsoft YaHei UI" w:eastAsia="Microsoft YaHei UI" w:hAnsi="Microsoft YaHei UI" w:cs="Gungsuh"/>
+              <w:color w:val="000000"/>
+            </w:rPr>
+            <w:t>分割後受讓營業之既存或新設公司，或合併後之存續公司或新設公司。</w:t>
           </w:r>
         </w:sdtContent>
       </w:sdt>
@@ -3048,7 +3841,39 @@
               <w:rFonts w:ascii="Microsoft YaHei UI" w:eastAsia="Microsoft YaHei UI" w:hAnsi="Microsoft YaHei UI" w:cs="Gungsuh"/>
               <w:color w:val="000000"/>
             </w:rPr>
-            <w:t>甲乙雙方通訊地址及電子郵件地址均以本契約所載者為準，如有變更者，應以書面通知他方。</w:t>
+            <w:t>甲乙雙方通訊地址及電子郵件</w:t>
+          </w:r>
+          <w:proofErr w:type="gramStart"/>
+          <w:r>
+            <w:rPr>
+              <w:rFonts w:ascii="Microsoft YaHei UI" w:eastAsia="Microsoft YaHei UI" w:hAnsi="Microsoft YaHei UI" w:cs="Gungsuh"/>
+              <w:color w:val="000000"/>
+            </w:rPr>
+            <w:t>地址均以本</w:t>
+          </w:r>
+          <w:proofErr w:type="gramEnd"/>
+          <w:r>
+            <w:rPr>
+              <w:rFonts w:ascii="Microsoft YaHei UI" w:eastAsia="Microsoft YaHei UI" w:hAnsi="Microsoft YaHei UI" w:cs="Gungsuh"/>
+              <w:color w:val="000000"/>
+            </w:rPr>
+            <w:t>契約所</w:t>
+          </w:r>
+          <w:proofErr w:type="gramStart"/>
+          <w:r>
+            <w:rPr>
+              <w:rFonts w:ascii="Microsoft YaHei UI" w:eastAsia="Microsoft YaHei UI" w:hAnsi="Microsoft YaHei UI" w:cs="Gungsuh"/>
+              <w:color w:val="000000"/>
+            </w:rPr>
+            <w:t>載者為準</w:t>
+          </w:r>
+          <w:proofErr w:type="gramEnd"/>
+          <w:r>
+            <w:rPr>
+              <w:rFonts w:ascii="Microsoft YaHei UI" w:eastAsia="Microsoft YaHei UI" w:hAnsi="Microsoft YaHei UI" w:cs="Gungsuh"/>
+              <w:color w:val="000000"/>
+            </w:rPr>
+            <w:t>，如有變更者，應以書面通知他方。</w:t>
           </w:r>
         </w:sdtContent>
       </w:sdt>
@@ -3087,7 +3912,87 @@
               <w:rFonts w:ascii="Microsoft YaHei UI" w:eastAsia="Microsoft YaHei UI" w:hAnsi="Microsoft YaHei UI" w:cs="SimSun"/>
               <w:color w:val="000000"/>
             </w:rPr>
-            <w:t>雙方之郵件通知倘因遷址、拒收、招領逾期或其他郵局批註之理由而送達不到者，均以郵局第一次投遞日期為送達日期（乙方指定之投遞地址：臺北市中山區八德路二段232號9樓）。無論收送達之ㄧ方是否確實收受（包括拒收），均生送達之效力。</w:t>
+            <w:t>雙方之郵件通知倘因遷址、拒收、招領逾期或其他郵局批註之理由而送達不到者，</w:t>
+          </w:r>
+          <w:proofErr w:type="gramStart"/>
+          <w:r>
+            <w:rPr>
+              <w:rFonts w:ascii="Microsoft YaHei UI" w:eastAsia="Microsoft YaHei UI" w:hAnsi="Microsoft YaHei UI" w:cs="SimSun"/>
+              <w:color w:val="000000"/>
+            </w:rPr>
+            <w:t>均以郵局</w:t>
+          </w:r>
+          <w:proofErr w:type="gramEnd"/>
+          <w:r>
+            <w:rPr>
+              <w:rFonts w:ascii="Microsoft YaHei UI" w:eastAsia="Microsoft YaHei UI" w:hAnsi="Microsoft YaHei UI" w:cs="SimSun"/>
+              <w:color w:val="000000"/>
+            </w:rPr>
+            <w:t>第一次投遞日期為送達日期</w:t>
+          </w:r>
+          <w:proofErr w:type="gramStart"/>
+          <w:r>
+            <w:rPr>
+              <w:rFonts w:ascii="Microsoft YaHei UI" w:eastAsia="Microsoft YaHei UI" w:hAnsi="Microsoft YaHei UI" w:cs="SimSun"/>
+              <w:color w:val="000000"/>
+            </w:rPr>
+            <w:t>（</w:t>
+          </w:r>
+          <w:proofErr w:type="gramEnd"/>
+          <w:r>
+            <w:rPr>
+              <w:rFonts w:ascii="Microsoft YaHei UI" w:eastAsia="Microsoft YaHei UI" w:hAnsi="Microsoft YaHei UI" w:cs="SimSun"/>
+              <w:color w:val="000000"/>
+            </w:rPr>
+            <w:t>乙方指定之投遞地址：臺北市中山區八德路二段232號9樓</w:t>
+          </w:r>
+          <w:proofErr w:type="gramStart"/>
+          <w:r>
+            <w:rPr>
+              <w:rFonts w:ascii="Microsoft YaHei UI" w:eastAsia="Microsoft YaHei UI" w:hAnsi="Microsoft YaHei UI" w:cs="SimSun"/>
+              <w:color w:val="000000"/>
+            </w:rPr>
+            <w:t>）</w:t>
+          </w:r>
+          <w:proofErr w:type="gramEnd"/>
+          <w:r>
+            <w:rPr>
+              <w:rFonts w:ascii="Microsoft YaHei UI" w:eastAsia="Microsoft YaHei UI" w:hAnsi="Microsoft YaHei UI" w:cs="SimSun"/>
+              <w:color w:val="000000"/>
+            </w:rPr>
+            <w:t>。無論收送達之</w:t>
+          </w:r>
+          <w:proofErr w:type="gramStart"/>
+          <w:r>
+            <w:rPr>
+              <w:rFonts w:ascii="Microsoft YaHei UI" w:eastAsia="Microsoft YaHei UI" w:hAnsi="Microsoft YaHei UI" w:cs="SimSun"/>
+              <w:color w:val="000000"/>
+            </w:rPr>
+            <w:t>ㄧ</w:t>
+          </w:r>
+          <w:proofErr w:type="gramEnd"/>
+          <w:r>
+            <w:rPr>
+              <w:rFonts w:ascii="Microsoft YaHei UI" w:eastAsia="Microsoft YaHei UI" w:hAnsi="Microsoft YaHei UI" w:cs="SimSun"/>
+              <w:color w:val="000000"/>
+            </w:rPr>
+            <w:t>方是否確實收受（包括拒收），</w:t>
+          </w:r>
+          <w:proofErr w:type="gramStart"/>
+          <w:r>
+            <w:rPr>
+              <w:rFonts w:ascii="Microsoft YaHei UI" w:eastAsia="Microsoft YaHei UI" w:hAnsi="Microsoft YaHei UI" w:cs="SimSun"/>
+              <w:color w:val="000000"/>
+            </w:rPr>
+            <w:t>均生送達</w:t>
+          </w:r>
+          <w:proofErr w:type="gramEnd"/>
+          <w:r>
+            <w:rPr>
+              <w:rFonts w:ascii="Microsoft YaHei UI" w:eastAsia="Microsoft YaHei UI" w:hAnsi="Microsoft YaHei UI" w:cs="SimSun"/>
+              <w:color w:val="000000"/>
+            </w:rPr>
+            <w:t>之效力。</w:t>
           </w:r>
         </w:sdtContent>
       </w:sdt>
@@ -3166,7 +4071,39 @@
               <w:rFonts w:ascii="Microsoft YaHei UI" w:eastAsia="Microsoft YaHei UI" w:hAnsi="Microsoft YaHei UI" w:cs="Gungsuh"/>
               <w:color w:val="000000"/>
             </w:rPr>
-            <w:t>本契約正本壹式貳份，由甲乙雙方各執壹份以為憑據，印花自理。</w:t>
+            <w:t>本契約正本</w:t>
+          </w:r>
+          <w:proofErr w:type="gramStart"/>
+          <w:r>
+            <w:rPr>
+              <w:rFonts w:ascii="Microsoft YaHei UI" w:eastAsia="Microsoft YaHei UI" w:hAnsi="Microsoft YaHei UI" w:cs="Gungsuh"/>
+              <w:color w:val="000000"/>
+            </w:rPr>
+            <w:t>壹式貳份</w:t>
+          </w:r>
+          <w:proofErr w:type="gramEnd"/>
+          <w:r>
+            <w:rPr>
+              <w:rFonts w:ascii="Microsoft YaHei UI" w:eastAsia="Microsoft YaHei UI" w:hAnsi="Microsoft YaHei UI" w:cs="Gungsuh"/>
+              <w:color w:val="000000"/>
+            </w:rPr>
+            <w:t>，由甲乙雙方各</w:t>
+          </w:r>
+          <w:proofErr w:type="gramStart"/>
+          <w:r>
+            <w:rPr>
+              <w:rFonts w:ascii="Microsoft YaHei UI" w:eastAsia="Microsoft YaHei UI" w:hAnsi="Microsoft YaHei UI" w:cs="Gungsuh"/>
+              <w:color w:val="000000"/>
+            </w:rPr>
+            <w:t>執壹份</w:t>
+          </w:r>
+          <w:proofErr w:type="gramEnd"/>
+          <w:r>
+            <w:rPr>
+              <w:rFonts w:ascii="Microsoft YaHei UI" w:eastAsia="Microsoft YaHei UI" w:hAnsi="Microsoft YaHei UI" w:cs="Gungsuh"/>
+              <w:color w:val="000000"/>
+            </w:rPr>
+            <w:t>以為憑據，印花自理。</w:t>
           </w:r>
         </w:sdtContent>
       </w:sdt>
@@ -3206,7 +4143,7 @@
     <w:p>
       <w:pPr>
         <w:rPr>
-          <w:rFonts w:ascii="Microsoft YaHei UI" w:hAnsi="Microsoft YaHei UI" w:cs="Times New Roman" w:hint="eastAsia"/>
+          <w:rFonts w:ascii="Microsoft YaHei UI" w:hAnsi="Microsoft YaHei UI" w:cs="Times New Roman"/>
           <w:color w:val="000000"/>
         </w:rPr>
       </w:pPr>
@@ -3281,12 +4218,37 @@
             </w:rPr>
             <w:t xml:space="preserve">甲方名稱： </w:t>
           </w:r>
+          <w:proofErr w:type="gramStart"/>
           <w:r>
             <w:rPr>
               <w:rFonts w:asciiTheme="minorEastAsia" w:hAnsiTheme="minorEastAsia" w:cs="Gungsuh"/>
               <w:color w:val="000000"/>
             </w:rPr>
-            <w:t>{{ party_a }}</w:t>
+            <w:t xml:space="preserve">{{ </w:t>
+          </w:r>
+          <w:proofErr w:type="spellStart"/>
+          <w:r>
+            <w:rPr>
+              <w:rFonts w:asciiTheme="minorEastAsia" w:hAnsiTheme="minorEastAsia" w:cs="Gungsuh"/>
+              <w:color w:val="000000"/>
+            </w:rPr>
+            <w:t>party</w:t>
+          </w:r>
+          <w:proofErr w:type="gramEnd"/>
+          <w:r>
+            <w:rPr>
+              <w:rFonts w:asciiTheme="minorEastAsia" w:hAnsiTheme="minorEastAsia" w:cs="Gungsuh"/>
+              <w:color w:val="000000"/>
+            </w:rPr>
+            <w:t>_a</w:t>
+          </w:r>
+          <w:proofErr w:type="spellEnd"/>
+          <w:r>
+            <w:rPr>
+              <w:rFonts w:asciiTheme="minorEastAsia" w:hAnsiTheme="minorEastAsia" w:cs="Gungsuh"/>
+              <w:color w:val="000000"/>
+            </w:rPr>
+            <w:t xml:space="preserve"> }}</w:t>
           </w:r>
         </w:sdtContent>
       </w:sdt>
@@ -3317,12 +4279,21 @@
             </w:rPr>
             <w:t>代表人：</w:t>
           </w:r>
+          <w:proofErr w:type="gramStart"/>
           <w:r>
             <w:rPr>
               <w:rFonts w:asciiTheme="minorEastAsia" w:hAnsiTheme="minorEastAsia" w:cs="Gungsuh"/>
               <w:color w:val="000000"/>
             </w:rPr>
-            <w:t>{{ owner }}</w:t>
+            <w:t>{{ owner</w:t>
+          </w:r>
+          <w:proofErr w:type="gramEnd"/>
+          <w:r>
+            <w:rPr>
+              <w:rFonts w:asciiTheme="minorEastAsia" w:hAnsiTheme="minorEastAsia" w:cs="Gungsuh"/>
+              <w:color w:val="000000"/>
+            </w:rPr>
+            <w:t xml:space="preserve"> }}</w:t>
           </w:r>
         </w:sdtContent>
       </w:sdt>
@@ -3353,12 +4324,37 @@
             </w:rPr>
             <w:t>統一編號：</w:t>
           </w:r>
+          <w:proofErr w:type="gramStart"/>
           <w:r>
             <w:rPr>
               <w:rFonts w:asciiTheme="minorEastAsia" w:hAnsiTheme="minorEastAsia" w:cs="Gungsuh"/>
               <w:color w:val="000000"/>
             </w:rPr>
-            <w:t>{{ id_number }}</w:t>
+            <w:t xml:space="preserve">{{ </w:t>
+          </w:r>
+          <w:proofErr w:type="spellStart"/>
+          <w:r>
+            <w:rPr>
+              <w:rFonts w:asciiTheme="minorEastAsia" w:hAnsiTheme="minorEastAsia" w:cs="Gungsuh"/>
+              <w:color w:val="000000"/>
+            </w:rPr>
+            <w:t>id</w:t>
+          </w:r>
+          <w:proofErr w:type="gramEnd"/>
+          <w:r>
+            <w:rPr>
+              <w:rFonts w:asciiTheme="minorEastAsia" w:hAnsiTheme="minorEastAsia" w:cs="Gungsuh"/>
+              <w:color w:val="000000"/>
+            </w:rPr>
+            <w:t>_number</w:t>
+          </w:r>
+          <w:proofErr w:type="spellEnd"/>
+          <w:r>
+            <w:rPr>
+              <w:rFonts w:asciiTheme="minorEastAsia" w:hAnsiTheme="minorEastAsia" w:cs="Gungsuh"/>
+              <w:color w:val="000000"/>
+            </w:rPr>
+            <w:t xml:space="preserve"> }}</w:t>
           </w:r>
         </w:sdtContent>
       </w:sdt>
@@ -3394,7 +4390,39 @@
               <w:rFonts w:asciiTheme="minorEastAsia" w:hAnsiTheme="minorEastAsia" w:cs="Gungsuh"/>
               <w:color w:val="000000"/>
             </w:rPr>
-            <w:t xml:space="preserve"> {{ contact_address }}</w:t>
+            <w:t xml:space="preserve"> </w:t>
+          </w:r>
+          <w:proofErr w:type="gramStart"/>
+          <w:r>
+            <w:rPr>
+              <w:rFonts w:asciiTheme="minorEastAsia" w:hAnsiTheme="minorEastAsia" w:cs="Gungsuh"/>
+              <w:color w:val="000000"/>
+            </w:rPr>
+            <w:t xml:space="preserve">{{ </w:t>
+          </w:r>
+          <w:proofErr w:type="spellStart"/>
+          <w:r>
+            <w:rPr>
+              <w:rFonts w:asciiTheme="minorEastAsia" w:hAnsiTheme="minorEastAsia" w:cs="Gungsuh"/>
+              <w:color w:val="000000"/>
+            </w:rPr>
+            <w:t>contact</w:t>
+          </w:r>
+          <w:proofErr w:type="gramEnd"/>
+          <w:r>
+            <w:rPr>
+              <w:rFonts w:asciiTheme="minorEastAsia" w:hAnsiTheme="minorEastAsia" w:cs="Gungsuh"/>
+              <w:color w:val="000000"/>
+            </w:rPr>
+            <w:t>_address</w:t>
+          </w:r>
+          <w:proofErr w:type="spellEnd"/>
+          <w:r>
+            <w:rPr>
+              <w:rFonts w:asciiTheme="minorEastAsia" w:hAnsiTheme="minorEastAsia" w:cs="Gungsuh"/>
+              <w:color w:val="000000"/>
+            </w:rPr>
+            <w:t xml:space="preserve"> }}</w:t>
           </w:r>
         </w:sdtContent>
       </w:sdt>
@@ -3425,12 +4453,21 @@
             </w:rPr>
             <w:t>聯絡電話：</w:t>
           </w:r>
+          <w:proofErr w:type="gramStart"/>
           <w:r>
             <w:rPr>
               <w:rFonts w:asciiTheme="minorEastAsia" w:hAnsiTheme="minorEastAsia" w:cs="Gungsuh"/>
               <w:color w:val="000000"/>
             </w:rPr>
-            <w:t>{{ phone }}</w:t>
+            <w:t>{{ phone</w:t>
+          </w:r>
+          <w:proofErr w:type="gramEnd"/>
+          <w:r>
+            <w:rPr>
+              <w:rFonts w:asciiTheme="minorEastAsia" w:hAnsiTheme="minorEastAsia" w:cs="Gungsuh"/>
+              <w:color w:val="000000"/>
+            </w:rPr>
+            <w:t xml:space="preserve"> }}</w:t>
           </w:r>
         </w:sdtContent>
       </w:sdt>
@@ -3461,6 +4498,7 @@
             </w:rPr>
             <w:t>電子郵件：</w:t>
           </w:r>
+          <w:proofErr w:type="gramStart"/>
           <w:r>
             <w:rPr>
               <w:rFonts w:asciiTheme="minorEastAsia" w:hAnsiTheme="minorEastAsia" w:cs="Gungsuh"/>
@@ -3475,6 +4513,7 @@
             </w:rPr>
             <w:t>email</w:t>
           </w:r>
+          <w:proofErr w:type="gramEnd"/>
           <w:r>
             <w:rPr>
               <w:rFonts w:asciiTheme="minorEastAsia" w:hAnsiTheme="minorEastAsia" w:cs="Gungsuh"/>
@@ -3520,7 +4559,23 @@
               <w:rFonts w:ascii="Microsoft YaHei UI" w:eastAsia="Microsoft YaHei UI" w:hAnsi="Microsoft YaHei UI" w:cs="Gungsuh"/>
               <w:color w:val="000000"/>
             </w:rPr>
-            <w:t>乙方名稱：悠勢科技股份有限公司</w:t>
+            <w:t>乙方名稱：</w:t>
+          </w:r>
+          <w:proofErr w:type="gramStart"/>
+          <w:r>
+            <w:rPr>
+              <w:rFonts w:ascii="Microsoft YaHei UI" w:eastAsia="Microsoft YaHei UI" w:hAnsi="Microsoft YaHei UI" w:cs="Gungsuh"/>
+              <w:color w:val="000000"/>
+            </w:rPr>
+            <w:t>悠勢科技</w:t>
+          </w:r>
+          <w:proofErr w:type="gramEnd"/>
+          <w:r>
+            <w:rPr>
+              <w:rFonts w:ascii="Microsoft YaHei UI" w:eastAsia="Microsoft YaHei UI" w:hAnsi="Microsoft YaHei UI" w:cs="Gungsuh"/>
+              <w:color w:val="000000"/>
+            </w:rPr>
+            <w:t>股份有限公司</w:t>
           </w:r>
         </w:sdtContent>
       </w:sdt>
@@ -3667,6 +4722,7 @@
             </w:rPr>
             <w:t xml:space="preserve">負責業務： </w:t>
           </w:r>
+          <w:proofErr w:type="gramStart"/>
           <w:r>
             <w:rPr>
               <w:rFonts w:asciiTheme="minorEastAsia" w:hAnsiTheme="minorEastAsia" w:cs="Gungsuh"/>
@@ -3681,6 +4737,7 @@
             </w:rPr>
             <w:t>sales</w:t>
           </w:r>
+          <w:proofErr w:type="gramEnd"/>
           <w:r>
             <w:rPr>
               <w:rFonts w:asciiTheme="minorEastAsia" w:hAnsiTheme="minorEastAsia" w:cs="Gungsuh"/>
@@ -3697,7 +4754,7 @@
         <w:ind w:left="425"/>
         <w:jc w:val="both"/>
         <w:rPr>
-          <w:rFonts w:ascii="Microsoft YaHei UI" w:hAnsi="Microsoft YaHei UI" w:cs="Times New Roman" w:hint="eastAsia"/>
+          <w:rFonts w:ascii="Microsoft YaHei UI" w:hAnsi="Microsoft YaHei UI" w:cs="Times New Roman"/>
           <w:color w:val="000000"/>
         </w:rPr>
       </w:pPr>
@@ -3715,17 +4772,26 @@
               <w:rFonts w:ascii="Microsoft YaHei UI" w:eastAsia="Microsoft YaHei UI" w:hAnsi="Microsoft YaHei UI" w:cs="Gungsuh"/>
               <w:color w:val="000000"/>
             </w:rPr>
-            <w:t>電子郵件：service@uspace.city</w:t>
-          </w:r>
-        </w:sdtContent>
-      </w:sdt>
-    </w:p>
-    <w:p>
-      <w:pPr>
-        <w:spacing w:line="420" w:lineRule="auto"/>
-        <w:jc w:val="both"/>
-        <w:rPr>
-          <w:rFonts w:ascii="Microsoft YaHei UI" w:hAnsi="Microsoft YaHei UI" w:cs="Times New Roman" w:hint="eastAsia"/>
+            <w:t>電子郵件：</w:t>
+          </w:r>
+          <w:proofErr w:type="spellStart"/>
+          <w:r>
+            <w:rPr>
+              <w:rFonts w:ascii="Microsoft YaHei UI" w:eastAsia="Microsoft YaHei UI" w:hAnsi="Microsoft YaHei UI" w:cs="Gungsuh"/>
+              <w:color w:val="000000"/>
+            </w:rPr>
+            <w:t>service@uspace.city</w:t>
+          </w:r>
+          <w:proofErr w:type="spellEnd"/>
+        </w:sdtContent>
+      </w:sdt>
+    </w:p>
+    <w:p>
+      <w:pPr>
+        <w:spacing w:line="420" w:lineRule="auto"/>
+        <w:jc w:val="both"/>
+        <w:rPr>
+          <w:rFonts w:ascii="Microsoft YaHei UI" w:hAnsi="Microsoft YaHei UI" w:cs="Times New Roman"/>
         </w:rPr>
       </w:pPr>
     </w:p>
@@ -3810,22 +4876,42 @@
           <w:sz w:val="32"/>
           <w:szCs w:val="32"/>
         </w:rPr>
-        <w:t>{{ sign_date }}</w:t>
+        <w:t xml:space="preserve">{{ </w:t>
       </w:r>
+      <w:proofErr w:type="spellStart"/>
+      <w:r>
+        <w:rPr>
+          <w:rFonts w:asciiTheme="minorEastAsia" w:hAnsiTheme="minorEastAsia" w:cs="Gungsuh"/>
+          <w:color w:val="000000"/>
+          <w:sz w:val="32"/>
+          <w:szCs w:val="32"/>
+        </w:rPr>
+        <w:t>sign_date</w:t>
+      </w:r>
+      <w:proofErr w:type="spellEnd"/>
+      <w:r>
+        <w:rPr>
+          <w:rFonts w:asciiTheme="minorEastAsia" w:hAnsiTheme="minorEastAsia" w:cs="Gungsuh"/>
+          <w:color w:val="000000"/>
+          <w:sz w:val="32"/>
+          <w:szCs w:val="32"/>
+        </w:rPr>
+        <w:t xml:space="preserve"> }}</w:t>
+      </w:r>
     </w:p>
     <w:sectPr>
-      <w:headerReference w:type="even" r:id="rId11"/>
-      <w:headerReference w:type="default" r:id="rId12"/>
-      <w:footerReference w:type="even" r:id="rId13"/>
-      <w:footerReference w:type="default" r:id="rId14"/>
-      <w:headerReference w:type="first" r:id="rId15"/>
+      <w:headerReference w:type="even" r:id="rId8"/>
+      <w:headerReference w:type="default" r:id="rId9"/>
+      <w:footerReference w:type="even" r:id="rId10"/>
+      <w:footerReference w:type="default" r:id="rId11"/>
+      <w:headerReference w:type="first" r:id="rId12"/>
+      <w:footerReference w:type="first" r:id="rId13"/>
       <w:pgSz w:w="11900" w:h="16840"/>
       <w:pgMar w:top="720" w:right="720" w:bottom="720" w:left="720" w:header="851" w:footer="992" w:gutter="0"/>
       <w:pgNumType w:start="1"/>
       <w:cols w:space="720"/>
       <w:titlePg/>
       <w:docGrid w:linePitch="326"/>
-      <w:footerReference w:type="first" r:id="rId14"/>
     </w:sectPr>
   </w:body>
 </w:document>
@@ -3950,6 +5036,56 @@
 </w:ftr>
 </file>
 
+<file path=word/footer3.xml><?xml version="1.0" encoding="utf-8"?>
+<w:ftr xmlns:wpc="http://schemas.microsoft.com/office/word/2010/wordprocessingCanvas" xmlns:cx="http://schemas.microsoft.com/office/drawing/2014/chartex" xmlns:cx1="http://schemas.microsoft.com/office/drawing/2015/9/8/chartex" xmlns:cx2="http://schemas.microsoft.com/office/drawing/2015/10/21/chartex" xmlns:cx3="http://schemas.microsoft.com/office/drawing/2016/5/9/chartex" xmlns:cx4="http://schemas.microsoft.com/office/drawing/2016/5/10/chartex" xmlns:cx5="http://schemas.microsoft.com/office/drawing/2016/5/11/chartex" xmlns:cx6="http://schemas.microsoft.com/office/drawing/2016/5/12/chartex" xmlns:cx7="http://schemas.microsoft.com/office/drawing/2016/5/13/chartex" xmlns:cx8="http://schemas.microsoft.com/office/drawing/2016/5/14/chartex" xmlns:mc="http://schemas.openxmlformats.org/markup-compatibility/2006" xmlns:aink="http://schemas.microsoft.com/office/drawing/2016/ink" xmlns:am3d="http://schemas.microsoft.com/office/drawing/2017/model3d" xmlns:o="urn:schemas-microsoft-com:office:office" xmlns:oel="http://schemas.microsoft.com/office/2019/extlst" xmlns:r="http://schemas.openxmlformats.org/officeDocument/2006/relationships" xmlns:m="http://schemas.openxmlformats.org/officeDocument/2006/math" xmlns:v="urn:schemas-microsoft-com:vml" xmlns:wp14="http://schemas.microsoft.com/office/word/2010/wordprocessingDrawing" xmlns:wp="http://schemas.openxmlformats.org/drawingml/2006/wordprocessingDrawing" xmlns:w10="urn:schemas-microsoft-com:office:word" xmlns:w="http://schemas.openxmlformats.org/wordprocessingml/2006/main" xmlns:w14="http://schemas.microsoft.com/office/word/2010/wordml" xmlns:w15="http://schemas.microsoft.com/office/word/2012/wordml" xmlns:w16cex="http://schemas.microsoft.com/office/word/2018/wordml/cex" xmlns:w16cid="http://schemas.microsoft.com/office/word/2016/wordml/cid" xmlns:w16="http://schemas.microsoft.com/office/word/2018/wordml" xmlns:w16du="http://schemas.microsoft.com/office/word/2023/wordml/word16du" xmlns:w16sdtdh="http://schemas.microsoft.com/office/word/2020/wordml/sdtdatahash" xmlns:w16sdtfl="http://schemas.microsoft.com/office/word/2024/wordml/sdtformatlock" xmlns:w16se="http://schemas.microsoft.com/office/word/2015/wordml/symex" xmlns:wpg="http://schemas.microsoft.com/office/word/2010/wordprocessingGroup" xmlns:wpi="http://schemas.microsoft.com/office/word/2010/wordprocessingInk" xmlns:wne="http://schemas.microsoft.com/office/word/2006/wordml" xmlns:wps="http://schemas.microsoft.com/office/word/2010/wordprocessingShape" mc:Ignorable="w14 w15 w16se w16cid w16 w16cex w16sdtdh w16sdtfl w16du wp14">
+  <w:p>
+    <w:pPr>
+      <w:jc w:val="center"/>
+      <w:rPr>
+        <w:sz w:val="20"/>
+        <w:szCs w:val="20"/>
+      </w:rPr>
+    </w:pPr>
+    <w:r>
+      <w:rPr>
+        <w:sz w:val="20"/>
+        <w:szCs w:val="20"/>
+      </w:rPr>
+      <w:fldChar w:fldCharType="begin"/>
+    </w:r>
+    <w:r>
+      <w:rPr>
+        <w:sz w:val="20"/>
+        <w:szCs w:val="20"/>
+      </w:rPr>
+      <w:instrText xml:space="preserve"> PAGE </w:instrText>
+    </w:r>
+    <w:r>
+      <w:rPr>
+        <w:sz w:val="20"/>
+        <w:szCs w:val="20"/>
+      </w:rPr>
+      <w:fldChar w:fldCharType="separate"/>
+    </w:r>
+    <w:r>
+      <w:rPr>
+        <w:noProof/>
+        <w:sz w:val="20"/>
+        <w:szCs w:val="20"/>
+      </w:rPr>
+      <w:t>1</w:t>
+    </w:r>
+    <w:r>
+      <w:rPr>
+        <w:sz w:val="20"/>
+        <w:szCs w:val="20"/>
+      </w:rPr>
+      <w:fldChar w:fldCharType="end"/>
+    </w:r>
+  </w:p>
+</w:ftr>
+</file>
+
 <file path=word/footnotes.xml><?xml version="1.0" encoding="utf-8"?>
 <w:footnotes xmlns:wpc="http://schemas.microsoft.com/office/word/2010/wordprocessingCanvas" xmlns:cx="http://schemas.microsoft.com/office/drawing/2014/chartex" xmlns:cx1="http://schemas.microsoft.com/office/drawing/2015/9/8/chartex" xmlns:cx2="http://schemas.microsoft.com/office/drawing/2015/10/21/chartex" xmlns:cx3="http://schemas.microsoft.com/office/drawing/2016/5/9/chartex" xmlns:cx4="http://schemas.microsoft.com/office/drawing/2016/5/10/chartex" xmlns:cx5="http://schemas.microsoft.com/office/drawing/2016/5/11/chartex" xmlns:cx6="http://schemas.microsoft.com/office/drawing/2016/5/12/chartex" xmlns:cx7="http://schemas.microsoft.com/office/drawing/2016/5/13/chartex" xmlns:cx8="http://schemas.microsoft.com/office/drawing/2016/5/14/chartex" xmlns:mc="http://schemas.openxmlformats.org/markup-compatibility/2006" xmlns:aink="http://schemas.microsoft.com/office/drawing/2016/ink" xmlns:am3d="http://schemas.microsoft.com/office/drawing/2017/model3d" xmlns:o="urn:schemas-microsoft-com:office:office" xmlns:oel="http://schemas.microsoft.com/office/2019/extlst" xmlns:r="http://schemas.openxmlformats.org/officeDocument/2006/relationships" xmlns:m="http://schemas.openxmlformats.org/officeDocument/2006/math" xmlns:v="urn:schemas-microsoft-com:vml" xmlns:wp14="http://schemas.microsoft.com/office/word/2010/wordprocessingDrawing" xmlns:wp="http://schemas.openxmlformats.org/drawingml/2006/wordprocessingDrawing" xmlns:w10="urn:schemas-microsoft-com:office:word" xmlns:w="http://schemas.openxmlformats.org/wordprocessingml/2006/main" xmlns:w14="http://schemas.microsoft.com/office/word/2010/wordml" xmlns:w15="http://schemas.microsoft.com/office/word/2012/wordml" xmlns:w16cex="http://schemas.microsoft.com/office/word/2018/wordml/cex" xmlns:w16cid="http://schemas.microsoft.com/office/word/2016/wordml/cid" xmlns:w16="http://schemas.microsoft.com/office/word/2018/wordml" xmlns:w16du="http://schemas.microsoft.com/office/word/2023/wordml/word16du" xmlns:w16sdtdh="http://schemas.microsoft.com/office/word/2020/wordml/sdtdatahash" xmlns:w16sdtfl="http://schemas.microsoft.com/office/word/2024/wordml/sdtformatlock" xmlns:w16se="http://schemas.microsoft.com/office/word/2015/wordml/symex" xmlns:wpg="http://schemas.microsoft.com/office/word/2010/wordprocessingGroup" xmlns:wpi="http://schemas.microsoft.com/office/word/2010/wordprocessingInk" xmlns:wne="http://schemas.microsoft.com/office/word/2006/wordml" xmlns:wps="http://schemas.microsoft.com/office/word/2010/wordprocessingShape" mc:Ignorable="w14 w15 w16se w16cid w16 w16cex w16sdtdh w16sdtfl w16du wp14">
   <w:footnote w:type="separator" w:id="-1">
@@ -3973,7 +5109,7 @@
 <w:hdr xmlns:wpc="http://schemas.microsoft.com/office/word/2010/wordprocessingCanvas" xmlns:cx="http://schemas.microsoft.com/office/drawing/2014/chartex" xmlns:cx1="http://schemas.microsoft.com/office/drawing/2015/9/8/chartex" xmlns:cx2="http://schemas.microsoft.com/office/drawing/2015/10/21/chartex" xmlns:cx3="http://schemas.microsoft.com/office/drawing/2016/5/9/chartex" xmlns:cx4="http://schemas.microsoft.com/office/drawing/2016/5/10/chartex" xmlns:cx5="http://schemas.microsoft.com/office/drawing/2016/5/11/chartex" xmlns:cx6="http://schemas.microsoft.com/office/drawing/2016/5/12/chartex" xmlns:cx7="http://schemas.microsoft.com/office/drawing/2016/5/13/chartex" xmlns:cx8="http://schemas.microsoft.com/office/drawing/2016/5/14/chartex" xmlns:mc="http://schemas.openxmlformats.org/markup-compatibility/2006" xmlns:aink="http://schemas.microsoft.com/office/drawing/2016/ink" xmlns:am3d="http://schemas.microsoft.com/office/drawing/2017/model3d" xmlns:o="urn:schemas-microsoft-com:office:office" xmlns:oel="http://schemas.microsoft.com/office/2019/extlst" xmlns:r="http://schemas.openxmlformats.org/officeDocument/2006/relationships" xmlns:m="http://schemas.openxmlformats.org/officeDocument/2006/math" xmlns:v="urn:schemas-microsoft-com:vml" xmlns:wp14="http://schemas.microsoft.com/office/word/2010/wordprocessingDrawing" xmlns:wp="http://schemas.openxmlformats.org/drawingml/2006/wordprocessingDrawing" xmlns:w10="urn:schemas-microsoft-com:office:word" xmlns:w="http://schemas.openxmlformats.org/wordprocessingml/2006/main" xmlns:w14="http://schemas.microsoft.com/office/word/2010/wordml" xmlns:w15="http://schemas.microsoft.com/office/word/2012/wordml" xmlns:w16cex="http://schemas.microsoft.com/office/word/2018/wordml/cex" xmlns:w16cid="http://schemas.microsoft.com/office/word/2016/wordml/cid" xmlns:w16="http://schemas.microsoft.com/office/word/2018/wordml" xmlns:w16du="http://schemas.microsoft.com/office/word/2023/wordml/word16du" xmlns:w16sdtdh="http://schemas.microsoft.com/office/word/2020/wordml/sdtdatahash" xmlns:w16sdtfl="http://schemas.microsoft.com/office/word/2024/wordml/sdtformatlock" xmlns:w16se="http://schemas.microsoft.com/office/word/2015/wordml/symex" xmlns:wpg="http://schemas.microsoft.com/office/word/2010/wordprocessingGroup" xmlns:wpi="http://schemas.microsoft.com/office/word/2010/wordprocessingInk" xmlns:wne="http://schemas.microsoft.com/office/word/2006/wordml" xmlns:wps="http://schemas.microsoft.com/office/word/2010/wordprocessingShape" mc:Ignorable="w14 w15 w16se w16cid w16 w16cex w16sdtdh w16sdtfl w16du wp14">
   <w:p>
     <w:pPr>
-      <w:rPr/>
+      <w:pStyle w:val="aa"/>
     </w:pPr>
   </w:p>
 </w:hdr>
@@ -3983,7 +5119,7 @@
 <w:hdr xmlns:wpc="http://schemas.microsoft.com/office/word/2010/wordprocessingCanvas" xmlns:cx="http://schemas.microsoft.com/office/drawing/2014/chartex" xmlns:cx1="http://schemas.microsoft.com/office/drawing/2015/9/8/chartex" xmlns:cx2="http://schemas.microsoft.com/office/drawing/2015/10/21/chartex" xmlns:cx3="http://schemas.microsoft.com/office/drawing/2016/5/9/chartex" xmlns:cx4="http://schemas.microsoft.com/office/drawing/2016/5/10/chartex" xmlns:cx5="http://schemas.microsoft.com/office/drawing/2016/5/11/chartex" xmlns:cx6="http://schemas.microsoft.com/office/drawing/2016/5/12/chartex" xmlns:cx7="http://schemas.microsoft.com/office/drawing/2016/5/13/chartex" xmlns:cx8="http://schemas.microsoft.com/office/drawing/2016/5/14/chartex" xmlns:mc="http://schemas.openxmlformats.org/markup-compatibility/2006" xmlns:aink="http://schemas.microsoft.com/office/drawing/2016/ink" xmlns:am3d="http://schemas.microsoft.com/office/drawing/2017/model3d" xmlns:o="urn:schemas-microsoft-com:office:office" xmlns:oel="http://schemas.microsoft.com/office/2019/extlst" xmlns:r="http://schemas.openxmlformats.org/officeDocument/2006/relationships" xmlns:m="http://schemas.openxmlformats.org/officeDocument/2006/math" xmlns:v="urn:schemas-microsoft-com:vml" xmlns:wp14="http://schemas.microsoft.com/office/word/2010/wordprocessingDrawing" xmlns:wp="http://schemas.openxmlformats.org/drawingml/2006/wordprocessingDrawing" xmlns:w10="urn:schemas-microsoft-com:office:word" xmlns:w="http://schemas.openxmlformats.org/wordprocessingml/2006/main" xmlns:w14="http://schemas.microsoft.com/office/word/2010/wordml" xmlns:w15="http://schemas.microsoft.com/office/word/2012/wordml" xmlns:w16cex="http://schemas.microsoft.com/office/word/2018/wordml/cex" xmlns:w16cid="http://schemas.microsoft.com/office/word/2016/wordml/cid" xmlns:w16="http://schemas.microsoft.com/office/word/2018/wordml" xmlns:w16du="http://schemas.microsoft.com/office/word/2023/wordml/word16du" xmlns:w16sdtdh="http://schemas.microsoft.com/office/word/2020/wordml/sdtdatahash" xmlns:w16sdtfl="http://schemas.microsoft.com/office/word/2024/wordml/sdtformatlock" xmlns:w16se="http://schemas.microsoft.com/office/word/2015/wordml/symex" xmlns:wpg="http://schemas.microsoft.com/office/word/2010/wordprocessingGroup" xmlns:wpi="http://schemas.microsoft.com/office/word/2010/wordprocessingInk" xmlns:wne="http://schemas.microsoft.com/office/word/2006/wordml" xmlns:wps="http://schemas.microsoft.com/office/word/2010/wordprocessingShape" mc:Ignorable="w14 w15 w16se w16cid w16 w16cex w16sdtdh w16sdtfl w16du wp14">
   <w:p>
     <w:pPr>
-      <w:rPr/>
+      <w:pStyle w:val="aa"/>
     </w:pPr>
   </w:p>
 </w:hdr>
@@ -3993,7 +5129,7 @@
 <w:hdr xmlns:wpc="http://schemas.microsoft.com/office/word/2010/wordprocessingCanvas" xmlns:cx="http://schemas.microsoft.com/office/drawing/2014/chartex" xmlns:cx1="http://schemas.microsoft.com/office/drawing/2015/9/8/chartex" xmlns:cx2="http://schemas.microsoft.com/office/drawing/2015/10/21/chartex" xmlns:cx3="http://schemas.microsoft.com/office/drawing/2016/5/9/chartex" xmlns:cx4="http://schemas.microsoft.com/office/drawing/2016/5/10/chartex" xmlns:cx5="http://schemas.microsoft.com/office/drawing/2016/5/11/chartex" xmlns:cx6="http://schemas.microsoft.com/office/drawing/2016/5/12/chartex" xmlns:cx7="http://schemas.microsoft.com/office/drawing/2016/5/13/chartex" xmlns:cx8="http://schemas.microsoft.com/office/drawing/2016/5/14/chartex" xmlns:mc="http://schemas.openxmlformats.org/markup-compatibility/2006" xmlns:aink="http://schemas.microsoft.com/office/drawing/2016/ink" xmlns:am3d="http://schemas.microsoft.com/office/drawing/2017/model3d" xmlns:o="urn:schemas-microsoft-com:office:office" xmlns:oel="http://schemas.microsoft.com/office/2019/extlst" xmlns:r="http://schemas.openxmlformats.org/officeDocument/2006/relationships" xmlns:m="http://schemas.openxmlformats.org/officeDocument/2006/math" xmlns:v="urn:schemas-microsoft-com:vml" xmlns:wp14="http://schemas.microsoft.com/office/word/2010/wordprocessingDrawing" xmlns:wp="http://schemas.openxmlformats.org/drawingml/2006/wordprocessingDrawing" xmlns:w10="urn:schemas-microsoft-com:office:word" xmlns:w="http://schemas.openxmlformats.org/wordprocessingml/2006/main" xmlns:w14="http://schemas.microsoft.com/office/word/2010/wordml" xmlns:w15="http://schemas.microsoft.com/office/word/2012/wordml" xmlns:w16cex="http://schemas.microsoft.com/office/word/2018/wordml/cex" xmlns:w16cid="http://schemas.microsoft.com/office/word/2016/wordml/cid" xmlns:w16="http://schemas.microsoft.com/office/word/2018/wordml" xmlns:w16du="http://schemas.microsoft.com/office/word/2023/wordml/word16du" xmlns:w16sdtdh="http://schemas.microsoft.com/office/word/2020/wordml/sdtdatahash" xmlns:w16sdtfl="http://schemas.microsoft.com/office/word/2024/wordml/sdtformatlock" xmlns:w16se="http://schemas.microsoft.com/office/word/2015/wordml/symex" xmlns:wpg="http://schemas.microsoft.com/office/word/2010/wordprocessingGroup" xmlns:wpi="http://schemas.microsoft.com/office/word/2010/wordprocessingInk" xmlns:wne="http://schemas.microsoft.com/office/word/2006/wordml" xmlns:wps="http://schemas.microsoft.com/office/word/2010/wordprocessingShape" mc:Ignorable="w14 w15 w16se w16cid w16 w16cex w16sdtdh w16sdtfl w16du wp14">
   <w:tbl>
     <w:tblPr>
-      <w:tblStyle w:val="a5"/>
+      <w:tblStyle w:val="10"/>
       <w:tblW w:w="10465" w:type="dxa"/>
       <w:tblInd w:w="0" w:type="dxa"/>
       <w:tblBorders>
@@ -4010,13 +5146,13 @@
     <w:tblGrid>
       <w:gridCol w:w="2617"/>
       <w:gridCol w:w="2616"/>
-      <w:gridCol w:w="2616"/>
-      <w:gridCol w:w="2616"/>
+      <w:gridCol w:w="1713"/>
+      <w:gridCol w:w="3519"/>
     </w:tblGrid>
     <w:tr>
       <w:tc>
         <w:tcPr>
-          <w:tcW w:w="2616" w:type="dxa"/>
+          <w:tcW w:w="2617" w:type="dxa"/>
           <w:vAlign w:val="center"/>
         </w:tcPr>
         <w:p>
@@ -4037,7 +5173,27 @@
               <w:sz w:val="20"/>
               <w:szCs w:val="20"/>
             </w:rPr>
-            <w:t xml:space="preserve">負責業務：{{ sales }}</w:t>
+            <w:t>負責業務：</w:t>
+          </w:r>
+          <w:proofErr w:type="gramStart"/>
+          <w:r>
+            <w:rPr>
+              <w:rFonts w:ascii="標楷體" w:eastAsia="標楷體" w:hAnsi="標楷體" w:cs="標楷體"/>
+              <w:color w:val="666666"/>
+              <w:sz w:val="20"/>
+              <w:szCs w:val="20"/>
+            </w:rPr>
+            <w:t>{{ sales</w:t>
+          </w:r>
+          <w:proofErr w:type="gramEnd"/>
+          <w:r>
+            <w:rPr>
+              <w:rFonts w:ascii="標楷體" w:eastAsia="標楷體" w:hAnsi="標楷體" w:cs="標楷體"/>
+              <w:color w:val="666666"/>
+              <w:sz w:val="20"/>
+              <w:szCs w:val="20"/>
+            </w:rPr>
+            <w:t xml:space="preserve"> }}</w:t>
           </w:r>
         </w:p>
       </w:tc>
@@ -4064,7 +5220,192 @@
               <w:sz w:val="20"/>
               <w:szCs w:val="20"/>
             </w:rPr>
-            <w:t xml:space="preserve">建物編號：{{ building_id }}</w:t>
+            <w:t>建物編號：</w:t>
+          </w:r>
+          <w:proofErr w:type="gramStart"/>
+          <w:r>
+            <w:rPr>
+              <w:rFonts w:ascii="標楷體" w:eastAsia="標楷體" w:hAnsi="標楷體" w:cs="標楷體"/>
+              <w:color w:val="666666"/>
+              <w:sz w:val="20"/>
+              <w:szCs w:val="20"/>
+            </w:rPr>
+            <w:t xml:space="preserve">{{ </w:t>
+          </w:r>
+          <w:proofErr w:type="spellStart"/>
+          <w:r>
+            <w:rPr>
+              <w:rFonts w:ascii="標楷體" w:eastAsia="標楷體" w:hAnsi="標楷體" w:cs="標楷體"/>
+              <w:color w:val="666666"/>
+              <w:sz w:val="20"/>
+              <w:szCs w:val="20"/>
+            </w:rPr>
+            <w:t>building</w:t>
+          </w:r>
+          <w:proofErr w:type="gramEnd"/>
+          <w:r>
+            <w:rPr>
+              <w:rFonts w:ascii="標楷體" w:eastAsia="標楷體" w:hAnsi="標楷體" w:cs="標楷體"/>
+              <w:color w:val="666666"/>
+              <w:sz w:val="20"/>
+              <w:szCs w:val="20"/>
+            </w:rPr>
+            <w:t>_id</w:t>
+          </w:r>
+          <w:proofErr w:type="spellEnd"/>
+          <w:r>
+            <w:rPr>
+              <w:rFonts w:ascii="標楷體" w:eastAsia="標楷體" w:hAnsi="標楷體" w:cs="標楷體"/>
+              <w:color w:val="666666"/>
+              <w:sz w:val="20"/>
+              <w:szCs w:val="20"/>
+            </w:rPr>
+            <w:t xml:space="preserve"> }}</w:t>
+          </w:r>
+        </w:p>
+      </w:tc>
+      <w:tc>
+        <w:tcPr>
+          <w:tcW w:w="1713" w:type="dxa"/>
+          <w:vAlign w:val="center"/>
+        </w:tcPr>
+        <w:p>
+          <w:pPr>
+            <w:ind w:right="526"/>
+            <w:jc w:val="both"/>
+            <w:rPr>
+              <w:rFonts w:ascii="標楷體" w:eastAsia="標楷體" w:hAnsi="標楷體" w:cs="標楷體"/>
+              <w:color w:val="666666"/>
+              <w:sz w:val="20"/>
+              <w:szCs w:val="20"/>
+            </w:rPr>
+          </w:pPr>
+        </w:p>
+      </w:tc>
+      <w:tc>
+        <w:tcPr>
+          <w:tcW w:w="3519" w:type="dxa"/>
+          <w:vAlign w:val="center"/>
+        </w:tcPr>
+        <w:p>
+          <w:pPr>
+            <w:ind w:right="526"/>
+            <w:jc w:val="both"/>
+            <w:rPr>
+              <w:rFonts w:ascii="標楷體" w:eastAsia="標楷體" w:hAnsi="標楷體" w:cs="標楷體"/>
+              <w:color w:val="666666"/>
+              <w:sz w:val="20"/>
+              <w:szCs w:val="20"/>
+            </w:rPr>
+          </w:pPr>
+          <w:proofErr w:type="gramStart"/>
+          <w:r>
+            <w:rPr>
+              <w:rFonts w:ascii="標楷體" w:eastAsia="標楷體" w:hAnsi="標楷體" w:cs="標楷體"/>
+              <w:color w:val="666666"/>
+              <w:sz w:val="20"/>
+              <w:szCs w:val="20"/>
+            </w:rPr>
+            <w:t xml:space="preserve">{{ </w:t>
+          </w:r>
+          <w:proofErr w:type="spellStart"/>
+          <w:r>
+            <w:rPr>
+              <w:rFonts w:ascii="標楷體" w:eastAsia="標楷體" w:hAnsi="標楷體" w:cs="標楷體"/>
+              <w:color w:val="666666"/>
+              <w:sz w:val="20"/>
+              <w:szCs w:val="20"/>
+            </w:rPr>
+            <w:t>contract</w:t>
+          </w:r>
+          <w:proofErr w:type="gramEnd"/>
+          <w:r>
+            <w:rPr>
+              <w:rFonts w:ascii="標楷體" w:eastAsia="標楷體" w:hAnsi="標楷體" w:cs="標楷體"/>
+              <w:color w:val="666666"/>
+              <w:sz w:val="20"/>
+              <w:szCs w:val="20"/>
+            </w:rPr>
+            <w:t>_tax_label</w:t>
+          </w:r>
+          <w:proofErr w:type="spellEnd"/>
+          <w:r>
+            <w:rPr>
+              <w:rFonts w:ascii="標楷體" w:eastAsia="標楷體" w:hAnsi="標楷體" w:cs="標楷體"/>
+              <w:color w:val="666666"/>
+              <w:sz w:val="20"/>
+              <w:szCs w:val="20"/>
+            </w:rPr>
+            <w:t xml:space="preserve"> }}</w:t>
+          </w:r>
+        </w:p>
+      </w:tc>
+    </w:tr>
+    <w:tr>
+      <w:tc>
+        <w:tcPr>
+          <w:tcW w:w="2617" w:type="dxa"/>
+          <w:vAlign w:val="center"/>
+        </w:tcPr>
+        <w:p>
+          <w:pPr>
+            <w:ind w:right="526"/>
+            <w:jc w:val="both"/>
+            <w:rPr>
+              <w:rFonts w:ascii="標楷體" w:eastAsia="標楷體" w:hAnsi="標楷體" w:cs="標楷體"/>
+              <w:color w:val="666666"/>
+              <w:sz w:val="20"/>
+              <w:szCs w:val="20"/>
+            </w:rPr>
+          </w:pPr>
+          <w:r>
+            <w:rPr>
+              <w:rFonts w:ascii="標楷體" w:eastAsia="標楷體" w:hAnsi="標楷體" w:cs="標楷體"/>
+              <w:color w:val="666666"/>
+              <w:sz w:val="20"/>
+              <w:szCs w:val="20"/>
+            </w:rPr>
+            <w:t>建物名稱：</w:t>
+          </w:r>
+          <w:proofErr w:type="gramStart"/>
+          <w:r>
+            <w:rPr>
+              <w:rFonts w:ascii="標楷體" w:eastAsia="標楷體" w:hAnsi="標楷體" w:cs="標楷體"/>
+              <w:color w:val="666666"/>
+              <w:sz w:val="20"/>
+              <w:szCs w:val="20"/>
+            </w:rPr>
+            <w:t xml:space="preserve">{{ </w:t>
+          </w:r>
+          <w:proofErr w:type="spellStart"/>
+          <w:r>
+            <w:rPr>
+              <w:rFonts w:ascii="標楷體" w:eastAsia="標楷體" w:hAnsi="標楷體" w:cs="標楷體"/>
+              <w:color w:val="666666"/>
+              <w:sz w:val="20"/>
+              <w:szCs w:val="20"/>
+            </w:rPr>
+            <w:t>building</w:t>
+          </w:r>
+          <w:proofErr w:type="gramEnd"/>
+          <w:r>
+            <w:rPr>
+              <w:rFonts w:ascii="標楷體" w:eastAsia="標楷體" w:hAnsi="標楷體" w:cs="標楷體"/>
+              <w:color w:val="666666"/>
+              <w:sz w:val="20"/>
+              <w:szCs w:val="20"/>
+            </w:rPr>
+            <w:t>_name</w:t>
+          </w:r>
+          <w:proofErr w:type="spellEnd"/>
+          <w:r>
+            <w:rPr>
+              <w:rFonts w:ascii="標楷體" w:eastAsia="標楷體" w:hAnsi="標楷體" w:cs="標楷體"/>
+              <w:color w:val="666666"/>
+              <w:sz w:val="20"/>
+              <w:szCs w:val="20"/>
+            </w:rPr>
+            <w:t xml:space="preserve"> }}</w:t>
           </w:r>
         </w:p>
       </w:tc>
@@ -4084,11 +5425,60 @@
               <w:szCs w:val="20"/>
             </w:rPr>
           </w:pPr>
+          <w:r>
+            <w:rPr>
+              <w:rFonts w:ascii="標楷體" w:eastAsia="標楷體" w:hAnsi="標楷體" w:cs="標楷體"/>
+              <w:color w:val="666666"/>
+              <w:sz w:val="20"/>
+              <w:szCs w:val="20"/>
+            </w:rPr>
+            <w:t>建物綁定電話：</w:t>
+          </w:r>
+          <w:proofErr w:type="gramStart"/>
+          <w:r>
+            <w:rPr>
+              <w:rFonts w:ascii="標楷體" w:eastAsia="標楷體" w:hAnsi="標楷體" w:cs="標楷體"/>
+              <w:color w:val="666666"/>
+              <w:sz w:val="20"/>
+              <w:szCs w:val="20"/>
+            </w:rPr>
+            <w:t xml:space="preserve">{{ </w:t>
+          </w:r>
+          <w:proofErr w:type="spellStart"/>
+          <w:r>
+            <w:rPr>
+              <w:rFonts w:ascii="標楷體" w:eastAsia="標楷體" w:hAnsi="標楷體" w:cs="標楷體"/>
+              <w:color w:val="666666"/>
+              <w:sz w:val="20"/>
+              <w:szCs w:val="20"/>
+            </w:rPr>
+            <w:t>building</w:t>
+          </w:r>
+          <w:proofErr w:type="gramEnd"/>
+          <w:r>
+            <w:rPr>
+              <w:rFonts w:ascii="標楷體" w:eastAsia="標楷體" w:hAnsi="標楷體" w:cs="標楷體"/>
+              <w:color w:val="666666"/>
+              <w:sz w:val="20"/>
+              <w:szCs w:val="20"/>
+            </w:rPr>
+            <w:t>_phone</w:t>
+          </w:r>
+          <w:proofErr w:type="spellEnd"/>
+          <w:r>
+            <w:rPr>
+              <w:rFonts w:ascii="標楷體" w:eastAsia="標楷體" w:hAnsi="標楷體" w:cs="標楷體"/>
+              <w:color w:val="666666"/>
+              <w:sz w:val="20"/>
+              <w:szCs w:val="20"/>
+            </w:rPr>
+            <w:t xml:space="preserve"> }}</w:t>
+          </w:r>
         </w:p>
       </w:tc>
       <w:tc>
         <w:tcPr>
-          <w:tcW w:w="2616" w:type="dxa"/>
+          <w:tcW w:w="1713" w:type="dxa"/>
           <w:vAlign w:val="center"/>
         </w:tcPr>
         <w:p>
@@ -4102,22 +5492,11 @@
               <w:szCs w:val="20"/>
             </w:rPr>
           </w:pPr>
-          <w:r>
-            <w:rPr>
-              <w:rFonts w:ascii="標楷體" w:eastAsia="標楷體" w:hAnsi="標楷體" w:cs="標楷體"/>
-              <w:color w:val="666666"/>
-              <w:sz w:val="20"/>
-              <w:szCs w:val="20"/>
-            </w:rPr>
-            <w:t>{{ contract_tax_label }}</w:t>
-          </w:r>
         </w:p>
       </w:tc>
-    </w:tr>
-    <w:tr>
       <w:tc>
         <w:tcPr>
-          <w:tcW w:w="2616" w:type="dxa"/>
+          <w:tcW w:w="3519" w:type="dxa"/>
           <w:vAlign w:val="center"/>
         </w:tcPr>
         <w:p>
@@ -4138,26 +5517,19 @@
               <w:sz w:val="20"/>
               <w:szCs w:val="20"/>
             </w:rPr>
-            <w:t xml:space="preserve">建物名稱：{{ building_name }}</w:t>
-          </w:r>
-        </w:p>
-      </w:tc>
-      <w:tc>
-        <w:tcPr>
-          <w:tcW w:w="2616" w:type="dxa"/>
-          <w:vAlign w:val="center"/>
-        </w:tcPr>
-        <w:p>
-          <w:pPr>
-            <w:ind w:right="526"/>
-            <w:jc w:val="both"/>
+            <w:t>所得代號：</w:t>
+          </w:r>
+          <w:proofErr w:type="gramStart"/>
+          <w:r>
             <w:rPr>
               <w:rFonts w:ascii="標楷體" w:eastAsia="標楷體" w:hAnsi="標楷體" w:cs="標楷體"/>
               <w:color w:val="666666"/>
               <w:sz w:val="20"/>
               <w:szCs w:val="20"/>
             </w:rPr>
-          </w:pPr>
+            <w:t xml:space="preserve">{{ </w:t>
+          </w:r>
+          <w:proofErr w:type="spellStart"/>
           <w:r>
             <w:rPr>
               <w:rFonts w:ascii="標楷體" w:eastAsia="標楷體" w:hAnsi="標楷體" w:cs="標楷體"/>
@@ -4165,52 +5537,27 @@
               <w:sz w:val="20"/>
               <w:szCs w:val="20"/>
             </w:rPr>
-            <w:t xml:space="preserve">建物綁定電話：{{ building_phone }}</w:t>
-          </w:r>
-        </w:p>
-      </w:tc>
-      <w:tc>
-        <w:tcPr>
-          <w:tcW w:w="2616" w:type="dxa"/>
-          <w:vAlign w:val="center"/>
-        </w:tcPr>
-        <w:p>
-          <w:pPr>
-            <w:ind w:right="526"/>
-            <w:jc w:val="both"/>
+            <w:t>income</w:t>
+          </w:r>
+          <w:proofErr w:type="gramEnd"/>
+          <w:r>
             <w:rPr>
               <w:rFonts w:ascii="標楷體" w:eastAsia="標楷體" w:hAnsi="標楷體" w:cs="標楷體"/>
               <w:color w:val="666666"/>
               <w:sz w:val="20"/>
               <w:szCs w:val="20"/>
             </w:rPr>
-          </w:pPr>
-        </w:p>
-      </w:tc>
-      <w:tc>
-        <w:tcPr>
-          <w:tcW w:w="2616" w:type="dxa"/>
-          <w:vAlign w:val="center"/>
-        </w:tcPr>
-        <w:p>
-          <w:pPr>
-            <w:ind w:right="526"/>
-            <w:jc w:val="both"/>
+            <w:t>_code</w:t>
+          </w:r>
+          <w:proofErr w:type="spellEnd"/>
+          <w:r>
             <w:rPr>
               <w:rFonts w:ascii="標楷體" w:eastAsia="標楷體" w:hAnsi="標楷體" w:cs="標楷體"/>
               <w:color w:val="666666"/>
               <w:sz w:val="20"/>
               <w:szCs w:val="20"/>
             </w:rPr>
-          </w:pPr>
-          <w:r>
-            <w:rPr>
-              <w:rFonts w:ascii="標楷體" w:eastAsia="標楷體" w:hAnsi="標楷體" w:cs="標楷體"/>
-              <w:color w:val="666666"/>
-              <w:sz w:val="20"/>
-              <w:szCs w:val="20"/>
-            </w:rPr>
-            <w:t xml:space="preserve">所得代號：{{ income_code }}</w:t>
+            <w:t xml:space="preserve"> }}</w:t>
           </w:r>
         </w:p>
       </w:tc>
@@ -4261,7 +5608,7 @@
           <v:path o:extrusionok="f" gradientshapeok="t" o:connecttype="rect"/>
           <o:lock v:ext="edit" aspectratio="t"/>
         </v:shapetype>
-        <v:shape id="WordPictureWatermark1" o:spid="_x0000_s1026" type="#_x0000_t75" alt="" style="position:absolute;margin-left:0;margin-top:0;width:522.7pt;height:377.65pt;z-index:-251658240;mso-position-horizontal:center;mso-position-horizontal-relative:margin;mso-position-vertical:center;mso-position-vertical-relative:margin">
+        <v:shape id="WordPictureWatermark1" o:spid="_x0000_s1026" type="#_x0000_t75" alt="" style="position:absolute;margin-left:0;margin-top:0;width:522.7pt;height:377.65pt;z-index:-251658752;mso-position-horizontal:center;mso-position-horizontal-relative:margin;mso-position-vertical:center;mso-position-vertical-relative:margin">
           <v:imagedata r:id="rId1" o:title="image1" gain="19661f" blacklevel="22938f"/>
           <w10:wrap anchorx="margin" anchory="margin"/>
         </v:shape>
@@ -5681,7 +7028,8 @@
       <w:szCs w:val="48"/>
     </w:rPr>
   </w:style>
-  <w:style w:type="table" w:customStyle="1" w:styleId="a5">
+  <w:style w:type="table" w:customStyle="1" w:styleId="10">
+    <w:name w:val="1"/>
     <w:basedOn w:val="TableNormal"/>
     <w:tblPr>
       <w:tblStyleRowBandSize w:val="1"/>
@@ -5694,22 +7042,22 @@
       </w:tblCellMar>
     </w:tblPr>
   </w:style>
-  <w:style w:type="paragraph" w:styleId="a6">
+  <w:style w:type="paragraph" w:styleId="a5">
     <w:name w:val="annotation text"/>
     <w:basedOn w:val="a"/>
-    <w:link w:val="a7"/>
+    <w:link w:val="a6"/>
     <w:uiPriority w:val="99"/>
     <w:semiHidden/>
     <w:unhideWhenUsed/>
   </w:style>
-  <w:style w:type="character" w:customStyle="1" w:styleId="a7">
+  <w:style w:type="character" w:customStyle="1" w:styleId="a6">
     <w:name w:val="註解文字 字元"/>
     <w:basedOn w:val="a0"/>
-    <w:link w:val="a6"/>
+    <w:link w:val="a5"/>
     <w:uiPriority w:val="99"/>
     <w:semiHidden/>
   </w:style>
-  <w:style w:type="character" w:styleId="a8">
+  <w:style w:type="character" w:styleId="a7">
     <w:name w:val="annotation reference"/>
     <w:basedOn w:val="a0"/>
     <w:uiPriority w:val="99"/>
@@ -5720,10 +7068,10 @@
       <w:szCs w:val="18"/>
     </w:rPr>
   </w:style>
-  <w:style w:type="paragraph" w:styleId="a9">
+  <w:style w:type="paragraph" w:styleId="a8">
     <w:name w:val="footer"/>
     <w:basedOn w:val="a"/>
-    <w:link w:val="aa"/>
+    <w:link w:val="a9"/>
     <w:uiPriority w:val="99"/>
     <w:unhideWhenUsed/>
     <w:rsid w:val="000D1CB7"/>
@@ -5739,12 +7087,42 @@
       <w:szCs w:val="20"/>
     </w:rPr>
   </w:style>
-  <w:style w:type="character" w:customStyle="1" w:styleId="aa">
+  <w:style w:type="character" w:customStyle="1" w:styleId="a9">
     <w:name w:val="頁尾 字元"/>
     <w:basedOn w:val="a0"/>
-    <w:link w:val="a9"/>
+    <w:link w:val="a8"/>
     <w:uiPriority w:val="99"/>
     <w:rsid w:val="000D1CB7"/>
+    <w:rPr>
+      <w:sz w:val="20"/>
+      <w:szCs w:val="20"/>
+    </w:rPr>
+  </w:style>
+  <w:style w:type="paragraph" w:styleId="aa">
+    <w:name w:val="header"/>
+    <w:basedOn w:val="a"/>
+    <w:link w:val="ab"/>
+    <w:uiPriority w:val="99"/>
+    <w:unhideWhenUsed/>
+    <w:rsid w:val="009D264A"/>
+    <w:pPr>
+      <w:tabs>
+        <w:tab w:val="center" w:pos="4153"/>
+        <w:tab w:val="right" w:pos="8306"/>
+      </w:tabs>
+      <w:snapToGrid w:val="0"/>
+    </w:pPr>
+    <w:rPr>
+      <w:sz w:val="20"/>
+      <w:szCs w:val="20"/>
+    </w:rPr>
+  </w:style>
+  <w:style w:type="character" w:customStyle="1" w:styleId="ab">
+    <w:name w:val="頁首 字元"/>
+    <w:basedOn w:val="a0"/>
+    <w:link w:val="aa"/>
+    <w:uiPriority w:val="99"/>
+    <w:rsid w:val="009D264A"/>
     <w:rPr>
       <w:sz w:val="20"/>
       <w:szCs w:val="20"/>

</xml_diff>